<commit_message>
Docs: INNOVII logo at the top right; record it as the rule for documents
Co-Authored-By: Claude Opus 5.5 <noreply@anthropic.com>
Claude-Session: https://claude.ai/code/session_015837ouLbwrQdJqFUX8HYPx
</commit_message>
<xml_diff>
--- a/docs/SUNU-Park-Functional-Requirements.docx
+++ b/docs/SUNU-Park-Functional-Requirements.docx
@@ -256,7 +256,7 @@
       <w:pPr>
         <w:spacing w:after="60"/>
       </w:pPr>
-      <w:hyperlink w:history="1" r:id="rIdengxoj5gmzwnmegclaqvp">
+      <w:hyperlink w:history="1" r:id="rIdhy8efql52yrsdybrvasjj">
         <w:r>
           <w:rPr>
             <w:rFonts w:ascii="Plus Jakarta Sans" w:cs="Plus Jakarta Sans" w:eastAsia="Plus Jakarta Sans" w:hAnsi="Plus Jakarta Sans"/>
@@ -277,7 +277,7 @@
         </w:rPr>
         <w:t xml:space="preserve">  ·  </w:t>
       </w:r>
-      <w:hyperlink w:history="1" r:id="rIdhvda4cidk-j77p25jtoqv">
+      <w:hyperlink w:history="1" r:id="rIdadrujikve8i9uiujc_zxb">
         <w:r>
           <w:rPr>
             <w:rFonts w:ascii="Plus Jakarta Sans" w:cs="Plus Jakarta Sans" w:eastAsia="Plus Jakarta Sans" w:hAnsi="Plus Jakarta Sans"/>
@@ -298,7 +298,7 @@
         </w:rPr>
         <w:t xml:space="preserve">  ·  </w:t>
       </w:r>
-      <w:hyperlink w:history="1" r:id="rIdhycaot5e2ynf0n3_xnfp6">
+      <w:hyperlink w:history="1" r:id="rIdko1dq4bb9mptuwyicbo71">
         <w:r>
           <w:rPr>
             <w:rFonts w:ascii="Plus Jakarta Sans" w:cs="Plus Jakarta Sans" w:eastAsia="Plus Jakarta Sans" w:hAnsi="Plus Jakarta Sans"/>
@@ -315,7 +315,7 @@
       <w:pPr>
         <w:spacing w:after="160"/>
       </w:pPr>
-      <w:hyperlink w:history="1" r:id="rIderbofyuen8kr0_pbogrk5">
+      <w:hyperlink w:history="1" r:id="rIdpz0o_nh2tewr5hdr0goe2">
         <w:r>
           <w:rPr>
             <w:rFonts w:ascii="Plus Jakarta Sans" w:cs="Plus Jakarta Sans" w:eastAsia="Plus Jakarta Sans" w:hAnsi="Plus Jakarta Sans"/>
@@ -336,7 +336,7 @@
         </w:rPr>
         <w:t xml:space="preserve">  ·  </w:t>
       </w:r>
-      <w:hyperlink w:history="1" r:id="rIdc1nbxsichsczqqvvaeb8k">
+      <w:hyperlink w:history="1" r:id="rIdbr7hktekiz5uzhfbwnbl2">
         <w:r>
           <w:rPr>
             <w:rFonts w:ascii="Plus Jakarta Sans" w:cs="Plus Jakarta Sans" w:eastAsia="Plus Jakarta Sans" w:hAnsi="Plus Jakarta Sans"/>
@@ -357,7 +357,7 @@
         </w:rPr>
         <w:t xml:space="preserve">  ·  </w:t>
       </w:r>
-      <w:hyperlink w:history="1" r:id="rId1sjjtoema0v53hrkay8oz">
+      <w:hyperlink w:history="1" r:id="rIdzq85mxuwsvwfz_8grp1jv">
         <w:r>
           <w:rPr>
             <w:rFonts w:ascii="Plus Jakarta Sans" w:cs="Plus Jakarta Sans" w:eastAsia="Plus Jakarta Sans" w:hAnsi="Plus Jakarta Sans"/>
@@ -391,7 +391,7 @@
       <w:pPr>
         <w:spacing w:after="60"/>
       </w:pPr>
-      <w:hyperlink w:history="1" r:id="rIddztqqxkc8pqsgpvj-j5j1">
+      <w:hyperlink w:history="1" r:id="rIdicxgtxvta5b-4q5dxnkns">
         <w:r>
           <w:rPr>
             <w:rFonts w:ascii="Plus Jakarta Sans" w:cs="Plus Jakarta Sans" w:eastAsia="Plus Jakarta Sans" w:hAnsi="Plus Jakarta Sans"/>
@@ -412,7 +412,7 @@
         </w:rPr>
         <w:t xml:space="preserve">  ·  </w:t>
       </w:r>
-      <w:hyperlink w:history="1" r:id="rIddao01vdpnzfaslevizxdf">
+      <w:hyperlink w:history="1" r:id="rIdrsq9nyftvsqdjyapgp2rc">
         <w:r>
           <w:rPr>
             <w:rFonts w:ascii="Plus Jakarta Sans" w:cs="Plus Jakarta Sans" w:eastAsia="Plus Jakarta Sans" w:hAnsi="Plus Jakarta Sans"/>
@@ -429,7 +429,7 @@
       <w:pPr>
         <w:spacing w:after="60"/>
       </w:pPr>
-      <w:hyperlink w:history="1" r:id="rIdiq86pyyt6vmfrzxqdiapy">
+      <w:hyperlink w:history="1" r:id="rIdwk-ew-ei-svgtmg3ickir">
         <w:r>
           <w:rPr>
             <w:rFonts w:ascii="Plus Jakarta Sans" w:cs="Plus Jakarta Sans" w:eastAsia="Plus Jakarta Sans" w:hAnsi="Plus Jakarta Sans"/>
@@ -450,7 +450,7 @@
         </w:rPr>
         <w:t xml:space="preserve">  ·  </w:t>
       </w:r>
-      <w:hyperlink w:history="1" r:id="rIdeth1di6wyrhxr2vh6e5a4">
+      <w:hyperlink w:history="1" r:id="rId-shazee8i443qvpc6dk7s">
         <w:r>
           <w:rPr>
             <w:rFonts w:ascii="Plus Jakarta Sans" w:cs="Plus Jakarta Sans" w:eastAsia="Plus Jakarta Sans" w:hAnsi="Plus Jakarta Sans"/>
@@ -9342,7 +9342,7 @@
         </w:rPr>
         <w:t xml:space="preserve">Code &amp; docs: </w:t>
       </w:r>
-      <w:hyperlink w:history="1" r:id="rIdpenfeqt0ezfq_oi2ly6j3">
+      <w:hyperlink w:history="1" r:id="rIdyfrkxk5dpzpoq2igh0ujp">
         <w:r>
           <w:rPr>
             <w:rFonts w:ascii="Plus Jakarta Sans" w:cs="Plus Jakarta Sans" w:eastAsia="Plus Jakarta Sans" w:hAnsi="Plus Jakarta Sans"/>
@@ -9501,6 +9501,15 @@
       </w:tabs>
     </w:pPr>
     <w:r>
+      <w:rPr>
+        <w:rFonts w:ascii="Plus Jakarta Sans" w:cs="Plus Jakarta Sans" w:eastAsia="Plus Jakarta Sans" w:hAnsi="Plus Jakarta Sans"/>
+        <w:color w:val="5C6A94"/>
+        <w:sz w:val="15"/>
+        <w:szCs w:val="15"/>
+      </w:rPr>
+      <w:t xml:space="preserve">SUNU Park · Functional requirements · v1.2.50	</w:t>
+    </w:r>
+    <w:r>
       <w:drawing>
         <wp:inline distT="0" distB="0" distL="0" distR="0">
           <wp:extent cx="781050" cy="209550"/>
@@ -9539,15 +9548,6 @@
           </a:graphic>
         </wp:inline>
       </w:drawing>
-    </w:r>
-    <w:r>
-      <w:rPr>
-        <w:rFonts w:ascii="Plus Jakarta Sans" w:cs="Plus Jakarta Sans" w:eastAsia="Plus Jakarta Sans" w:hAnsi="Plus Jakarta Sans"/>
-        <w:color w:val="5C6A94"/>
-        <w:sz w:val="15"/>
-        <w:szCs w:val="15"/>
-      </w:rPr>
-      <w:t xml:space="preserve">	SUNU Park · Functional requirements · v1.2.50</w:t>
     </w:r>
   </w:p>
 </w:hdr>

</xml_diff>

<commit_message>
Docs: web and app screenshots in the functional requirements (Word and PDF)
Co-Authored-By: Claude Opus 5.5 <noreply@anthropic.com>
Claude-Session: https://claude.ai/code/session_015837ouLbwrQdJqFUX8HYPx
</commit_message>
<xml_diff>
--- a/docs/SUNU-Park-Functional-Requirements.docx
+++ b/docs/SUNU-Park-Functional-Requirements.docx
@@ -256,7 +256,7 @@
       <w:pPr>
         <w:spacing w:after="60"/>
       </w:pPr>
-      <w:hyperlink w:history="1" r:id="rIdhy8efql52yrsdybrvasjj">
+      <w:hyperlink w:history="1" r:id="rIdckoyyye5pc_maosy72kuc">
         <w:r>
           <w:rPr>
             <w:rFonts w:ascii="Plus Jakarta Sans" w:cs="Plus Jakarta Sans" w:eastAsia="Plus Jakarta Sans" w:hAnsi="Plus Jakarta Sans"/>
@@ -277,7 +277,7 @@
         </w:rPr>
         <w:t xml:space="preserve">  ·  </w:t>
       </w:r>
-      <w:hyperlink w:history="1" r:id="rIdadrujikve8i9uiujc_zxb">
+      <w:hyperlink w:history="1" r:id="rId9gupaz1aqe2ofgbdhqu2p">
         <w:r>
           <w:rPr>
             <w:rFonts w:ascii="Plus Jakarta Sans" w:cs="Plus Jakarta Sans" w:eastAsia="Plus Jakarta Sans" w:hAnsi="Plus Jakarta Sans"/>
@@ -298,7 +298,7 @@
         </w:rPr>
         <w:t xml:space="preserve">  ·  </w:t>
       </w:r>
-      <w:hyperlink w:history="1" r:id="rIdko1dq4bb9mptuwyicbo71">
+      <w:hyperlink w:history="1" r:id="rIdrowkrfudlbbie-e-6p2nx">
         <w:r>
           <w:rPr>
             <w:rFonts w:ascii="Plus Jakarta Sans" w:cs="Plus Jakarta Sans" w:eastAsia="Plus Jakarta Sans" w:hAnsi="Plus Jakarta Sans"/>
@@ -315,7 +315,7 @@
       <w:pPr>
         <w:spacing w:after="160"/>
       </w:pPr>
-      <w:hyperlink w:history="1" r:id="rIdpz0o_nh2tewr5hdr0goe2">
+      <w:hyperlink w:history="1" r:id="rIdulljhefqhprhdpx4h7ky5">
         <w:r>
           <w:rPr>
             <w:rFonts w:ascii="Plus Jakarta Sans" w:cs="Plus Jakarta Sans" w:eastAsia="Plus Jakarta Sans" w:hAnsi="Plus Jakarta Sans"/>
@@ -336,7 +336,7 @@
         </w:rPr>
         <w:t xml:space="preserve">  ·  </w:t>
       </w:r>
-      <w:hyperlink w:history="1" r:id="rIdbr7hktekiz5uzhfbwnbl2">
+      <w:hyperlink w:history="1" r:id="rIdqnilrtggdzvsuqlsiazle">
         <w:r>
           <w:rPr>
             <w:rFonts w:ascii="Plus Jakarta Sans" w:cs="Plus Jakarta Sans" w:eastAsia="Plus Jakarta Sans" w:hAnsi="Plus Jakarta Sans"/>
@@ -357,7 +357,7 @@
         </w:rPr>
         <w:t xml:space="preserve">  ·  </w:t>
       </w:r>
-      <w:hyperlink w:history="1" r:id="rIdzq85mxuwsvwfz_8grp1jv">
+      <w:hyperlink w:history="1" r:id="rIdp_qaqz-fmnbw2m78r8cqq">
         <w:r>
           <w:rPr>
             <w:rFonts w:ascii="Plus Jakarta Sans" w:cs="Plus Jakarta Sans" w:eastAsia="Plus Jakarta Sans" w:hAnsi="Plus Jakarta Sans"/>
@@ -391,7 +391,7 @@
       <w:pPr>
         <w:spacing w:after="60"/>
       </w:pPr>
-      <w:hyperlink w:history="1" r:id="rIdicxgtxvta5b-4q5dxnkns">
+      <w:hyperlink w:history="1" r:id="rId5sjuyxibc10rsg1bh1lnb">
         <w:r>
           <w:rPr>
             <w:rFonts w:ascii="Plus Jakarta Sans" w:cs="Plus Jakarta Sans" w:eastAsia="Plus Jakarta Sans" w:hAnsi="Plus Jakarta Sans"/>
@@ -412,7 +412,7 @@
         </w:rPr>
         <w:t xml:space="preserve">  ·  </w:t>
       </w:r>
-      <w:hyperlink w:history="1" r:id="rIdrsq9nyftvsqdjyapgp2rc">
+      <w:hyperlink w:history="1" r:id="rIdtbufnokkf-ii6xknum_hy">
         <w:r>
           <w:rPr>
             <w:rFonts w:ascii="Plus Jakarta Sans" w:cs="Plus Jakarta Sans" w:eastAsia="Plus Jakarta Sans" w:hAnsi="Plus Jakarta Sans"/>
@@ -429,7 +429,7 @@
       <w:pPr>
         <w:spacing w:after="60"/>
       </w:pPr>
-      <w:hyperlink w:history="1" r:id="rIdwk-ew-ei-svgtmg3ickir">
+      <w:hyperlink w:history="1" r:id="rIdsowp0_b9g5hqetcaoaqmr">
         <w:r>
           <w:rPr>
             <w:rFonts w:ascii="Plus Jakarta Sans" w:cs="Plus Jakarta Sans" w:eastAsia="Plus Jakarta Sans" w:hAnsi="Plus Jakarta Sans"/>
@@ -450,7 +450,7 @@
         </w:rPr>
         <w:t xml:space="preserve">  ·  </w:t>
       </w:r>
-      <w:hyperlink w:history="1" r:id="rId-shazee8i443qvpc6dk7s">
+      <w:hyperlink w:history="1" r:id="rIdfcbg-ebyvvte9fdst38xw">
         <w:r>
           <w:rPr>
             <w:rFonts w:ascii="Plus Jakarta Sans" w:cs="Plus Jakarta Sans" w:eastAsia="Plus Jakarta Sans" w:hAnsi="Plus Jakarta Sans"/>
@@ -9342,7 +9342,7 @@
         </w:rPr>
         <w:t xml:space="preserve">Code &amp; docs: </w:t>
       </w:r>
-      <w:hyperlink w:history="1" r:id="rIdyfrkxk5dpzpoq2igh0ujp">
+      <w:hyperlink w:history="1" r:id="rIdpilr38gsk1lxvbq94-skc">
         <w:r>
           <w:rPr>
             <w:rFonts w:ascii="Plus Jakarta Sans" w:cs="Plus Jakarta Sans" w:eastAsia="Plus Jakarta Sans" w:hAnsi="Plus Jakarta Sans"/>
@@ -9364,6 +9364,1083 @@
         <w:t xml:space="preserve"> · README, docs/ARCHITECTURE.md, docs/DEPLOYMENT.md</w:t>
       </w:r>
     </w:p>
+    <w:p>
+      <w:r>
+        <w:br w:type="page"/>
+      </w:r>
+    </w:p>
+    <w:p>
+      <w:pPr>
+        <w:spacing w:after="40" w:before="120"/>
+      </w:pPr>
+      <w:r>
+        <w:rPr>
+          <w:rFonts w:ascii="Plus Jakarta Sans" w:cs="Plus Jakarta Sans" w:eastAsia="Plus Jakarta Sans" w:hAnsi="Plus Jakarta Sans"/>
+          <w:b/>
+          <w:bCs/>
+          <w:color w:val="035BF0"/>
+          <w:spacing w:val="40"/>
+          <w:sz w:val="16"/>
+          <w:szCs w:val="16"/>
+        </w:rPr>
+        <w:t xml:space="preserve">08 — SCREENS · WEB</w:t>
+      </w:r>
+    </w:p>
+    <w:p>
+      <w:pPr>
+        <w:pStyle w:val="Heading1"/>
+        <w:spacing w:after="120"/>
+      </w:pPr>
+      <w:r>
+        <w:rPr>
+          <w:rFonts w:ascii="Plus Jakarta Sans" w:cs="Plus Jakarta Sans" w:eastAsia="Plus Jakarta Sans" w:hAnsi="Plus Jakarta Sans"/>
+          <w:b/>
+          <w:bCs/>
+          <w:color w:val="0A1B4D"/>
+          <w:sz w:val="40"/>
+          <w:szCs w:val="40"/>
+        </w:rPr>
+        <w:t xml:space="preserve">The web portal today</w:t>
+      </w:r>
+    </w:p>
+    <w:p>
+      <w:r>
+        <w:drawing>
+          <wp:inline distT="0" distB="0" distL="0" distR="0">
+            <wp:extent cx="6000750" cy="2914650"/>
+            <wp:effectExtent t="0" r="0" b="0" l="0"/>
+            <wp:docPr id="4" name="" descr="" title=""/>
+            <wp:cNvGraphicFramePr>
+              <a:graphicFrameLocks xmlns:a="http://schemas.openxmlformats.org/drawingml/2006/main" noChangeAspect="1"/>
+            </wp:cNvGraphicFramePr>
+            <a:graphic xmlns:a="http://schemas.openxmlformats.org/drawingml/2006/main">
+              <a:graphicData uri="http://schemas.openxmlformats.org/drawingml/2006/picture">
+                <pic:pic xmlns:pic="http://schemas.openxmlformats.org/drawingml/2006/picture">
+                  <pic:nvPicPr>
+                    <pic:cNvPr id="0" name="" descr=""/>
+                    <pic:cNvPicPr>
+                      <a:picLocks noChangeAspect="1" noChangeArrowheads="1"/>
+                    </pic:cNvPicPr>
+                  </pic:nvPicPr>
+                  <pic:blipFill>
+                    <a:blip r:embed="rId12" cstate="none"/>
+                    <a:srcRect/>
+                    <a:stretch>
+                      <a:fillRect/>
+                    </a:stretch>
+                  </pic:blipFill>
+                  <pic:spPr bwMode="auto">
+                    <a:xfrm>
+                      <a:off x="0" y="0"/>
+                      <a:ext cx="6000750" cy="2914650"/>
+                    </a:xfrm>
+                    <a:prstGeom prst="rect">
+                      <a:avLst/>
+                    </a:prstGeom>
+                  </pic:spPr>
+                </pic:pic>
+              </a:graphicData>
+            </a:graphic>
+          </wp:inline>
+        </w:drawing>
+      </w:r>
+    </w:p>
+    <w:p>
+      <w:pPr>
+        <w:spacing w:after="160" w:before="40"/>
+      </w:pPr>
+      <w:r>
+        <w:rPr>
+          <w:rFonts w:ascii="Plus Jakarta Sans" w:cs="Plus Jakarta Sans" w:eastAsia="Plus Jakarta Sans" w:hAnsi="Plus Jakarta Sans"/>
+          <w:b/>
+          <w:bCs/>
+          <w:color w:val="0A1B4D"/>
+          <w:sz w:val="17"/>
+          <w:szCs w:val="17"/>
+        </w:rPr>
+        <w:t xml:space="preserve">Home page</w:t>
+      </w:r>
+      <w:r>
+        <w:rPr>
+          <w:rFonts w:ascii="Plus Jakarta Sans" w:cs="Plus Jakarta Sans" w:eastAsia="Plus Jakarta Sans" w:hAnsi="Plus Jakarta Sans"/>
+          <w:color w:val="5C6A94"/>
+          <w:sz w:val="17"/>
+          <w:szCs w:val="17"/>
+        </w:rPr>
+        <w:t xml:space="preserve">  landscape: the hero beside the four portal sign-ins</w:t>
+      </w:r>
+    </w:p>
+    <w:p>
+      <w:r>
+        <w:drawing>
+          <wp:inline distT="0" distB="0" distL="0" distR="0">
+            <wp:extent cx="6000750" cy="2581275"/>
+            <wp:effectExtent t="0" r="0" b="0" l="0"/>
+            <wp:docPr id="5" name="" descr="" title=""/>
+            <wp:cNvGraphicFramePr>
+              <a:graphicFrameLocks xmlns:a="http://schemas.openxmlformats.org/drawingml/2006/main" noChangeAspect="1"/>
+            </wp:cNvGraphicFramePr>
+            <a:graphic xmlns:a="http://schemas.openxmlformats.org/drawingml/2006/main">
+              <a:graphicData uri="http://schemas.openxmlformats.org/drawingml/2006/picture">
+                <pic:pic xmlns:pic="http://schemas.openxmlformats.org/drawingml/2006/picture">
+                  <pic:nvPicPr>
+                    <pic:cNvPr id="0" name="" descr=""/>
+                    <pic:cNvPicPr>
+                      <a:picLocks noChangeAspect="1" noChangeArrowheads="1"/>
+                    </pic:cNvPicPr>
+                  </pic:nvPicPr>
+                  <pic:blipFill>
+                    <a:blip r:embed="rId13" cstate="none"/>
+                    <a:srcRect/>
+                    <a:stretch>
+                      <a:fillRect/>
+                    </a:stretch>
+                  </pic:blipFill>
+                  <pic:spPr bwMode="auto">
+                    <a:xfrm>
+                      <a:off x="0" y="0"/>
+                      <a:ext cx="6000750" cy="2581275"/>
+                    </a:xfrm>
+                    <a:prstGeom prst="rect">
+                      <a:avLst/>
+                    </a:prstGeom>
+                  </pic:spPr>
+                </pic:pic>
+              </a:graphicData>
+            </a:graphic>
+          </wp:inline>
+        </w:drawing>
+      </w:r>
+    </w:p>
+    <w:p>
+      <w:pPr>
+        <w:spacing w:after="160" w:before="40"/>
+      </w:pPr>
+      <w:r>
+        <w:rPr>
+          <w:rFonts w:ascii="Plus Jakarta Sans" w:cs="Plus Jakarta Sans" w:eastAsia="Plus Jakarta Sans" w:hAnsi="Plus Jakarta Sans"/>
+          <w:b/>
+          <w:bCs/>
+          <w:color w:val="0A1B4D"/>
+          <w:sz w:val="17"/>
+          <w:szCs w:val="17"/>
+        </w:rPr>
+        <w:t xml:space="preserve">Administrator dashboard</w:t>
+      </w:r>
+      <w:r>
+        <w:rPr>
+          <w:rFonts w:ascii="Plus Jakarta Sans" w:cs="Plus Jakarta Sans" w:eastAsia="Plus Jakarta Sans" w:hAnsi="Plus Jakarta Sans"/>
+          <w:color w:val="5C6A94"/>
+          <w:sz w:val="17"/>
+          <w:szCs w:val="17"/>
+        </w:rPr>
+        <w:t xml:space="preserve">  /admin: live roads, attendants, payments</w:t>
+      </w:r>
+    </w:p>
+    <w:tbl>
+      <w:tblPr>
+        <w:tblW w:type="dxa" w:w="9638"/>
+        <w:tblBorders>
+          <w:top w:val="single" w:color="auto" w:sz="4"/>
+          <w:left w:val="single" w:color="auto" w:sz="4"/>
+          <w:bottom w:val="single" w:color="auto" w:sz="4"/>
+          <w:right w:val="single" w:color="auto" w:sz="4"/>
+          <w:insideH w:val="single" w:color="auto" w:sz="4"/>
+          <w:insideV w:val="single" w:color="auto" w:sz="4"/>
+        </w:tblBorders>
+      </w:tblPr>
+      <w:tblGrid>
+        <w:gridCol w:w="4819"/>
+        <w:gridCol w:w="4819"/>
+      </w:tblGrid>
+      <w:tr>
+        <w:tc>
+          <w:tcPr>
+            <w:tcW w:type="dxa" w:w="4819"/>
+            <w:tcBorders>
+              <w:top w:val="none" w:color="FFFFFF" w:sz="0"/>
+              <w:left w:val="none" w:color="FFFFFF" w:sz="0"/>
+              <w:bottom w:val="none" w:color="FFFFFF" w:sz="0"/>
+              <w:right w:val="none" w:color="FFFFFF" w:sz="0"/>
+            </w:tcBorders>
+            <w:tcMar>
+              <w:left w:type="dxa" w:w="60"/>
+              <w:right w:type="dxa" w:w="60"/>
+            </w:tcMar>
+          </w:tcPr>
+          <w:p>
+            <w:pPr>
+              <w:jc w:val="center"/>
+            </w:pPr>
+            <w:r>
+              <w:drawing>
+                <wp:inline distT="0" distB="0" distL="0" distR="0">
+                  <wp:extent cx="2857500" cy="1219200"/>
+                  <wp:effectExtent t="0" r="0" b="0" l="0"/>
+                  <wp:docPr id="6" name="" descr="" title=""/>
+                  <wp:cNvGraphicFramePr>
+                    <a:graphicFrameLocks xmlns:a="http://schemas.openxmlformats.org/drawingml/2006/main" noChangeAspect="1"/>
+                  </wp:cNvGraphicFramePr>
+                  <a:graphic xmlns:a="http://schemas.openxmlformats.org/drawingml/2006/main">
+                    <a:graphicData uri="http://schemas.openxmlformats.org/drawingml/2006/picture">
+                      <pic:pic xmlns:pic="http://schemas.openxmlformats.org/drawingml/2006/picture">
+                        <pic:nvPicPr>
+                          <pic:cNvPr id="0" name="" descr=""/>
+                          <pic:cNvPicPr>
+                            <a:picLocks noChangeAspect="1" noChangeArrowheads="1"/>
+                          </pic:cNvPicPr>
+                        </pic:nvPicPr>
+                        <pic:blipFill>
+                          <a:blip r:embed="rId14" cstate="none"/>
+                          <a:srcRect/>
+                          <a:stretch>
+                            <a:fillRect/>
+                          </a:stretch>
+                        </pic:blipFill>
+                        <pic:spPr bwMode="auto">
+                          <a:xfrm>
+                            <a:off x="0" y="0"/>
+                            <a:ext cx="2857500" cy="1219200"/>
+                          </a:xfrm>
+                          <a:prstGeom prst="rect">
+                            <a:avLst/>
+                          </a:prstGeom>
+                        </pic:spPr>
+                      </pic:pic>
+                    </a:graphicData>
+                  </a:graphic>
+                </wp:inline>
+              </w:drawing>
+            </w:r>
+          </w:p>
+          <w:p>
+            <w:pPr>
+              <w:spacing w:after="120"/>
+              <w:jc w:val="center"/>
+            </w:pPr>
+            <w:r>
+              <w:rPr>
+                <w:rFonts w:ascii="Plus Jakarta Sans" w:cs="Plus Jakarta Sans" w:eastAsia="Plus Jakarta Sans" w:hAnsi="Plus Jakarta Sans"/>
+                <w:b/>
+                <w:bCs/>
+                <w:color w:val="5C6A94"/>
+                <w:sz w:val="16"/>
+                <w:szCs w:val="16"/>
+              </w:rPr>
+              <w:t xml:space="preserve">Police sign-in · /police</w:t>
+            </w:r>
+          </w:p>
+        </w:tc>
+        <w:tc>
+          <w:tcPr>
+            <w:tcW w:type="dxa" w:w="4819"/>
+            <w:tcBorders>
+              <w:top w:val="none" w:color="FFFFFF" w:sz="0"/>
+              <w:left w:val="none" w:color="FFFFFF" w:sz="0"/>
+              <w:bottom w:val="none" w:color="FFFFFF" w:sz="0"/>
+              <w:right w:val="none" w:color="FFFFFF" w:sz="0"/>
+            </w:tcBorders>
+            <w:tcMar>
+              <w:left w:type="dxa" w:w="60"/>
+              <w:right w:type="dxa" w:w="60"/>
+            </w:tcMar>
+          </w:tcPr>
+          <w:p>
+            <w:pPr>
+              <w:jc w:val="center"/>
+            </w:pPr>
+            <w:r>
+              <w:drawing>
+                <wp:inline distT="0" distB="0" distL="0" distR="0">
+                  <wp:extent cx="2857500" cy="1219200"/>
+                  <wp:effectExtent t="0" r="0" b="0" l="0"/>
+                  <wp:docPr id="7" name="" descr="" title=""/>
+                  <wp:cNvGraphicFramePr>
+                    <a:graphicFrameLocks xmlns:a="http://schemas.openxmlformats.org/drawingml/2006/main" noChangeAspect="1"/>
+                  </wp:cNvGraphicFramePr>
+                  <a:graphic xmlns:a="http://schemas.openxmlformats.org/drawingml/2006/main">
+                    <a:graphicData uri="http://schemas.openxmlformats.org/drawingml/2006/picture">
+                      <pic:pic xmlns:pic="http://schemas.openxmlformats.org/drawingml/2006/picture">
+                        <pic:nvPicPr>
+                          <pic:cNvPr id="0" name="" descr=""/>
+                          <pic:cNvPicPr>
+                            <a:picLocks noChangeAspect="1" noChangeArrowheads="1"/>
+                          </pic:cNvPicPr>
+                        </pic:nvPicPr>
+                        <pic:blipFill>
+                          <a:blip r:embed="rId15" cstate="none"/>
+                          <a:srcRect/>
+                          <a:stretch>
+                            <a:fillRect/>
+                          </a:stretch>
+                        </pic:blipFill>
+                        <pic:spPr bwMode="auto">
+                          <a:xfrm>
+                            <a:off x="0" y="0"/>
+                            <a:ext cx="2857500" cy="1219200"/>
+                          </a:xfrm>
+                          <a:prstGeom prst="rect">
+                            <a:avLst/>
+                          </a:prstGeom>
+                        </pic:spPr>
+                      </pic:pic>
+                    </a:graphicData>
+                  </a:graphic>
+                </wp:inline>
+              </w:drawing>
+            </w:r>
+          </w:p>
+          <w:p>
+            <w:pPr>
+              <w:spacing w:after="120"/>
+              <w:jc w:val="center"/>
+            </w:pPr>
+            <w:r>
+              <w:rPr>
+                <w:rFonts w:ascii="Plus Jakarta Sans" w:cs="Plus Jakarta Sans" w:eastAsia="Plus Jakarta Sans" w:hAnsi="Plus Jakarta Sans"/>
+                <w:b/>
+                <w:bCs/>
+                <w:color w:val="5C6A94"/>
+                <w:sz w:val="16"/>
+                <w:szCs w:val="16"/>
+              </w:rPr>
+              <w:t xml:space="preserve">Fines tracking · read-only</w:t>
+            </w:r>
+          </w:p>
+        </w:tc>
+      </w:tr>
+    </w:tbl>
+    <w:p>
+      <w:r>
+        <w:br w:type="page"/>
+      </w:r>
+    </w:p>
+    <w:p>
+      <w:pPr>
+        <w:spacing w:after="40" w:before="120"/>
+      </w:pPr>
+      <w:r>
+        <w:rPr>
+          <w:rFonts w:ascii="Plus Jakarta Sans" w:cs="Plus Jakarta Sans" w:eastAsia="Plus Jakarta Sans" w:hAnsi="Plus Jakarta Sans"/>
+          <w:b/>
+          <w:bCs/>
+          <w:color w:val="035BF0"/>
+          <w:spacing w:val="40"/>
+          <w:sz w:val="16"/>
+          <w:szCs w:val="16"/>
+        </w:rPr>
+        <w:t xml:space="preserve">09 — SCREENS · ANDROID APPS</w:t>
+      </w:r>
+    </w:p>
+    <w:p>
+      <w:pPr>
+        <w:pStyle w:val="Heading1"/>
+        <w:spacing w:after="120"/>
+      </w:pPr>
+      <w:r>
+        <w:rPr>
+          <w:rFonts w:ascii="Plus Jakarta Sans" w:cs="Plus Jakarta Sans" w:eastAsia="Plus Jakarta Sans" w:hAnsi="Plus Jakarta Sans"/>
+          <w:b/>
+          <w:bCs/>
+          <w:color w:val="0A1B4D"/>
+          <w:sz w:val="40"/>
+          <w:szCs w:val="40"/>
+        </w:rPr>
+        <w:t xml:space="preserve">The two apps</w:t>
+      </w:r>
+    </w:p>
+    <w:p>
+      <w:pPr>
+        <w:pStyle w:val="Heading2"/>
+        <w:spacing w:after="80" w:before="200"/>
+      </w:pPr>
+      <w:r>
+        <w:rPr>
+          <w:rFonts w:ascii="Plus Jakarta Sans" w:cs="Plus Jakarta Sans" w:eastAsia="Plus Jakarta Sans" w:hAnsi="Plus Jakarta Sans"/>
+          <w:b/>
+          <w:bCs/>
+          <w:color w:val="0B2E63"/>
+          <w:sz w:val="26"/>
+          <w:szCs w:val="26"/>
+        </w:rPr>
+        <w:t xml:space="preserve">SUNU Park · drivers</w:t>
+      </w:r>
+    </w:p>
+    <w:tbl>
+      <w:tblPr>
+        <w:tblW w:type="dxa" w:w="9638"/>
+        <w:tblBorders>
+          <w:top w:val="single" w:color="auto" w:sz="4"/>
+          <w:left w:val="single" w:color="auto" w:sz="4"/>
+          <w:bottom w:val="single" w:color="auto" w:sz="4"/>
+          <w:right w:val="single" w:color="auto" w:sz="4"/>
+          <w:insideH w:val="single" w:color="auto" w:sz="4"/>
+          <w:insideV w:val="single" w:color="auto" w:sz="4"/>
+        </w:tblBorders>
+      </w:tblPr>
+      <w:tblGrid>
+        <w:gridCol w:w="2409"/>
+        <w:gridCol w:w="2409"/>
+        <w:gridCol w:w="2409"/>
+        <w:gridCol w:w="2409"/>
+      </w:tblGrid>
+      <w:tr>
+        <w:tc>
+          <w:tcPr>
+            <w:tcW w:type="dxa" w:w="2409"/>
+            <w:tcBorders>
+              <w:top w:val="none" w:color="FFFFFF" w:sz="0"/>
+              <w:left w:val="none" w:color="FFFFFF" w:sz="0"/>
+              <w:bottom w:val="none" w:color="FFFFFF" w:sz="0"/>
+              <w:right w:val="none" w:color="FFFFFF" w:sz="0"/>
+            </w:tcBorders>
+            <w:tcMar>
+              <w:left w:type="dxa" w:w="60"/>
+              <w:right w:type="dxa" w:w="60"/>
+            </w:tcMar>
+          </w:tcPr>
+          <w:p>
+            <w:pPr>
+              <w:jc w:val="center"/>
+            </w:pPr>
+            <w:r>
+              <w:drawing>
+                <wp:inline distT="0" distB="0" distL="0" distR="0">
+                  <wp:extent cx="1333500" cy="2371725"/>
+                  <wp:effectExtent t="0" r="0" b="0" l="0"/>
+                  <wp:docPr id="8" name="" descr="" title=""/>
+                  <wp:cNvGraphicFramePr>
+                    <a:graphicFrameLocks xmlns:a="http://schemas.openxmlformats.org/drawingml/2006/main" noChangeAspect="1"/>
+                  </wp:cNvGraphicFramePr>
+                  <a:graphic xmlns:a="http://schemas.openxmlformats.org/drawingml/2006/main">
+                    <a:graphicData uri="http://schemas.openxmlformats.org/drawingml/2006/picture">
+                      <pic:pic xmlns:pic="http://schemas.openxmlformats.org/drawingml/2006/picture">
+                        <pic:nvPicPr>
+                          <pic:cNvPr id="0" name="" descr=""/>
+                          <pic:cNvPicPr>
+                            <a:picLocks noChangeAspect="1" noChangeArrowheads="1"/>
+                          </pic:cNvPicPr>
+                        </pic:nvPicPr>
+                        <pic:blipFill>
+                          <a:blip r:embed="rId16" cstate="none"/>
+                          <a:srcRect/>
+                          <a:stretch>
+                            <a:fillRect/>
+                          </a:stretch>
+                        </pic:blipFill>
+                        <pic:spPr bwMode="auto">
+                          <a:xfrm>
+                            <a:off x="0" y="0"/>
+                            <a:ext cx="1333500" cy="2371725"/>
+                          </a:xfrm>
+                          <a:prstGeom prst="rect">
+                            <a:avLst/>
+                          </a:prstGeom>
+                        </pic:spPr>
+                      </pic:pic>
+                    </a:graphicData>
+                  </a:graphic>
+                </wp:inline>
+              </w:drawing>
+            </w:r>
+          </w:p>
+          <w:p>
+            <w:pPr>
+              <w:spacing w:after="120"/>
+              <w:jc w:val="center"/>
+            </w:pPr>
+            <w:r>
+              <w:rPr>
+                <w:rFonts w:ascii="Plus Jakarta Sans" w:cs="Plus Jakarta Sans" w:eastAsia="Plus Jakarta Sans" w:hAnsi="Plus Jakarta Sans"/>
+                <w:b/>
+                <w:bCs/>
+                <w:color w:val="5C6A94"/>
+                <w:sz w:val="16"/>
+                <w:szCs w:val="16"/>
+              </w:rPr>
+              <w:t xml:space="preserve">Welcome</w:t>
+            </w:r>
+          </w:p>
+        </w:tc>
+        <w:tc>
+          <w:tcPr>
+            <w:tcW w:type="dxa" w:w="2409"/>
+            <w:tcBorders>
+              <w:top w:val="none" w:color="FFFFFF" w:sz="0"/>
+              <w:left w:val="none" w:color="FFFFFF" w:sz="0"/>
+              <w:bottom w:val="none" w:color="FFFFFF" w:sz="0"/>
+              <w:right w:val="none" w:color="FFFFFF" w:sz="0"/>
+            </w:tcBorders>
+            <w:tcMar>
+              <w:left w:type="dxa" w:w="60"/>
+              <w:right w:type="dxa" w:w="60"/>
+            </w:tcMar>
+          </w:tcPr>
+          <w:p>
+            <w:pPr>
+              <w:jc w:val="center"/>
+            </w:pPr>
+            <w:r>
+              <w:drawing>
+                <wp:inline distT="0" distB="0" distL="0" distR="0">
+                  <wp:extent cx="1333500" cy="2371725"/>
+                  <wp:effectExtent t="0" r="0" b="0" l="0"/>
+                  <wp:docPr id="9" name="" descr="" title=""/>
+                  <wp:cNvGraphicFramePr>
+                    <a:graphicFrameLocks xmlns:a="http://schemas.openxmlformats.org/drawingml/2006/main" noChangeAspect="1"/>
+                  </wp:cNvGraphicFramePr>
+                  <a:graphic xmlns:a="http://schemas.openxmlformats.org/drawingml/2006/main">
+                    <a:graphicData uri="http://schemas.openxmlformats.org/drawingml/2006/picture">
+                      <pic:pic xmlns:pic="http://schemas.openxmlformats.org/drawingml/2006/picture">
+                        <pic:nvPicPr>
+                          <pic:cNvPr id="0" name="" descr=""/>
+                          <pic:cNvPicPr>
+                            <a:picLocks noChangeAspect="1" noChangeArrowheads="1"/>
+                          </pic:cNvPicPr>
+                        </pic:nvPicPr>
+                        <pic:blipFill>
+                          <a:blip r:embed="rId17" cstate="none"/>
+                          <a:srcRect/>
+                          <a:stretch>
+                            <a:fillRect/>
+                          </a:stretch>
+                        </pic:blipFill>
+                        <pic:spPr bwMode="auto">
+                          <a:xfrm>
+                            <a:off x="0" y="0"/>
+                            <a:ext cx="1333500" cy="2371725"/>
+                          </a:xfrm>
+                          <a:prstGeom prst="rect">
+                            <a:avLst/>
+                          </a:prstGeom>
+                        </pic:spPr>
+                      </pic:pic>
+                    </a:graphicData>
+                  </a:graphic>
+                </wp:inline>
+              </w:drawing>
+            </w:r>
+          </w:p>
+          <w:p>
+            <w:pPr>
+              <w:spacing w:after="120"/>
+              <w:jc w:val="center"/>
+            </w:pPr>
+            <w:r>
+              <w:rPr>
+                <w:rFonts w:ascii="Plus Jakarta Sans" w:cs="Plus Jakarta Sans" w:eastAsia="Plus Jakarta Sans" w:hAnsi="Plus Jakarta Sans"/>
+                <w:b/>
+                <w:bCs/>
+                <w:color w:val="5C6A94"/>
+                <w:sz w:val="16"/>
+                <w:szCs w:val="16"/>
+              </w:rPr>
+              <w:t xml:space="preserve">Home · monthly pass</w:t>
+            </w:r>
+          </w:p>
+        </w:tc>
+        <w:tc>
+          <w:tcPr>
+            <w:tcW w:type="dxa" w:w="2409"/>
+            <w:tcBorders>
+              <w:top w:val="none" w:color="FFFFFF" w:sz="0"/>
+              <w:left w:val="none" w:color="FFFFFF" w:sz="0"/>
+              <w:bottom w:val="none" w:color="FFFFFF" w:sz="0"/>
+              <w:right w:val="none" w:color="FFFFFF" w:sz="0"/>
+            </w:tcBorders>
+            <w:tcMar>
+              <w:left w:type="dxa" w:w="60"/>
+              <w:right w:type="dxa" w:w="60"/>
+            </w:tcMar>
+          </w:tcPr>
+          <w:p>
+            <w:pPr>
+              <w:jc w:val="center"/>
+            </w:pPr>
+            <w:r>
+              <w:drawing>
+                <wp:inline distT="0" distB="0" distL="0" distR="0">
+                  <wp:extent cx="1333500" cy="2371725"/>
+                  <wp:effectExtent t="0" r="0" b="0" l="0"/>
+                  <wp:docPr id="10" name="" descr="" title=""/>
+                  <wp:cNvGraphicFramePr>
+                    <a:graphicFrameLocks xmlns:a="http://schemas.openxmlformats.org/drawingml/2006/main" noChangeAspect="1"/>
+                  </wp:cNvGraphicFramePr>
+                  <a:graphic xmlns:a="http://schemas.openxmlformats.org/drawingml/2006/main">
+                    <a:graphicData uri="http://schemas.openxmlformats.org/drawingml/2006/picture">
+                      <pic:pic xmlns:pic="http://schemas.openxmlformats.org/drawingml/2006/picture">
+                        <pic:nvPicPr>
+                          <pic:cNvPr id="0" name="" descr=""/>
+                          <pic:cNvPicPr>
+                            <a:picLocks noChangeAspect="1" noChangeArrowheads="1"/>
+                          </pic:cNvPicPr>
+                        </pic:nvPicPr>
+                        <pic:blipFill>
+                          <a:blip r:embed="rId18" cstate="none"/>
+                          <a:srcRect/>
+                          <a:stretch>
+                            <a:fillRect/>
+                          </a:stretch>
+                        </pic:blipFill>
+                        <pic:spPr bwMode="auto">
+                          <a:xfrm>
+                            <a:off x="0" y="0"/>
+                            <a:ext cx="1333500" cy="2371725"/>
+                          </a:xfrm>
+                          <a:prstGeom prst="rect">
+                            <a:avLst/>
+                          </a:prstGeom>
+                        </pic:spPr>
+                      </pic:pic>
+                    </a:graphicData>
+                  </a:graphic>
+                </wp:inline>
+              </w:drawing>
+            </w:r>
+          </w:p>
+          <w:p>
+            <w:pPr>
+              <w:spacing w:after="120"/>
+              <w:jc w:val="center"/>
+            </w:pPr>
+            <w:r>
+              <w:rPr>
+                <w:rFonts w:ascii="Plus Jakarta Sans" w:cs="Plus Jakarta Sans" w:eastAsia="Plus Jakarta Sans" w:hAnsi="Plus Jakarta Sans"/>
+                <w:b/>
+                <w:bCs/>
+                <w:color w:val="5C6A94"/>
+                <w:sz w:val="16"/>
+                <w:szCs w:val="16"/>
+              </w:rPr>
+              <w:t xml:space="preserve">Pay</w:t>
+            </w:r>
+          </w:p>
+        </w:tc>
+        <w:tc>
+          <w:tcPr>
+            <w:tcW w:type="dxa" w:w="2409"/>
+            <w:tcBorders>
+              <w:top w:val="none" w:color="FFFFFF" w:sz="0"/>
+              <w:left w:val="none" w:color="FFFFFF" w:sz="0"/>
+              <w:bottom w:val="none" w:color="FFFFFF" w:sz="0"/>
+              <w:right w:val="none" w:color="FFFFFF" w:sz="0"/>
+            </w:tcBorders>
+            <w:tcMar>
+              <w:left w:type="dxa" w:w="60"/>
+              <w:right w:type="dxa" w:w="60"/>
+            </w:tcMar>
+          </w:tcPr>
+          <w:p>
+            <w:pPr>
+              <w:jc w:val="center"/>
+            </w:pPr>
+            <w:r>
+              <w:drawing>
+                <wp:inline distT="0" distB="0" distL="0" distR="0">
+                  <wp:extent cx="1333500" cy="2371725"/>
+                  <wp:effectExtent t="0" r="0" b="0" l="0"/>
+                  <wp:docPr id="11" name="" descr="" title=""/>
+                  <wp:cNvGraphicFramePr>
+                    <a:graphicFrameLocks xmlns:a="http://schemas.openxmlformats.org/drawingml/2006/main" noChangeAspect="1"/>
+                  </wp:cNvGraphicFramePr>
+                  <a:graphic xmlns:a="http://schemas.openxmlformats.org/drawingml/2006/main">
+                    <a:graphicData uri="http://schemas.openxmlformats.org/drawingml/2006/picture">
+                      <pic:pic xmlns:pic="http://schemas.openxmlformats.org/drawingml/2006/picture">
+                        <pic:nvPicPr>
+                          <pic:cNvPr id="0" name="" descr=""/>
+                          <pic:cNvPicPr>
+                            <a:picLocks noChangeAspect="1" noChangeArrowheads="1"/>
+                          </pic:cNvPicPr>
+                        </pic:nvPicPr>
+                        <pic:blipFill>
+                          <a:blip r:embed="rId19" cstate="none"/>
+                          <a:srcRect/>
+                          <a:stretch>
+                            <a:fillRect/>
+                          </a:stretch>
+                        </pic:blipFill>
+                        <pic:spPr bwMode="auto">
+                          <a:xfrm>
+                            <a:off x="0" y="0"/>
+                            <a:ext cx="1333500" cy="2371725"/>
+                          </a:xfrm>
+                          <a:prstGeom prst="rect">
+                            <a:avLst/>
+                          </a:prstGeom>
+                        </pic:spPr>
+                      </pic:pic>
+                    </a:graphicData>
+                  </a:graphic>
+                </wp:inline>
+              </w:drawing>
+            </w:r>
+          </w:p>
+          <w:p>
+            <w:pPr>
+              <w:spacing w:after="120"/>
+              <w:jc w:val="center"/>
+            </w:pPr>
+            <w:r>
+              <w:rPr>
+                <w:rFonts w:ascii="Plus Jakarta Sans" w:cs="Plus Jakarta Sans" w:eastAsia="Plus Jakarta Sans" w:hAnsi="Plus Jakarta Sans"/>
+                <w:b/>
+                <w:bCs/>
+                <w:color w:val="5C6A94"/>
+                <w:sz w:val="16"/>
+                <w:szCs w:val="16"/>
+              </w:rPr>
+              <w:t xml:space="preserve">Plates</w:t>
+            </w:r>
+          </w:p>
+        </w:tc>
+      </w:tr>
+    </w:tbl>
+    <w:p>
+      <w:pPr>
+        <w:pStyle w:val="Heading2"/>
+        <w:spacing w:after="80" w:before="200"/>
+      </w:pPr>
+      <w:r>
+        <w:rPr>
+          <w:rFonts w:ascii="Plus Jakarta Sans" w:cs="Plus Jakarta Sans" w:eastAsia="Plus Jakarta Sans" w:hAnsi="Plus Jakarta Sans"/>
+          <w:b/>
+          <w:bCs/>
+          <w:color w:val="0B2E63"/>
+          <w:sz w:val="26"/>
+          <w:szCs w:val="26"/>
+        </w:rPr>
+        <w:t xml:space="preserve">SUNU Park Officer · attendants</w:t>
+      </w:r>
+    </w:p>
+    <w:tbl>
+      <w:tblPr>
+        <w:tblW w:type="dxa" w:w="9638"/>
+        <w:tblBorders>
+          <w:top w:val="single" w:color="auto" w:sz="4"/>
+          <w:left w:val="single" w:color="auto" w:sz="4"/>
+          <w:bottom w:val="single" w:color="auto" w:sz="4"/>
+          <w:right w:val="single" w:color="auto" w:sz="4"/>
+          <w:insideH w:val="single" w:color="auto" w:sz="4"/>
+          <w:insideV w:val="single" w:color="auto" w:sz="4"/>
+        </w:tblBorders>
+      </w:tblPr>
+      <w:tblGrid>
+        <w:gridCol w:w="2409"/>
+        <w:gridCol w:w="2409"/>
+        <w:gridCol w:w="2409"/>
+        <w:gridCol w:w="2409"/>
+      </w:tblGrid>
+      <w:tr>
+        <w:tc>
+          <w:tcPr>
+            <w:tcW w:type="dxa" w:w="2409"/>
+            <w:tcBorders>
+              <w:top w:val="none" w:color="FFFFFF" w:sz="0"/>
+              <w:left w:val="none" w:color="FFFFFF" w:sz="0"/>
+              <w:bottom w:val="none" w:color="FFFFFF" w:sz="0"/>
+              <w:right w:val="none" w:color="FFFFFF" w:sz="0"/>
+            </w:tcBorders>
+            <w:tcMar>
+              <w:left w:type="dxa" w:w="60"/>
+              <w:right w:type="dxa" w:w="60"/>
+            </w:tcMar>
+          </w:tcPr>
+          <w:p>
+            <w:pPr>
+              <w:jc w:val="center"/>
+            </w:pPr>
+            <w:r>
+              <w:drawing>
+                <wp:inline distT="0" distB="0" distL="0" distR="0">
+                  <wp:extent cx="1333500" cy="2371725"/>
+                  <wp:effectExtent t="0" r="0" b="0" l="0"/>
+                  <wp:docPr id="12" name="" descr="" title=""/>
+                  <wp:cNvGraphicFramePr>
+                    <a:graphicFrameLocks xmlns:a="http://schemas.openxmlformats.org/drawingml/2006/main" noChangeAspect="1"/>
+                  </wp:cNvGraphicFramePr>
+                  <a:graphic xmlns:a="http://schemas.openxmlformats.org/drawingml/2006/main">
+                    <a:graphicData uri="http://schemas.openxmlformats.org/drawingml/2006/picture">
+                      <pic:pic xmlns:pic="http://schemas.openxmlformats.org/drawingml/2006/picture">
+                        <pic:nvPicPr>
+                          <pic:cNvPr id="0" name="" descr=""/>
+                          <pic:cNvPicPr>
+                            <a:picLocks noChangeAspect="1" noChangeArrowheads="1"/>
+                          </pic:cNvPicPr>
+                        </pic:nvPicPr>
+                        <pic:blipFill>
+                          <a:blip r:embed="rId20" cstate="none"/>
+                          <a:srcRect/>
+                          <a:stretch>
+                            <a:fillRect/>
+                          </a:stretch>
+                        </pic:blipFill>
+                        <pic:spPr bwMode="auto">
+                          <a:xfrm>
+                            <a:off x="0" y="0"/>
+                            <a:ext cx="1333500" cy="2371725"/>
+                          </a:xfrm>
+                          <a:prstGeom prst="rect">
+                            <a:avLst/>
+                          </a:prstGeom>
+                        </pic:spPr>
+                      </pic:pic>
+                    </a:graphicData>
+                  </a:graphic>
+                </wp:inline>
+              </w:drawing>
+            </w:r>
+          </w:p>
+          <w:p>
+            <w:pPr>
+              <w:spacing w:after="120"/>
+              <w:jc w:val="center"/>
+            </w:pPr>
+            <w:r>
+              <w:rPr>
+                <w:rFonts w:ascii="Plus Jakarta Sans" w:cs="Plus Jakarta Sans" w:eastAsia="Plus Jakarta Sans" w:hAnsi="Plus Jakarta Sans"/>
+                <w:b/>
+                <w:bCs/>
+                <w:color w:val="5C6A94"/>
+                <w:sz w:val="16"/>
+                <w:szCs w:val="16"/>
+              </w:rPr>
+              <w:t xml:space="preserve">On shift</w:t>
+            </w:r>
+          </w:p>
+        </w:tc>
+        <w:tc>
+          <w:tcPr>
+            <w:tcW w:type="dxa" w:w="2409"/>
+            <w:tcBorders>
+              <w:top w:val="none" w:color="FFFFFF" w:sz="0"/>
+              <w:left w:val="none" w:color="FFFFFF" w:sz="0"/>
+              <w:bottom w:val="none" w:color="FFFFFF" w:sz="0"/>
+              <w:right w:val="none" w:color="FFFFFF" w:sz="0"/>
+            </w:tcBorders>
+            <w:tcMar>
+              <w:left w:type="dxa" w:w="60"/>
+              <w:right w:type="dxa" w:w="60"/>
+            </w:tcMar>
+          </w:tcPr>
+          <w:p>
+            <w:pPr>
+              <w:jc w:val="center"/>
+            </w:pPr>
+            <w:r>
+              <w:drawing>
+                <wp:inline distT="0" distB="0" distL="0" distR="0">
+                  <wp:extent cx="1333500" cy="2371725"/>
+                  <wp:effectExtent t="0" r="0" b="0" l="0"/>
+                  <wp:docPr id="13" name="" descr="" title=""/>
+                  <wp:cNvGraphicFramePr>
+                    <a:graphicFrameLocks xmlns:a="http://schemas.openxmlformats.org/drawingml/2006/main" noChangeAspect="1"/>
+                  </wp:cNvGraphicFramePr>
+                  <a:graphic xmlns:a="http://schemas.openxmlformats.org/drawingml/2006/main">
+                    <a:graphicData uri="http://schemas.openxmlformats.org/drawingml/2006/picture">
+                      <pic:pic xmlns:pic="http://schemas.openxmlformats.org/drawingml/2006/picture">
+                        <pic:nvPicPr>
+                          <pic:cNvPr id="0" name="" descr=""/>
+                          <pic:cNvPicPr>
+                            <a:picLocks noChangeAspect="1" noChangeArrowheads="1"/>
+                          </pic:cNvPicPr>
+                        </pic:nvPicPr>
+                        <pic:blipFill>
+                          <a:blip r:embed="rId21" cstate="none"/>
+                          <a:srcRect/>
+                          <a:stretch>
+                            <a:fillRect/>
+                          </a:stretch>
+                        </pic:blipFill>
+                        <pic:spPr bwMode="auto">
+                          <a:xfrm>
+                            <a:off x="0" y="0"/>
+                            <a:ext cx="1333500" cy="2371725"/>
+                          </a:xfrm>
+                          <a:prstGeom prst="rect">
+                            <a:avLst/>
+                          </a:prstGeom>
+                        </pic:spPr>
+                      </pic:pic>
+                    </a:graphicData>
+                  </a:graphic>
+                </wp:inline>
+              </w:drawing>
+            </w:r>
+          </w:p>
+          <w:p>
+            <w:pPr>
+              <w:spacing w:after="120"/>
+              <w:jc w:val="center"/>
+            </w:pPr>
+            <w:r>
+              <w:rPr>
+                <w:rFonts w:ascii="Plus Jakarta Sans" w:cs="Plus Jakarta Sans" w:eastAsia="Plus Jakarta Sans" w:hAnsi="Plus Jakarta Sans"/>
+                <w:b/>
+                <w:bCs/>
+                <w:color w:val="5C6A94"/>
+                <w:sz w:val="16"/>
+                <w:szCs w:val="16"/>
+              </w:rPr>
+              <w:t xml:space="preserve">Check · PAID</w:t>
+            </w:r>
+          </w:p>
+        </w:tc>
+        <w:tc>
+          <w:tcPr>
+            <w:tcW w:type="dxa" w:w="2409"/>
+            <w:tcBorders>
+              <w:top w:val="none" w:color="FFFFFF" w:sz="0"/>
+              <w:left w:val="none" w:color="FFFFFF" w:sz="0"/>
+              <w:bottom w:val="none" w:color="FFFFFF" w:sz="0"/>
+              <w:right w:val="none" w:color="FFFFFF" w:sz="0"/>
+            </w:tcBorders>
+            <w:tcMar>
+              <w:left w:type="dxa" w:w="60"/>
+              <w:right w:type="dxa" w:w="60"/>
+            </w:tcMar>
+          </w:tcPr>
+          <w:p>
+            <w:pPr>
+              <w:jc w:val="center"/>
+            </w:pPr>
+            <w:r>
+              <w:drawing>
+                <wp:inline distT="0" distB="0" distL="0" distR="0">
+                  <wp:extent cx="1333500" cy="2371725"/>
+                  <wp:effectExtent t="0" r="0" b="0" l="0"/>
+                  <wp:docPr id="14" name="" descr="" title=""/>
+                  <wp:cNvGraphicFramePr>
+                    <a:graphicFrameLocks xmlns:a="http://schemas.openxmlformats.org/drawingml/2006/main" noChangeAspect="1"/>
+                  </wp:cNvGraphicFramePr>
+                  <a:graphic xmlns:a="http://schemas.openxmlformats.org/drawingml/2006/main">
+                    <a:graphicData uri="http://schemas.openxmlformats.org/drawingml/2006/picture">
+                      <pic:pic xmlns:pic="http://schemas.openxmlformats.org/drawingml/2006/picture">
+                        <pic:nvPicPr>
+                          <pic:cNvPr id="0" name="" descr=""/>
+                          <pic:cNvPicPr>
+                            <a:picLocks noChangeAspect="1" noChangeArrowheads="1"/>
+                          </pic:cNvPicPr>
+                        </pic:nvPicPr>
+                        <pic:blipFill>
+                          <a:blip r:embed="rId22" cstate="none"/>
+                          <a:srcRect/>
+                          <a:stretch>
+                            <a:fillRect/>
+                          </a:stretch>
+                        </pic:blipFill>
+                        <pic:spPr bwMode="auto">
+                          <a:xfrm>
+                            <a:off x="0" y="0"/>
+                            <a:ext cx="1333500" cy="2371725"/>
+                          </a:xfrm>
+                          <a:prstGeom prst="rect">
+                            <a:avLst/>
+                          </a:prstGeom>
+                        </pic:spPr>
+                      </pic:pic>
+                    </a:graphicData>
+                  </a:graphic>
+                </wp:inline>
+              </w:drawing>
+            </w:r>
+          </w:p>
+          <w:p>
+            <w:pPr>
+              <w:spacing w:after="120"/>
+              <w:jc w:val="center"/>
+            </w:pPr>
+            <w:r>
+              <w:rPr>
+                <w:rFonts w:ascii="Plus Jakarta Sans" w:cs="Plus Jakarta Sans" w:eastAsia="Plus Jakarta Sans" w:hAnsi="Plus Jakarta Sans"/>
+                <w:b/>
+                <w:bCs/>
+                <w:color w:val="5C6A94"/>
+                <w:sz w:val="16"/>
+                <w:szCs w:val="16"/>
+              </w:rPr>
+              <w:t xml:space="preserve">Check · NOT PAID</w:t>
+            </w:r>
+          </w:p>
+        </w:tc>
+        <w:tc>
+          <w:tcPr>
+            <w:tcW w:type="dxa" w:w="2409"/>
+            <w:tcBorders>
+              <w:top w:val="none" w:color="FFFFFF" w:sz="0"/>
+              <w:left w:val="none" w:color="FFFFFF" w:sz="0"/>
+              <w:bottom w:val="none" w:color="FFFFFF" w:sz="0"/>
+              <w:right w:val="none" w:color="FFFFFF" w:sz="0"/>
+            </w:tcBorders>
+            <w:tcMar>
+              <w:left w:type="dxa" w:w="60"/>
+              <w:right w:type="dxa" w:w="60"/>
+            </w:tcMar>
+          </w:tcPr>
+          <w:p>
+            <w:pPr>
+              <w:jc w:val="center"/>
+            </w:pPr>
+            <w:r>
+              <w:drawing>
+                <wp:inline distT="0" distB="0" distL="0" distR="0">
+                  <wp:extent cx="1333500" cy="2371725"/>
+                  <wp:effectExtent t="0" r="0" b="0" l="0"/>
+                  <wp:docPr id="15" name="" descr="" title=""/>
+                  <wp:cNvGraphicFramePr>
+                    <a:graphicFrameLocks xmlns:a="http://schemas.openxmlformats.org/drawingml/2006/main" noChangeAspect="1"/>
+                  </wp:cNvGraphicFramePr>
+                  <a:graphic xmlns:a="http://schemas.openxmlformats.org/drawingml/2006/main">
+                    <a:graphicData uri="http://schemas.openxmlformats.org/drawingml/2006/picture">
+                      <pic:pic xmlns:pic="http://schemas.openxmlformats.org/drawingml/2006/picture">
+                        <pic:nvPicPr>
+                          <pic:cNvPr id="0" name="" descr=""/>
+                          <pic:cNvPicPr>
+                            <a:picLocks noChangeAspect="1" noChangeArrowheads="1"/>
+                          </pic:cNvPicPr>
+                        </pic:nvPicPr>
+                        <pic:blipFill>
+                          <a:blip r:embed="rId23" cstate="none"/>
+                          <a:srcRect/>
+                          <a:stretch>
+                            <a:fillRect/>
+                          </a:stretch>
+                        </pic:blipFill>
+                        <pic:spPr bwMode="auto">
+                          <a:xfrm>
+                            <a:off x="0" y="0"/>
+                            <a:ext cx="1333500" cy="2371725"/>
+                          </a:xfrm>
+                          <a:prstGeom prst="rect">
+                            <a:avLst/>
+                          </a:prstGeom>
+                        </pic:spPr>
+                      </pic:pic>
+                    </a:graphicData>
+                  </a:graphic>
+                </wp:inline>
+              </w:drawing>
+            </w:r>
+          </w:p>
+          <w:p>
+            <w:pPr>
+              <w:spacing w:after="120"/>
+              <w:jc w:val="center"/>
+            </w:pPr>
+            <w:r>
+              <w:rPr>
+                <w:rFonts w:ascii="Plus Jakarta Sans" w:cs="Plus Jakarta Sans" w:eastAsia="Plus Jakarta Sans" w:hAnsi="Plus Jakarta Sans"/>
+                <w:b/>
+                <w:bCs/>
+                <w:color w:val="5C6A94"/>
+                <w:sz w:val="16"/>
+                <w:szCs w:val="16"/>
+              </w:rPr>
+              <w:t xml:space="preserve">Today's checks</w:t>
+            </w:r>
+          </w:p>
+        </w:tc>
+      </w:tr>
+    </w:tbl>
     <w:sectPr>
       <w:headerReference w:type="default" r:id="rId6"/>
       <w:footerReference w:type="default" r:id="rId7"/>
@@ -9514,7 +10591,7 @@
         <wp:inline distT="0" distB="0" distL="0" distR="0">
           <wp:extent cx="781050" cy="209550"/>
           <wp:effectExtent t="0" r="0" b="0" l="0"/>
-          <wp:docPr id="4" name="" descr="" title=""/>
+          <wp:docPr id="16" name="" descr="" title=""/>
           <wp:cNvGraphicFramePr>
             <a:graphicFrameLocks xmlns:a="http://schemas.openxmlformats.org/drawingml/2006/main" noChangeAspect="1"/>
           </wp:cNvGraphicFramePr>

</xml_diff>

<commit_message>
Requirements doc: customer journeys across app, SMS, USSD and web
Two new pages: a journey matrix for every channel, real SMS and USSD
screens from the simulator, the attendant USSD menu and the org portal.

Co-Authored-By: Claude Opus 5.5 <noreply@anthropic.com>
Claude-Session: https://claude.ai/code/session_015837ouLbwrQdJqFUX8HYPx
</commit_message>
<xml_diff>
--- a/docs/SUNU-Park-Functional-Requirements.docx
+++ b/docs/SUNU-Park-Functional-Requirements.docx
@@ -256,7 +256,7 @@
       <w:pPr>
         <w:spacing w:after="60"/>
       </w:pPr>
-      <w:hyperlink w:history="1" r:id="rIdckoyyye5pc_maosy72kuc">
+      <w:hyperlink w:history="1" r:id="rIdfw-ajuuvn16lc7vez860o">
         <w:r>
           <w:rPr>
             <w:rFonts w:ascii="Plus Jakarta Sans" w:cs="Plus Jakarta Sans" w:eastAsia="Plus Jakarta Sans" w:hAnsi="Plus Jakarta Sans"/>
@@ -277,7 +277,7 @@
         </w:rPr>
         <w:t xml:space="preserve">  ·  </w:t>
       </w:r>
-      <w:hyperlink w:history="1" r:id="rId9gupaz1aqe2ofgbdhqu2p">
+      <w:hyperlink w:history="1" r:id="rIdob7pw3xpb02evwq1isacu">
         <w:r>
           <w:rPr>
             <w:rFonts w:ascii="Plus Jakarta Sans" w:cs="Plus Jakarta Sans" w:eastAsia="Plus Jakarta Sans" w:hAnsi="Plus Jakarta Sans"/>
@@ -298,7 +298,7 @@
         </w:rPr>
         <w:t xml:space="preserve">  ·  </w:t>
       </w:r>
-      <w:hyperlink w:history="1" r:id="rIdrowkrfudlbbie-e-6p2nx">
+      <w:hyperlink w:history="1" r:id="rIdjetxjsb5ug4bq-mne_4wf">
         <w:r>
           <w:rPr>
             <w:rFonts w:ascii="Plus Jakarta Sans" w:cs="Plus Jakarta Sans" w:eastAsia="Plus Jakarta Sans" w:hAnsi="Plus Jakarta Sans"/>
@@ -315,7 +315,7 @@
       <w:pPr>
         <w:spacing w:after="160"/>
       </w:pPr>
-      <w:hyperlink w:history="1" r:id="rIdulljhefqhprhdpx4h7ky5">
+      <w:hyperlink w:history="1" r:id="rIdyhvypbbxc7hvg2qgnindn">
         <w:r>
           <w:rPr>
             <w:rFonts w:ascii="Plus Jakarta Sans" w:cs="Plus Jakarta Sans" w:eastAsia="Plus Jakarta Sans" w:hAnsi="Plus Jakarta Sans"/>
@@ -336,7 +336,7 @@
         </w:rPr>
         <w:t xml:space="preserve">  ·  </w:t>
       </w:r>
-      <w:hyperlink w:history="1" r:id="rIdqnilrtggdzvsuqlsiazle">
+      <w:hyperlink w:history="1" r:id="rIdll661pcafqnjdlaoncuqb">
         <w:r>
           <w:rPr>
             <w:rFonts w:ascii="Plus Jakarta Sans" w:cs="Plus Jakarta Sans" w:eastAsia="Plus Jakarta Sans" w:hAnsi="Plus Jakarta Sans"/>
@@ -357,7 +357,7 @@
         </w:rPr>
         <w:t xml:space="preserve">  ·  </w:t>
       </w:r>
-      <w:hyperlink w:history="1" r:id="rIdp_qaqz-fmnbw2m78r8cqq">
+      <w:hyperlink w:history="1" r:id="rIdby70pbhiksa6lifhriuep">
         <w:r>
           <w:rPr>
             <w:rFonts w:ascii="Plus Jakarta Sans" w:cs="Plus Jakarta Sans" w:eastAsia="Plus Jakarta Sans" w:hAnsi="Plus Jakarta Sans"/>
@@ -391,7 +391,7 @@
       <w:pPr>
         <w:spacing w:after="60"/>
       </w:pPr>
-      <w:hyperlink w:history="1" r:id="rId5sjuyxibc10rsg1bh1lnb">
+      <w:hyperlink w:history="1" r:id="rId5scrj0-r9sg1iuqtcoadq">
         <w:r>
           <w:rPr>
             <w:rFonts w:ascii="Plus Jakarta Sans" w:cs="Plus Jakarta Sans" w:eastAsia="Plus Jakarta Sans" w:hAnsi="Plus Jakarta Sans"/>
@@ -412,7 +412,7 @@
         </w:rPr>
         <w:t xml:space="preserve">  ·  </w:t>
       </w:r>
-      <w:hyperlink w:history="1" r:id="rIdtbufnokkf-ii6xknum_hy">
+      <w:hyperlink w:history="1" r:id="rIds-dskz7nphpbyqztmreoh">
         <w:r>
           <w:rPr>
             <w:rFonts w:ascii="Plus Jakarta Sans" w:cs="Plus Jakarta Sans" w:eastAsia="Plus Jakarta Sans" w:hAnsi="Plus Jakarta Sans"/>
@@ -429,7 +429,7 @@
       <w:pPr>
         <w:spacing w:after="60"/>
       </w:pPr>
-      <w:hyperlink w:history="1" r:id="rIdsowp0_b9g5hqetcaoaqmr">
+      <w:hyperlink w:history="1" r:id="rId1zjs-wuoowqqopidn-ysn">
         <w:r>
           <w:rPr>
             <w:rFonts w:ascii="Plus Jakarta Sans" w:cs="Plus Jakarta Sans" w:eastAsia="Plus Jakarta Sans" w:hAnsi="Plus Jakarta Sans"/>
@@ -450,7 +450,7 @@
         </w:rPr>
         <w:t xml:space="preserve">  ·  </w:t>
       </w:r>
-      <w:hyperlink w:history="1" r:id="rIdfcbg-ebyvvte9fdst38xw">
+      <w:hyperlink w:history="1" r:id="rIdbkgg0jf7ruixfupxf1x0g">
         <w:r>
           <w:rPr>
             <w:rFonts w:ascii="Plus Jakarta Sans" w:cs="Plus Jakarta Sans" w:eastAsia="Plus Jakarta Sans" w:hAnsi="Plus Jakarta Sans"/>
@@ -9342,7 +9342,7 @@
         </w:rPr>
         <w:t xml:space="preserve">Code &amp; docs: </w:t>
       </w:r>
-      <w:hyperlink w:history="1" r:id="rIdpilr38gsk1lxvbq94-skc">
+      <w:hyperlink w:history="1" r:id="rIdwb5tjc3rnusudcedybe1x">
         <w:r>
           <w:rPr>
             <w:rFonts w:ascii="Plus Jakarta Sans" w:cs="Plus Jakarta Sans" w:eastAsia="Plus Jakarta Sans" w:hAnsi="Plus Jakarta Sans"/>
@@ -10441,6 +10441,2513 @@
         </w:tc>
       </w:tr>
     </w:tbl>
+    <w:p>
+      <w:r>
+        <w:br w:type="page"/>
+      </w:r>
+    </w:p>
+    <w:p>
+      <w:pPr>
+        <w:spacing w:after="40" w:before="120"/>
+      </w:pPr>
+      <w:r>
+        <w:rPr>
+          <w:rFonts w:ascii="Plus Jakarta Sans" w:cs="Plus Jakarta Sans" w:eastAsia="Plus Jakarta Sans" w:hAnsi="Plus Jakarta Sans"/>
+          <w:b/>
+          <w:bCs/>
+          <w:color w:val="035BF0"/>
+          <w:spacing w:val="40"/>
+          <w:sz w:val="16"/>
+          <w:szCs w:val="16"/>
+        </w:rPr>
+        <w:t xml:space="preserve">10 — CUSTOMER JOURNEYS ACROSS EVERY CHANNEL</w:t>
+      </w:r>
+    </w:p>
+    <w:p>
+      <w:pPr>
+        <w:pStyle w:val="Heading1"/>
+        <w:spacing w:after="120"/>
+      </w:pPr>
+      <w:r>
+        <w:rPr>
+          <w:rFonts w:ascii="Plus Jakarta Sans" w:cs="Plus Jakarta Sans" w:eastAsia="Plus Jakarta Sans" w:hAnsi="Plus Jakarta Sans"/>
+          <w:b/>
+          <w:bCs/>
+          <w:color w:val="0A1B4D"/>
+          <w:sz w:val="40"/>
+          <w:szCs w:val="40"/>
+        </w:rPr>
+        <w:t xml:space="preserve">One service, four ways in</w:t>
+      </w:r>
+    </w:p>
+    <w:p>
+      <w:pPr>
+        <w:spacing w:after="100" w:line="280"/>
+      </w:pPr>
+      <w:r>
+        <w:rPr>
+          <w:rFonts w:ascii="Plus Jakarta Sans" w:cs="Plus Jakarta Sans" w:eastAsia="Plus Jakarta Sans" w:hAnsi="Plus Jakarta Sans"/>
+          <w:color w:val="5C6A94"/>
+          <w:sz w:val="20"/>
+          <w:szCs w:val="20"/>
+        </w:rPr>
+        <w:t xml:space="preserve">Every journey runs on the same rules engine, so a pass bought by SMS shows in the app, the attendant check and the Council report. Screens below are real replies from the demo server.</w:t>
+      </w:r>
+    </w:p>
+    <w:tbl>
+      <w:tblPr>
+        <w:tblW w:type="dxa" w:w="9638"/>
+        <w:tblBorders>
+          <w:top w:val="single" w:color="auto" w:sz="4"/>
+          <w:left w:val="single" w:color="auto" w:sz="4"/>
+          <w:bottom w:val="single" w:color="auto" w:sz="4"/>
+          <w:right w:val="single" w:color="auto" w:sz="4"/>
+          <w:insideH w:val="single" w:color="auto" w:sz="4"/>
+          <w:insideV w:val="single" w:color="auto" w:sz="4"/>
+        </w:tblBorders>
+      </w:tblPr>
+      <w:tblGrid>
+        <w:gridCol w:w="2050"/>
+        <w:gridCol w:w="1650"/>
+        <w:gridCol w:w="2150"/>
+        <w:gridCol w:w="1700"/>
+        <w:gridCol w:w="2088"/>
+      </w:tblGrid>
+      <w:tr>
+        <w:trPr>
+          <w:tblHeader/>
+        </w:trPr>
+        <w:tc>
+          <w:tcPr>
+            <w:tcW w:type="dxa" w:w="2050"/>
+            <w:tcBorders>
+              <w:top w:val="single" w:color="E3EAF3" w:sz="4"/>
+              <w:left w:val="single" w:color="E3EAF3" w:sz="4"/>
+              <w:bottom w:val="single" w:color="E3EAF3" w:sz="4"/>
+              <w:right w:val="single" w:color="E3EAF3" w:sz="4"/>
+            </w:tcBorders>
+            <w:shd w:fill="F6FBFE" w:color="auto" w:val="clear"/>
+            <w:tcMar>
+              <w:top w:type="dxa" w:w="70"/>
+              <w:left w:type="dxa" w:w="110"/>
+              <w:bottom w:type="dxa" w:w="70"/>
+              <w:right w:type="dxa" w:w="110"/>
+            </w:tcMar>
+            <w:vAlign w:val="top"/>
+          </w:tcPr>
+          <w:p>
+            <w:r>
+              <w:rPr>
+                <w:rFonts w:ascii="Plus Jakarta Sans" w:cs="Plus Jakarta Sans" w:eastAsia="Plus Jakarta Sans" w:hAnsi="Plus Jakarta Sans"/>
+                <w:b/>
+                <w:bCs/>
+                <w:color w:val="0B2E63"/>
+                <w:spacing w:val="20"/>
+                <w:sz w:val="15"/>
+                <w:szCs w:val="15"/>
+              </w:rPr>
+              <w:t xml:space="preserve">JOURNEY</w:t>
+            </w:r>
+          </w:p>
+        </w:tc>
+        <w:tc>
+          <w:tcPr>
+            <w:tcW w:type="dxa" w:w="1650"/>
+            <w:tcBorders>
+              <w:top w:val="single" w:color="E3EAF3" w:sz="4"/>
+              <w:left w:val="single" w:color="E3EAF3" w:sz="4"/>
+              <w:bottom w:val="single" w:color="E3EAF3" w:sz="4"/>
+              <w:right w:val="single" w:color="E3EAF3" w:sz="4"/>
+            </w:tcBorders>
+            <w:shd w:fill="F6FBFE" w:color="auto" w:val="clear"/>
+            <w:tcMar>
+              <w:top w:type="dxa" w:w="70"/>
+              <w:left w:type="dxa" w:w="110"/>
+              <w:bottom w:type="dxa" w:w="70"/>
+              <w:right w:type="dxa" w:w="110"/>
+            </w:tcMar>
+            <w:vAlign w:val="top"/>
+          </w:tcPr>
+          <w:p>
+            <w:r>
+              <w:rPr>
+                <w:rFonts w:ascii="Plus Jakarta Sans" w:cs="Plus Jakarta Sans" w:eastAsia="Plus Jakarta Sans" w:hAnsi="Plus Jakarta Sans"/>
+                <w:b/>
+                <w:bCs/>
+                <w:color w:val="0B2E63"/>
+                <w:spacing w:val="20"/>
+                <w:sz w:val="15"/>
+                <w:szCs w:val="15"/>
+              </w:rPr>
+              <w:t xml:space="preserve">APP</w:t>
+            </w:r>
+          </w:p>
+        </w:tc>
+        <w:tc>
+          <w:tcPr>
+            <w:tcW w:type="dxa" w:w="2150"/>
+            <w:tcBorders>
+              <w:top w:val="single" w:color="E3EAF3" w:sz="4"/>
+              <w:left w:val="single" w:color="E3EAF3" w:sz="4"/>
+              <w:bottom w:val="single" w:color="E3EAF3" w:sz="4"/>
+              <w:right w:val="single" w:color="E3EAF3" w:sz="4"/>
+            </w:tcBorders>
+            <w:shd w:fill="F6FBFE" w:color="auto" w:val="clear"/>
+            <w:tcMar>
+              <w:top w:type="dxa" w:w="70"/>
+              <w:left w:type="dxa" w:w="110"/>
+              <w:bottom w:type="dxa" w:w="70"/>
+              <w:right w:type="dxa" w:w="110"/>
+            </w:tcMar>
+            <w:vAlign w:val="top"/>
+          </w:tcPr>
+          <w:p>
+            <w:r>
+              <w:rPr>
+                <w:rFonts w:ascii="Plus Jakarta Sans" w:cs="Plus Jakarta Sans" w:eastAsia="Plus Jakarta Sans" w:hAnsi="Plus Jakarta Sans"/>
+                <w:b/>
+                <w:bCs/>
+                <w:color w:val="0B2E63"/>
+                <w:spacing w:val="20"/>
+                <w:sz w:val="15"/>
+                <w:szCs w:val="15"/>
+              </w:rPr>
+              <w:t xml:space="preserve">SMS 7275</w:t>
+            </w:r>
+          </w:p>
+        </w:tc>
+        <w:tc>
+          <w:tcPr>
+            <w:tcW w:type="dxa" w:w="1700"/>
+            <w:tcBorders>
+              <w:top w:val="single" w:color="E3EAF3" w:sz="4"/>
+              <w:left w:val="single" w:color="E3EAF3" w:sz="4"/>
+              <w:bottom w:val="single" w:color="E3EAF3" w:sz="4"/>
+              <w:right w:val="single" w:color="E3EAF3" w:sz="4"/>
+            </w:tcBorders>
+            <w:shd w:fill="F6FBFE" w:color="auto" w:val="clear"/>
+            <w:tcMar>
+              <w:top w:type="dxa" w:w="70"/>
+              <w:left w:type="dxa" w:w="110"/>
+              <w:bottom w:type="dxa" w:w="70"/>
+              <w:right w:type="dxa" w:w="110"/>
+            </w:tcMar>
+            <w:vAlign w:val="top"/>
+          </w:tcPr>
+          <w:p>
+            <w:r>
+              <w:rPr>
+                <w:rFonts w:ascii="Plus Jakarta Sans" w:cs="Plus Jakarta Sans" w:eastAsia="Plus Jakarta Sans" w:hAnsi="Plus Jakarta Sans"/>
+                <w:b/>
+                <w:bCs/>
+                <w:color w:val="0B2E63"/>
+                <w:spacing w:val="20"/>
+                <w:sz w:val="15"/>
+                <w:szCs w:val="15"/>
+              </w:rPr>
+              <w:t xml:space="preserve">USSD *7275#</w:t>
+            </w:r>
+          </w:p>
+        </w:tc>
+        <w:tc>
+          <w:tcPr>
+            <w:tcW w:type="dxa" w:w="2088"/>
+            <w:tcBorders>
+              <w:top w:val="single" w:color="E3EAF3" w:sz="4"/>
+              <w:left w:val="single" w:color="E3EAF3" w:sz="4"/>
+              <w:bottom w:val="single" w:color="E3EAF3" w:sz="4"/>
+              <w:right w:val="single" w:color="E3EAF3" w:sz="4"/>
+            </w:tcBorders>
+            <w:shd w:fill="F6FBFE" w:color="auto" w:val="clear"/>
+            <w:tcMar>
+              <w:top w:type="dxa" w:w="70"/>
+              <w:left w:type="dxa" w:w="110"/>
+              <w:bottom w:type="dxa" w:w="70"/>
+              <w:right w:type="dxa" w:w="110"/>
+            </w:tcMar>
+            <w:vAlign w:val="top"/>
+          </w:tcPr>
+          <w:p>
+            <w:r>
+              <w:rPr>
+                <w:rFonts w:ascii="Plus Jakarta Sans" w:cs="Plus Jakarta Sans" w:eastAsia="Plus Jakarta Sans" w:hAnsi="Plus Jakarta Sans"/>
+                <w:b/>
+                <w:bCs/>
+                <w:color w:val="0B2E63"/>
+                <w:spacing w:val="20"/>
+                <w:sz w:val="15"/>
+                <w:szCs w:val="15"/>
+              </w:rPr>
+              <w:t xml:space="preserve">WEB</w:t>
+            </w:r>
+          </w:p>
+        </w:tc>
+      </w:tr>
+      <w:tr>
+        <w:tc>
+          <w:tcPr>
+            <w:tcW w:type="dxa" w:w="2050"/>
+            <w:tcBorders>
+              <w:top w:val="single" w:color="E3EAF3" w:sz="4"/>
+              <w:left w:val="single" w:color="E3EAF3" w:sz="4"/>
+              <w:bottom w:val="single" w:color="E3EAF3" w:sz="4"/>
+              <w:right w:val="single" w:color="E3EAF3" w:sz="4"/>
+            </w:tcBorders>
+            <w:shd w:fill="FFFFFF" w:color="auto" w:val="clear"/>
+            <w:tcMar>
+              <w:top w:type="dxa" w:w="70"/>
+              <w:left w:type="dxa" w:w="110"/>
+              <w:bottom w:type="dxa" w:w="70"/>
+              <w:right w:type="dxa" w:w="110"/>
+            </w:tcMar>
+            <w:vAlign w:val="top"/>
+          </w:tcPr>
+          <w:p>
+            <w:pPr>
+              <w:spacing w:line="260"/>
+            </w:pPr>
+            <w:r>
+              <w:rPr>
+                <w:rFonts w:ascii="Plus Jakarta Sans" w:cs="Plus Jakarta Sans" w:eastAsia="Plus Jakarta Sans" w:hAnsi="Plus Jakarta Sans"/>
+                <w:b/>
+                <w:bCs/>
+                <w:color w:val="0A1B4D"/>
+                <w:sz w:val="18"/>
+                <w:szCs w:val="18"/>
+              </w:rPr>
+              <w:t xml:space="preserve">Pay a daily pass</w:t>
+            </w:r>
+          </w:p>
+        </w:tc>
+        <w:tc>
+          <w:tcPr>
+            <w:tcW w:type="dxa" w:w="1650"/>
+            <w:tcBorders>
+              <w:top w:val="single" w:color="E3EAF3" w:sz="4"/>
+              <w:left w:val="single" w:color="E3EAF3" w:sz="4"/>
+              <w:bottom w:val="single" w:color="E3EAF3" w:sz="4"/>
+              <w:right w:val="single" w:color="E3EAF3" w:sz="4"/>
+            </w:tcBorders>
+            <w:shd w:fill="FFFFFF" w:color="auto" w:val="clear"/>
+            <w:tcMar>
+              <w:top w:type="dxa" w:w="70"/>
+              <w:left w:type="dxa" w:w="110"/>
+              <w:bottom w:type="dxa" w:w="70"/>
+              <w:right w:type="dxa" w:w="110"/>
+            </w:tcMar>
+            <w:vAlign w:val="top"/>
+          </w:tcPr>
+          <w:p>
+            <w:pPr>
+              <w:spacing w:line="260"/>
+            </w:pPr>
+            <w:r>
+              <w:rPr>
+                <w:rFonts w:ascii="Plus Jakarta Sans" w:cs="Plus Jakarta Sans" w:eastAsia="Plus Jakarta Sans" w:hAnsi="Plus Jakarta Sans"/>
+                <w:color w:val="0A1B4D"/>
+                <w:sz w:val="18"/>
+                <w:szCs w:val="18"/>
+              </w:rPr>
+              <w:t xml:space="preserve">Pay sheet</w:t>
+            </w:r>
+          </w:p>
+        </w:tc>
+        <w:tc>
+          <w:tcPr>
+            <w:tcW w:type="dxa" w:w="2150"/>
+            <w:tcBorders>
+              <w:top w:val="single" w:color="E3EAF3" w:sz="4"/>
+              <w:left w:val="single" w:color="E3EAF3" w:sz="4"/>
+              <w:bottom w:val="single" w:color="E3EAF3" w:sz="4"/>
+              <w:right w:val="single" w:color="E3EAF3" w:sz="4"/>
+            </w:tcBorders>
+            <w:shd w:fill="FFFFFF" w:color="auto" w:val="clear"/>
+            <w:tcMar>
+              <w:top w:type="dxa" w:w="70"/>
+              <w:left w:type="dxa" w:w="110"/>
+              <w:bottom w:type="dxa" w:w="70"/>
+              <w:right w:type="dxa" w:w="110"/>
+            </w:tcMar>
+            <w:vAlign w:val="top"/>
+          </w:tcPr>
+          <w:p>
+            <w:pPr>
+              <w:spacing w:line="260"/>
+            </w:pPr>
+            <w:r>
+              <w:rPr>
+                <w:rFonts w:ascii="Plus Jakarta Sans" w:cs="Plus Jakarta Sans" w:eastAsia="Plus Jakarta Sans" w:hAnsi="Plus Jakarta Sans"/>
+                <w:color w:val="0A1B4D"/>
+                <w:sz w:val="18"/>
+                <w:szCs w:val="18"/>
+              </w:rPr>
+              <w:t xml:space="preserve">Text the plate → reply 1–4</w:t>
+            </w:r>
+          </w:p>
+        </w:tc>
+        <w:tc>
+          <w:tcPr>
+            <w:tcW w:type="dxa" w:w="1700"/>
+            <w:tcBorders>
+              <w:top w:val="single" w:color="E3EAF3" w:sz="4"/>
+              <w:left w:val="single" w:color="E3EAF3" w:sz="4"/>
+              <w:bottom w:val="single" w:color="E3EAF3" w:sz="4"/>
+              <w:right w:val="single" w:color="E3EAF3" w:sz="4"/>
+            </w:tcBorders>
+            <w:shd w:fill="FFFFFF" w:color="auto" w:val="clear"/>
+            <w:tcMar>
+              <w:top w:type="dxa" w:w="70"/>
+              <w:left w:type="dxa" w:w="110"/>
+              <w:bottom w:type="dxa" w:w="70"/>
+              <w:right w:type="dxa" w:w="110"/>
+            </w:tcMar>
+            <w:vAlign w:val="top"/>
+          </w:tcPr>
+          <w:p>
+            <w:pPr>
+              <w:spacing w:line="260"/>
+            </w:pPr>
+            <w:r>
+              <w:rPr>
+                <w:rFonts w:ascii="Plus Jakarta Sans" w:cs="Plus Jakarta Sans" w:eastAsia="Plus Jakarta Sans" w:hAnsi="Plus Jakarta Sans"/>
+                <w:color w:val="0A1B4D"/>
+                <w:sz w:val="18"/>
+                <w:szCs w:val="18"/>
+              </w:rPr>
+              <w:t xml:space="preserve">1 Daily pass</w:t>
+            </w:r>
+          </w:p>
+        </w:tc>
+        <w:tc>
+          <w:tcPr>
+            <w:tcW w:type="dxa" w:w="2088"/>
+            <w:tcBorders>
+              <w:top w:val="single" w:color="E3EAF3" w:sz="4"/>
+              <w:left w:val="single" w:color="E3EAF3" w:sz="4"/>
+              <w:bottom w:val="single" w:color="E3EAF3" w:sz="4"/>
+              <w:right w:val="single" w:color="E3EAF3" w:sz="4"/>
+            </w:tcBorders>
+            <w:shd w:fill="FFFFFF" w:color="auto" w:val="clear"/>
+            <w:tcMar>
+              <w:top w:type="dxa" w:w="70"/>
+              <w:left w:type="dxa" w:w="110"/>
+              <w:bottom w:type="dxa" w:w="70"/>
+              <w:right w:type="dxa" w:w="110"/>
+            </w:tcMar>
+            <w:vAlign w:val="top"/>
+          </w:tcPr>
+          <w:p>
+            <w:pPr>
+              <w:spacing w:line="260"/>
+            </w:pPr>
+            <w:r>
+              <w:rPr>
+                <w:rFonts w:ascii="Plus Jakarta Sans" w:cs="Plus Jakarta Sans" w:eastAsia="Plus Jakarta Sans" w:hAnsi="Plus Jakarta Sans"/>
+                <w:color w:val="0A1B4D"/>
+                <w:sz w:val="18"/>
+                <w:szCs w:val="18"/>
+              </w:rPr>
+              <w:t xml:space="preserve">—</w:t>
+            </w:r>
+          </w:p>
+        </w:tc>
+      </w:tr>
+      <w:tr>
+        <w:tc>
+          <w:tcPr>
+            <w:tcW w:type="dxa" w:w="2050"/>
+            <w:tcBorders>
+              <w:top w:val="single" w:color="E3EAF3" w:sz="4"/>
+              <w:left w:val="single" w:color="E3EAF3" w:sz="4"/>
+              <w:bottom w:val="single" w:color="E3EAF3" w:sz="4"/>
+              <w:right w:val="single" w:color="E3EAF3" w:sz="4"/>
+            </w:tcBorders>
+            <w:shd w:fill="FFFFFF" w:color="auto" w:val="clear"/>
+            <w:tcMar>
+              <w:top w:type="dxa" w:w="70"/>
+              <w:left w:type="dxa" w:w="110"/>
+              <w:bottom w:type="dxa" w:w="70"/>
+              <w:right w:type="dxa" w:w="110"/>
+            </w:tcMar>
+            <w:vAlign w:val="top"/>
+          </w:tcPr>
+          <w:p>
+            <w:pPr>
+              <w:spacing w:line="260"/>
+            </w:pPr>
+            <w:r>
+              <w:rPr>
+                <w:rFonts w:ascii="Plus Jakarta Sans" w:cs="Plus Jakarta Sans" w:eastAsia="Plus Jakarta Sans" w:hAnsi="Plus Jakarta Sans"/>
+                <w:b/>
+                <w:bCs/>
+                <w:color w:val="0A1B4D"/>
+                <w:sz w:val="18"/>
+                <w:szCs w:val="18"/>
+              </w:rPr>
+              <w:t xml:space="preserve">Buy a monthly pass</w:t>
+            </w:r>
+          </w:p>
+        </w:tc>
+        <w:tc>
+          <w:tcPr>
+            <w:tcW w:type="dxa" w:w="1650"/>
+            <w:tcBorders>
+              <w:top w:val="single" w:color="E3EAF3" w:sz="4"/>
+              <w:left w:val="single" w:color="E3EAF3" w:sz="4"/>
+              <w:bottom w:val="single" w:color="E3EAF3" w:sz="4"/>
+              <w:right w:val="single" w:color="E3EAF3" w:sz="4"/>
+            </w:tcBorders>
+            <w:shd w:fill="FFFFFF" w:color="auto" w:val="clear"/>
+            <w:tcMar>
+              <w:top w:type="dxa" w:w="70"/>
+              <w:left w:type="dxa" w:w="110"/>
+              <w:bottom w:type="dxa" w:w="70"/>
+              <w:right w:type="dxa" w:w="110"/>
+            </w:tcMar>
+            <w:vAlign w:val="top"/>
+          </w:tcPr>
+          <w:p>
+            <w:pPr>
+              <w:spacing w:line="260"/>
+            </w:pPr>
+            <w:r>
+              <w:rPr>
+                <w:rFonts w:ascii="Plus Jakarta Sans" w:cs="Plus Jakarta Sans" w:eastAsia="Plus Jakarta Sans" w:hAnsi="Plus Jakarta Sans"/>
+                <w:color w:val="0A1B4D"/>
+                <w:sz w:val="18"/>
+                <w:szCs w:val="18"/>
+              </w:rPr>
+              <w:t xml:space="preserve">Monthly tab</w:t>
+            </w:r>
+          </w:p>
+        </w:tc>
+        <w:tc>
+          <w:tcPr>
+            <w:tcW w:type="dxa" w:w="2150"/>
+            <w:tcBorders>
+              <w:top w:val="single" w:color="E3EAF3" w:sz="4"/>
+              <w:left w:val="single" w:color="E3EAF3" w:sz="4"/>
+              <w:bottom w:val="single" w:color="E3EAF3" w:sz="4"/>
+              <w:right w:val="single" w:color="E3EAF3" w:sz="4"/>
+            </w:tcBorders>
+            <w:shd w:fill="FFFFFF" w:color="auto" w:val="clear"/>
+            <w:tcMar>
+              <w:top w:type="dxa" w:w="70"/>
+              <w:left w:type="dxa" w:w="110"/>
+              <w:bottom w:type="dxa" w:w="70"/>
+              <w:right w:type="dxa" w:w="110"/>
+            </w:tcMar>
+            <w:vAlign w:val="top"/>
+          </w:tcPr>
+          <w:p>
+            <w:pPr>
+              <w:spacing w:line="260"/>
+            </w:pPr>
+            <w:r>
+              <w:rPr>
+                <w:rFonts w:ascii="Plus Jakarta Sans" w:cs="Plus Jakarta Sans" w:eastAsia="Plus Jakarta Sans" w:hAnsi="Plus Jakarta Sans"/>
+                <w:color w:val="0A1B4D"/>
+                <w:sz w:val="18"/>
+                <w:szCs w:val="18"/>
+              </w:rPr>
+              <w:t xml:space="preserve">M BJL1234 → reply 1–4</w:t>
+            </w:r>
+          </w:p>
+        </w:tc>
+        <w:tc>
+          <w:tcPr>
+            <w:tcW w:type="dxa" w:w="1700"/>
+            <w:tcBorders>
+              <w:top w:val="single" w:color="E3EAF3" w:sz="4"/>
+              <w:left w:val="single" w:color="E3EAF3" w:sz="4"/>
+              <w:bottom w:val="single" w:color="E3EAF3" w:sz="4"/>
+              <w:right w:val="single" w:color="E3EAF3" w:sz="4"/>
+            </w:tcBorders>
+            <w:shd w:fill="FFFFFF" w:color="auto" w:val="clear"/>
+            <w:tcMar>
+              <w:top w:type="dxa" w:w="70"/>
+              <w:left w:type="dxa" w:w="110"/>
+              <w:bottom w:type="dxa" w:w="70"/>
+              <w:right w:type="dxa" w:w="110"/>
+            </w:tcMar>
+            <w:vAlign w:val="top"/>
+          </w:tcPr>
+          <w:p>
+            <w:pPr>
+              <w:spacing w:line="260"/>
+            </w:pPr>
+            <w:r>
+              <w:rPr>
+                <w:rFonts w:ascii="Plus Jakarta Sans" w:cs="Plus Jakarta Sans" w:eastAsia="Plus Jakarta Sans" w:hAnsi="Plus Jakarta Sans"/>
+                <w:color w:val="0A1B4D"/>
+                <w:sz w:val="18"/>
+                <w:szCs w:val="18"/>
+              </w:rPr>
+              <w:t xml:space="preserve">2 Monthly pass</w:t>
+            </w:r>
+          </w:p>
+        </w:tc>
+        <w:tc>
+          <w:tcPr>
+            <w:tcW w:type="dxa" w:w="2088"/>
+            <w:tcBorders>
+              <w:top w:val="single" w:color="E3EAF3" w:sz="4"/>
+              <w:left w:val="single" w:color="E3EAF3" w:sz="4"/>
+              <w:bottom w:val="single" w:color="E3EAF3" w:sz="4"/>
+              <w:right w:val="single" w:color="E3EAF3" w:sz="4"/>
+            </w:tcBorders>
+            <w:shd w:fill="FFFFFF" w:color="auto" w:val="clear"/>
+            <w:tcMar>
+              <w:top w:type="dxa" w:w="70"/>
+              <w:left w:type="dxa" w:w="110"/>
+              <w:bottom w:type="dxa" w:w="70"/>
+              <w:right w:type="dxa" w:w="110"/>
+            </w:tcMar>
+            <w:vAlign w:val="top"/>
+          </w:tcPr>
+          <w:p>
+            <w:pPr>
+              <w:spacing w:line="260"/>
+            </w:pPr>
+            <w:r>
+              <w:rPr>
+                <w:rFonts w:ascii="Plus Jakarta Sans" w:cs="Plus Jakarta Sans" w:eastAsia="Plus Jakarta Sans" w:hAnsi="Plus Jakarta Sans"/>
+                <w:color w:val="0A1B4D"/>
+                <w:sz w:val="18"/>
+                <w:szCs w:val="18"/>
+              </w:rPr>
+              <w:t xml:space="preserve">—</w:t>
+            </w:r>
+          </w:p>
+        </w:tc>
+      </w:tr>
+      <w:tr>
+        <w:tc>
+          <w:tcPr>
+            <w:tcW w:type="dxa" w:w="2050"/>
+            <w:tcBorders>
+              <w:top w:val="single" w:color="E3EAF3" w:sz="4"/>
+              <w:left w:val="single" w:color="E3EAF3" w:sz="4"/>
+              <w:bottom w:val="single" w:color="E3EAF3" w:sz="4"/>
+              <w:right w:val="single" w:color="E3EAF3" w:sz="4"/>
+            </w:tcBorders>
+            <w:shd w:fill="FFFFFF" w:color="auto" w:val="clear"/>
+            <w:tcMar>
+              <w:top w:type="dxa" w:w="70"/>
+              <w:left w:type="dxa" w:w="110"/>
+              <w:bottom w:type="dxa" w:w="70"/>
+              <w:right w:type="dxa" w:w="110"/>
+            </w:tcMar>
+            <w:vAlign w:val="top"/>
+          </w:tcPr>
+          <w:p>
+            <w:pPr>
+              <w:spacing w:line="260"/>
+            </w:pPr>
+            <w:r>
+              <w:rPr>
+                <w:rFonts w:ascii="Plus Jakarta Sans" w:cs="Plus Jakarta Sans" w:eastAsia="Plus Jakarta Sans" w:hAnsi="Plus Jakarta Sans"/>
+                <w:b/>
+                <w:bCs/>
+                <w:color w:val="0A1B4D"/>
+                <w:sz w:val="18"/>
+                <w:szCs w:val="18"/>
+              </w:rPr>
+              <w:t xml:space="preserve">Settle a warning (fines first)</w:t>
+            </w:r>
+          </w:p>
+        </w:tc>
+        <w:tc>
+          <w:tcPr>
+            <w:tcW w:type="dxa" w:w="1650"/>
+            <w:tcBorders>
+              <w:top w:val="single" w:color="E3EAF3" w:sz="4"/>
+              <w:left w:val="single" w:color="E3EAF3" w:sz="4"/>
+              <w:bottom w:val="single" w:color="E3EAF3" w:sz="4"/>
+              <w:right w:val="single" w:color="E3EAF3" w:sz="4"/>
+            </w:tcBorders>
+            <w:shd w:fill="FFFFFF" w:color="auto" w:val="clear"/>
+            <w:tcMar>
+              <w:top w:type="dxa" w:w="70"/>
+              <w:left w:type="dxa" w:w="110"/>
+              <w:bottom w:type="dxa" w:w="70"/>
+              <w:right w:type="dxa" w:w="110"/>
+            </w:tcMar>
+            <w:vAlign w:val="top"/>
+          </w:tcPr>
+          <w:p>
+            <w:pPr>
+              <w:spacing w:line="260"/>
+            </w:pPr>
+            <w:r>
+              <w:rPr>
+                <w:rFonts w:ascii="Plus Jakarta Sans" w:cs="Plus Jakarta Sans" w:eastAsia="Plus Jakarta Sans" w:hAnsi="Plus Jakarta Sans"/>
+                <w:color w:val="0A1B4D"/>
+                <w:sz w:val="18"/>
+                <w:szCs w:val="18"/>
+              </w:rPr>
+              <w:t xml:space="preserve">Warning offered first</w:t>
+            </w:r>
+          </w:p>
+        </w:tc>
+        <w:tc>
+          <w:tcPr>
+            <w:tcW w:type="dxa" w:w="2150"/>
+            <w:tcBorders>
+              <w:top w:val="single" w:color="E3EAF3" w:sz="4"/>
+              <w:left w:val="single" w:color="E3EAF3" w:sz="4"/>
+              <w:bottom w:val="single" w:color="E3EAF3" w:sz="4"/>
+              <w:right w:val="single" w:color="E3EAF3" w:sz="4"/>
+            </w:tcBorders>
+            <w:shd w:fill="FFFFFF" w:color="auto" w:val="clear"/>
+            <w:tcMar>
+              <w:top w:type="dxa" w:w="70"/>
+              <w:left w:type="dxa" w:w="110"/>
+              <w:bottom w:type="dxa" w:w="70"/>
+              <w:right w:type="dxa" w:w="110"/>
+            </w:tcMar>
+            <w:vAlign w:val="top"/>
+          </w:tcPr>
+          <w:p>
+            <w:pPr>
+              <w:spacing w:line="260"/>
+            </w:pPr>
+            <w:r>
+              <w:rPr>
+                <w:rFonts w:ascii="Plus Jakarta Sans" w:cs="Plus Jakarta Sans" w:eastAsia="Plus Jakarta Sans" w:hAnsi="Plus Jakarta Sans"/>
+                <w:color w:val="0A1B4D"/>
+                <w:sz w:val="18"/>
+                <w:szCs w:val="18"/>
+              </w:rPr>
+              <w:t xml:space="preserve">Text the plate → reply 1–4</w:t>
+            </w:r>
+          </w:p>
+        </w:tc>
+        <w:tc>
+          <w:tcPr>
+            <w:tcW w:type="dxa" w:w="1700"/>
+            <w:tcBorders>
+              <w:top w:val="single" w:color="E3EAF3" w:sz="4"/>
+              <w:left w:val="single" w:color="E3EAF3" w:sz="4"/>
+              <w:bottom w:val="single" w:color="E3EAF3" w:sz="4"/>
+              <w:right w:val="single" w:color="E3EAF3" w:sz="4"/>
+            </w:tcBorders>
+            <w:shd w:fill="FFFFFF" w:color="auto" w:val="clear"/>
+            <w:tcMar>
+              <w:top w:type="dxa" w:w="70"/>
+              <w:left w:type="dxa" w:w="110"/>
+              <w:bottom w:type="dxa" w:w="70"/>
+              <w:right w:type="dxa" w:w="110"/>
+            </w:tcMar>
+            <w:vAlign w:val="top"/>
+          </w:tcPr>
+          <w:p>
+            <w:pPr>
+              <w:spacing w:line="260"/>
+            </w:pPr>
+            <w:r>
+              <w:rPr>
+                <w:rFonts w:ascii="Plus Jakarta Sans" w:cs="Plus Jakarta Sans" w:eastAsia="Plus Jakarta Sans" w:hAnsi="Plus Jakarta Sans"/>
+                <w:color w:val="0A1B4D"/>
+                <w:sz w:val="18"/>
+                <w:szCs w:val="18"/>
+              </w:rPr>
+              <w:t xml:space="preserve">4 Pay a warning</w:t>
+            </w:r>
+          </w:p>
+        </w:tc>
+        <w:tc>
+          <w:tcPr>
+            <w:tcW w:type="dxa" w:w="2088"/>
+            <w:tcBorders>
+              <w:top w:val="single" w:color="E3EAF3" w:sz="4"/>
+              <w:left w:val="single" w:color="E3EAF3" w:sz="4"/>
+              <w:bottom w:val="single" w:color="E3EAF3" w:sz="4"/>
+              <w:right w:val="single" w:color="E3EAF3" w:sz="4"/>
+            </w:tcBorders>
+            <w:shd w:fill="FFFFFF" w:color="auto" w:val="clear"/>
+            <w:tcMar>
+              <w:top w:type="dxa" w:w="70"/>
+              <w:left w:type="dxa" w:w="110"/>
+              <w:bottom w:type="dxa" w:w="70"/>
+              <w:right w:type="dxa" w:w="110"/>
+            </w:tcMar>
+            <w:vAlign w:val="top"/>
+          </w:tcPr>
+          <w:p>
+            <w:pPr>
+              <w:spacing w:line="260"/>
+            </w:pPr>
+            <w:r>
+              <w:rPr>
+                <w:rFonts w:ascii="Plus Jakarta Sans" w:cs="Plus Jakarta Sans" w:eastAsia="Plus Jakarta Sans" w:hAnsi="Plus Jakarta Sans"/>
+                <w:color w:val="0A1B4D"/>
+                <w:sz w:val="18"/>
+                <w:szCs w:val="18"/>
+              </w:rPr>
+              <w:t xml:space="preserve">Council office (admin records it)</w:t>
+            </w:r>
+          </w:p>
+        </w:tc>
+      </w:tr>
+      <w:tr>
+        <w:tc>
+          <w:tcPr>
+            <w:tcW w:type="dxa" w:w="2050"/>
+            <w:tcBorders>
+              <w:top w:val="single" w:color="E3EAF3" w:sz="4"/>
+              <w:left w:val="single" w:color="E3EAF3" w:sz="4"/>
+              <w:bottom w:val="single" w:color="E3EAF3" w:sz="4"/>
+              <w:right w:val="single" w:color="E3EAF3" w:sz="4"/>
+            </w:tcBorders>
+            <w:shd w:fill="FFFFFF" w:color="auto" w:val="clear"/>
+            <w:tcMar>
+              <w:top w:type="dxa" w:w="70"/>
+              <w:left w:type="dxa" w:w="110"/>
+              <w:bottom w:type="dxa" w:w="70"/>
+              <w:right w:type="dxa" w:w="110"/>
+            </w:tcMar>
+            <w:vAlign w:val="top"/>
+          </w:tcPr>
+          <w:p>
+            <w:pPr>
+              <w:spacing w:line="260"/>
+            </w:pPr>
+            <w:r>
+              <w:rPr>
+                <w:rFonts w:ascii="Plus Jakarta Sans" w:cs="Plus Jakarta Sans" w:eastAsia="Plus Jakarta Sans" w:hAnsi="Plus Jakarta Sans"/>
+                <w:b/>
+                <w:bCs/>
+                <w:color w:val="0A1B4D"/>
+                <w:sz w:val="18"/>
+                <w:szCs w:val="18"/>
+              </w:rPr>
+              <w:t xml:space="preserve">Check if a plate is paid</w:t>
+            </w:r>
+          </w:p>
+        </w:tc>
+        <w:tc>
+          <w:tcPr>
+            <w:tcW w:type="dxa" w:w="1650"/>
+            <w:tcBorders>
+              <w:top w:val="single" w:color="E3EAF3" w:sz="4"/>
+              <w:left w:val="single" w:color="E3EAF3" w:sz="4"/>
+              <w:bottom w:val="single" w:color="E3EAF3" w:sz="4"/>
+              <w:right w:val="single" w:color="E3EAF3" w:sz="4"/>
+            </w:tcBorders>
+            <w:shd w:fill="FFFFFF" w:color="auto" w:val="clear"/>
+            <w:tcMar>
+              <w:top w:type="dxa" w:w="70"/>
+              <w:left w:type="dxa" w:w="110"/>
+              <w:bottom w:type="dxa" w:w="70"/>
+              <w:right w:type="dxa" w:w="110"/>
+            </w:tcMar>
+            <w:vAlign w:val="top"/>
+          </w:tcPr>
+          <w:p>
+            <w:pPr>
+              <w:spacing w:line="260"/>
+            </w:pPr>
+            <w:r>
+              <w:rPr>
+                <w:rFonts w:ascii="Plus Jakarta Sans" w:cs="Plus Jakarta Sans" w:eastAsia="Plus Jakarta Sans" w:hAnsi="Plus Jakarta Sans"/>
+                <w:color w:val="0A1B4D"/>
+                <w:sz w:val="18"/>
+                <w:szCs w:val="18"/>
+              </w:rPr>
+              <w:t xml:space="preserve">Home / Plates</w:t>
+            </w:r>
+          </w:p>
+        </w:tc>
+        <w:tc>
+          <w:tcPr>
+            <w:tcW w:type="dxa" w:w="2150"/>
+            <w:tcBorders>
+              <w:top w:val="single" w:color="E3EAF3" w:sz="4"/>
+              <w:left w:val="single" w:color="E3EAF3" w:sz="4"/>
+              <w:bottom w:val="single" w:color="E3EAF3" w:sz="4"/>
+              <w:right w:val="single" w:color="E3EAF3" w:sz="4"/>
+            </w:tcBorders>
+            <w:shd w:fill="FFFFFF" w:color="auto" w:val="clear"/>
+            <w:tcMar>
+              <w:top w:type="dxa" w:w="70"/>
+              <w:left w:type="dxa" w:w="110"/>
+              <w:bottom w:type="dxa" w:w="70"/>
+              <w:right w:type="dxa" w:w="110"/>
+            </w:tcMar>
+            <w:vAlign w:val="top"/>
+          </w:tcPr>
+          <w:p>
+            <w:pPr>
+              <w:spacing w:line="260"/>
+            </w:pPr>
+            <w:r>
+              <w:rPr>
+                <w:rFonts w:ascii="Plus Jakarta Sans" w:cs="Plus Jakarta Sans" w:eastAsia="Plus Jakarta Sans" w:hAnsi="Plus Jakarta Sans"/>
+                <w:color w:val="0A1B4D"/>
+                <w:sz w:val="18"/>
+                <w:szCs w:val="18"/>
+              </w:rPr>
+              <w:t xml:space="preserve">Text the plate</w:t>
+            </w:r>
+          </w:p>
+        </w:tc>
+        <w:tc>
+          <w:tcPr>
+            <w:tcW w:type="dxa" w:w="1700"/>
+            <w:tcBorders>
+              <w:top w:val="single" w:color="E3EAF3" w:sz="4"/>
+              <w:left w:val="single" w:color="E3EAF3" w:sz="4"/>
+              <w:bottom w:val="single" w:color="E3EAF3" w:sz="4"/>
+              <w:right w:val="single" w:color="E3EAF3" w:sz="4"/>
+            </w:tcBorders>
+            <w:shd w:fill="FFFFFF" w:color="auto" w:val="clear"/>
+            <w:tcMar>
+              <w:top w:type="dxa" w:w="70"/>
+              <w:left w:type="dxa" w:w="110"/>
+              <w:bottom w:type="dxa" w:w="70"/>
+              <w:right w:type="dxa" w:w="110"/>
+            </w:tcMar>
+            <w:vAlign w:val="top"/>
+          </w:tcPr>
+          <w:p>
+            <w:pPr>
+              <w:spacing w:line="260"/>
+            </w:pPr>
+            <w:r>
+              <w:rPr>
+                <w:rFonts w:ascii="Plus Jakarta Sans" w:cs="Plus Jakarta Sans" w:eastAsia="Plus Jakarta Sans" w:hAnsi="Plus Jakarta Sans"/>
+                <w:color w:val="0A1B4D"/>
+                <w:sz w:val="18"/>
+                <w:szCs w:val="18"/>
+              </w:rPr>
+              <w:t xml:space="preserve">3 Check a plate</w:t>
+            </w:r>
+          </w:p>
+        </w:tc>
+        <w:tc>
+          <w:tcPr>
+            <w:tcW w:type="dxa" w:w="2088"/>
+            <w:tcBorders>
+              <w:top w:val="single" w:color="E3EAF3" w:sz="4"/>
+              <w:left w:val="single" w:color="E3EAF3" w:sz="4"/>
+              <w:bottom w:val="single" w:color="E3EAF3" w:sz="4"/>
+              <w:right w:val="single" w:color="E3EAF3" w:sz="4"/>
+            </w:tcBorders>
+            <w:shd w:fill="FFFFFF" w:color="auto" w:val="clear"/>
+            <w:tcMar>
+              <w:top w:type="dxa" w:w="70"/>
+              <w:left w:type="dxa" w:w="110"/>
+              <w:bottom w:type="dxa" w:w="70"/>
+              <w:right w:type="dxa" w:w="110"/>
+            </w:tcMar>
+            <w:vAlign w:val="top"/>
+          </w:tcPr>
+          <w:p>
+            <w:pPr>
+              <w:spacing w:line="260"/>
+            </w:pPr>
+            <w:r>
+              <w:rPr>
+                <w:rFonts w:ascii="Plus Jakarta Sans" w:cs="Plus Jakarta Sans" w:eastAsia="Plus Jakarta Sans" w:hAnsi="Plus Jakarta Sans"/>
+                <w:color w:val="0A1B4D"/>
+                <w:sz w:val="18"/>
+                <w:szCs w:val="18"/>
+              </w:rPr>
+              <w:t xml:space="preserve">Police: Fines tracking</w:t>
+            </w:r>
+          </w:p>
+        </w:tc>
+      </w:tr>
+      <w:tr>
+        <w:tc>
+          <w:tcPr>
+            <w:tcW w:type="dxa" w:w="2050"/>
+            <w:tcBorders>
+              <w:top w:val="single" w:color="E3EAF3" w:sz="4"/>
+              <w:left w:val="single" w:color="E3EAF3" w:sz="4"/>
+              <w:bottom w:val="single" w:color="E3EAF3" w:sz="4"/>
+              <w:right w:val="single" w:color="E3EAF3" w:sz="4"/>
+            </w:tcBorders>
+            <w:shd w:fill="FFFFFF" w:color="auto" w:val="clear"/>
+            <w:tcMar>
+              <w:top w:type="dxa" w:w="70"/>
+              <w:left w:type="dxa" w:w="110"/>
+              <w:bottom w:type="dxa" w:w="70"/>
+              <w:right w:type="dxa" w:w="110"/>
+            </w:tcMar>
+            <w:vAlign w:val="top"/>
+          </w:tcPr>
+          <w:p>
+            <w:pPr>
+              <w:spacing w:line="260"/>
+            </w:pPr>
+            <w:r>
+              <w:rPr>
+                <w:rFonts w:ascii="Plus Jakarta Sans" w:cs="Plus Jakarta Sans" w:eastAsia="Plus Jakarta Sans" w:hAnsi="Plus Jakarta Sans"/>
+                <w:b/>
+                <w:bCs/>
+                <w:color w:val="0A1B4D"/>
+                <w:sz w:val="18"/>
+                <w:szCs w:val="18"/>
+              </w:rPr>
+              <w:t xml:space="preserve">See my plates &amp; receipts</w:t>
+            </w:r>
+          </w:p>
+        </w:tc>
+        <w:tc>
+          <w:tcPr>
+            <w:tcW w:type="dxa" w:w="1650"/>
+            <w:tcBorders>
+              <w:top w:val="single" w:color="E3EAF3" w:sz="4"/>
+              <w:left w:val="single" w:color="E3EAF3" w:sz="4"/>
+              <w:bottom w:val="single" w:color="E3EAF3" w:sz="4"/>
+              <w:right w:val="single" w:color="E3EAF3" w:sz="4"/>
+            </w:tcBorders>
+            <w:shd w:fill="FFFFFF" w:color="auto" w:val="clear"/>
+            <w:tcMar>
+              <w:top w:type="dxa" w:w="70"/>
+              <w:left w:type="dxa" w:w="110"/>
+              <w:bottom w:type="dxa" w:w="70"/>
+              <w:right w:type="dxa" w:w="110"/>
+            </w:tcMar>
+            <w:vAlign w:val="top"/>
+          </w:tcPr>
+          <w:p>
+            <w:pPr>
+              <w:spacing w:line="260"/>
+            </w:pPr>
+            <w:r>
+              <w:rPr>
+                <w:rFonts w:ascii="Plus Jakarta Sans" w:cs="Plus Jakarta Sans" w:eastAsia="Plus Jakarta Sans" w:hAnsi="Plus Jakarta Sans"/>
+                <w:color w:val="0A1B4D"/>
+                <w:sz w:val="18"/>
+                <w:szCs w:val="18"/>
+              </w:rPr>
+              <w:t xml:space="preserve">Plates, Activity</w:t>
+            </w:r>
+          </w:p>
+        </w:tc>
+        <w:tc>
+          <w:tcPr>
+            <w:tcW w:type="dxa" w:w="2150"/>
+            <w:tcBorders>
+              <w:top w:val="single" w:color="E3EAF3" w:sz="4"/>
+              <w:left w:val="single" w:color="E3EAF3" w:sz="4"/>
+              <w:bottom w:val="single" w:color="E3EAF3" w:sz="4"/>
+              <w:right w:val="single" w:color="E3EAF3" w:sz="4"/>
+            </w:tcBorders>
+            <w:shd w:fill="FFFFFF" w:color="auto" w:val="clear"/>
+            <w:tcMar>
+              <w:top w:type="dxa" w:w="70"/>
+              <w:left w:type="dxa" w:w="110"/>
+              <w:bottom w:type="dxa" w:w="70"/>
+              <w:right w:type="dxa" w:w="110"/>
+            </w:tcMar>
+            <w:vAlign w:val="top"/>
+          </w:tcPr>
+          <w:p>
+            <w:pPr>
+              <w:spacing w:line="260"/>
+            </w:pPr>
+            <w:r>
+              <w:rPr>
+                <w:rFonts w:ascii="Plus Jakarta Sans" w:cs="Plus Jakarta Sans" w:eastAsia="Plus Jakarta Sans" w:hAnsi="Plus Jakarta Sans"/>
+                <w:color w:val="0A1B4D"/>
+                <w:sz w:val="18"/>
+                <w:szCs w:val="18"/>
+              </w:rPr>
+              <w:t xml:space="preserve">Receipts by SMS</w:t>
+            </w:r>
+          </w:p>
+        </w:tc>
+        <w:tc>
+          <w:tcPr>
+            <w:tcW w:type="dxa" w:w="1700"/>
+            <w:tcBorders>
+              <w:top w:val="single" w:color="E3EAF3" w:sz="4"/>
+              <w:left w:val="single" w:color="E3EAF3" w:sz="4"/>
+              <w:bottom w:val="single" w:color="E3EAF3" w:sz="4"/>
+              <w:right w:val="single" w:color="E3EAF3" w:sz="4"/>
+            </w:tcBorders>
+            <w:shd w:fill="FFFFFF" w:color="auto" w:val="clear"/>
+            <w:tcMar>
+              <w:top w:type="dxa" w:w="70"/>
+              <w:left w:type="dxa" w:w="110"/>
+              <w:bottom w:type="dxa" w:w="70"/>
+              <w:right w:type="dxa" w:w="110"/>
+            </w:tcMar>
+            <w:vAlign w:val="top"/>
+          </w:tcPr>
+          <w:p>
+            <w:pPr>
+              <w:spacing w:line="260"/>
+            </w:pPr>
+            <w:r>
+              <w:rPr>
+                <w:rFonts w:ascii="Plus Jakarta Sans" w:cs="Plus Jakarta Sans" w:eastAsia="Plus Jakarta Sans" w:hAnsi="Plus Jakarta Sans"/>
+                <w:color w:val="0A1B4D"/>
+                <w:sz w:val="18"/>
+                <w:szCs w:val="18"/>
+              </w:rPr>
+              <w:t xml:space="preserve">5 My plates</w:t>
+            </w:r>
+          </w:p>
+        </w:tc>
+        <w:tc>
+          <w:tcPr>
+            <w:tcW w:type="dxa" w:w="2088"/>
+            <w:tcBorders>
+              <w:top w:val="single" w:color="E3EAF3" w:sz="4"/>
+              <w:left w:val="single" w:color="E3EAF3" w:sz="4"/>
+              <w:bottom w:val="single" w:color="E3EAF3" w:sz="4"/>
+              <w:right w:val="single" w:color="E3EAF3" w:sz="4"/>
+            </w:tcBorders>
+            <w:shd w:fill="FFFFFF" w:color="auto" w:val="clear"/>
+            <w:tcMar>
+              <w:top w:type="dxa" w:w="70"/>
+              <w:left w:type="dxa" w:w="110"/>
+              <w:bottom w:type="dxa" w:w="70"/>
+              <w:right w:type="dxa" w:w="110"/>
+            </w:tcMar>
+            <w:vAlign w:val="top"/>
+          </w:tcPr>
+          <w:p>
+            <w:pPr>
+              <w:spacing w:line="260"/>
+            </w:pPr>
+            <w:r>
+              <w:rPr>
+                <w:rFonts w:ascii="Plus Jakarta Sans" w:cs="Plus Jakarta Sans" w:eastAsia="Plus Jakarta Sans" w:hAnsi="Plus Jakarta Sans"/>
+                <w:color w:val="0A1B4D"/>
+                <w:sz w:val="18"/>
+                <w:szCs w:val="18"/>
+              </w:rPr>
+              <w:t xml:space="preserve">—</w:t>
+            </w:r>
+          </w:p>
+        </w:tc>
+      </w:tr>
+      <w:tr>
+        <w:tc>
+          <w:tcPr>
+            <w:tcW w:type="dxa" w:w="2050"/>
+            <w:tcBorders>
+              <w:top w:val="single" w:color="E3EAF3" w:sz="4"/>
+              <w:left w:val="single" w:color="E3EAF3" w:sz="4"/>
+              <w:bottom w:val="single" w:color="E3EAF3" w:sz="4"/>
+              <w:right w:val="single" w:color="E3EAF3" w:sz="4"/>
+            </w:tcBorders>
+            <w:shd w:fill="FFFFFF" w:color="auto" w:val="clear"/>
+            <w:tcMar>
+              <w:top w:type="dxa" w:w="70"/>
+              <w:left w:type="dxa" w:w="110"/>
+              <w:bottom w:type="dxa" w:w="70"/>
+              <w:right w:type="dxa" w:w="110"/>
+            </w:tcMar>
+            <w:vAlign w:val="top"/>
+          </w:tcPr>
+          <w:p>
+            <w:pPr>
+              <w:spacing w:line="260"/>
+            </w:pPr>
+            <w:r>
+              <w:rPr>
+                <w:rFonts w:ascii="Plus Jakarta Sans" w:cs="Plus Jakarta Sans" w:eastAsia="Plus Jakarta Sans" w:hAnsi="Plus Jakarta Sans"/>
+                <w:b/>
+                <w:bCs/>
+                <w:color w:val="0A1B4D"/>
+                <w:sz w:val="18"/>
+                <w:szCs w:val="18"/>
+              </w:rPr>
+              <w:t xml:space="preserve">Read and accept the terms</w:t>
+            </w:r>
+          </w:p>
+        </w:tc>
+        <w:tc>
+          <w:tcPr>
+            <w:tcW w:type="dxa" w:w="1650"/>
+            <w:tcBorders>
+              <w:top w:val="single" w:color="E3EAF3" w:sz="4"/>
+              <w:left w:val="single" w:color="E3EAF3" w:sz="4"/>
+              <w:bottom w:val="single" w:color="E3EAF3" w:sz="4"/>
+              <w:right w:val="single" w:color="E3EAF3" w:sz="4"/>
+            </w:tcBorders>
+            <w:shd w:fill="FFFFFF" w:color="auto" w:val="clear"/>
+            <w:tcMar>
+              <w:top w:type="dxa" w:w="70"/>
+              <w:left w:type="dxa" w:w="110"/>
+              <w:bottom w:type="dxa" w:w="70"/>
+              <w:right w:type="dxa" w:w="110"/>
+            </w:tcMar>
+            <w:vAlign w:val="top"/>
+          </w:tcPr>
+          <w:p>
+            <w:pPr>
+              <w:spacing w:line="260"/>
+            </w:pPr>
+            <w:r>
+              <w:rPr>
+                <w:rFonts w:ascii="Plus Jakarta Sans" w:cs="Plus Jakarta Sans" w:eastAsia="Plus Jakarta Sans" w:hAnsi="Plus Jakarta Sans"/>
+                <w:color w:val="0A1B4D"/>
+                <w:sz w:val="18"/>
+                <w:szCs w:val="18"/>
+              </w:rPr>
+              <w:t xml:space="preserve">Terms gate (scroll + tick)</w:t>
+            </w:r>
+          </w:p>
+        </w:tc>
+        <w:tc>
+          <w:tcPr>
+            <w:tcW w:type="dxa" w:w="2150"/>
+            <w:tcBorders>
+              <w:top w:val="single" w:color="E3EAF3" w:sz="4"/>
+              <w:left w:val="single" w:color="E3EAF3" w:sz="4"/>
+              <w:bottom w:val="single" w:color="E3EAF3" w:sz="4"/>
+              <w:right w:val="single" w:color="E3EAF3" w:sz="4"/>
+            </w:tcBorders>
+            <w:shd w:fill="FFFFFF" w:color="auto" w:val="clear"/>
+            <w:tcMar>
+              <w:top w:type="dxa" w:w="70"/>
+              <w:left w:type="dxa" w:w="110"/>
+              <w:bottom w:type="dxa" w:w="70"/>
+              <w:right w:type="dxa" w:w="110"/>
+            </w:tcMar>
+            <w:vAlign w:val="top"/>
+          </w:tcPr>
+          <w:p>
+            <w:pPr>
+              <w:spacing w:line="260"/>
+            </w:pPr>
+            <w:r>
+              <w:rPr>
+                <w:rFonts w:ascii="Plus Jakarta Sans" w:cs="Plus Jakarta Sans" w:eastAsia="Plus Jakarta Sans" w:hAnsi="Plus Jakarta Sans"/>
+                <w:color w:val="0A1B4D"/>
+                <w:sz w:val="18"/>
+                <w:szCs w:val="18"/>
+              </w:rPr>
+              <w:t xml:space="preserve">TERMS → link</w:t>
+            </w:r>
+          </w:p>
+        </w:tc>
+        <w:tc>
+          <w:tcPr>
+            <w:tcW w:type="dxa" w:w="1700"/>
+            <w:tcBorders>
+              <w:top w:val="single" w:color="E3EAF3" w:sz="4"/>
+              <w:left w:val="single" w:color="E3EAF3" w:sz="4"/>
+              <w:bottom w:val="single" w:color="E3EAF3" w:sz="4"/>
+              <w:right w:val="single" w:color="E3EAF3" w:sz="4"/>
+            </w:tcBorders>
+            <w:shd w:fill="FFFFFF" w:color="auto" w:val="clear"/>
+            <w:tcMar>
+              <w:top w:type="dxa" w:w="70"/>
+              <w:left w:type="dxa" w:w="110"/>
+              <w:bottom w:type="dxa" w:w="70"/>
+              <w:right w:type="dxa" w:w="110"/>
+            </w:tcMar>
+            <w:vAlign w:val="top"/>
+          </w:tcPr>
+          <w:p>
+            <w:pPr>
+              <w:spacing w:line="260"/>
+            </w:pPr>
+            <w:r>
+              <w:rPr>
+                <w:rFonts w:ascii="Plus Jakarta Sans" w:cs="Plus Jakarta Sans" w:eastAsia="Plus Jakarta Sans" w:hAnsi="Plus Jakarta Sans"/>
+                <w:color w:val="0A1B4D"/>
+                <w:sz w:val="18"/>
+                <w:szCs w:val="18"/>
+              </w:rPr>
+              <w:t xml:space="preserve">6 Terms</w:t>
+            </w:r>
+          </w:p>
+        </w:tc>
+        <w:tc>
+          <w:tcPr>
+            <w:tcW w:type="dxa" w:w="2088"/>
+            <w:tcBorders>
+              <w:top w:val="single" w:color="E3EAF3" w:sz="4"/>
+              <w:left w:val="single" w:color="E3EAF3" w:sz="4"/>
+              <w:bottom w:val="single" w:color="E3EAF3" w:sz="4"/>
+              <w:right w:val="single" w:color="E3EAF3" w:sz="4"/>
+            </w:tcBorders>
+            <w:shd w:fill="FFFFFF" w:color="auto" w:val="clear"/>
+            <w:tcMar>
+              <w:top w:type="dxa" w:w="70"/>
+              <w:left w:type="dxa" w:w="110"/>
+              <w:bottom w:type="dxa" w:w="70"/>
+              <w:right w:type="dxa" w:w="110"/>
+            </w:tcMar>
+            <w:vAlign w:val="top"/>
+          </w:tcPr>
+          <w:p>
+            <w:pPr>
+              <w:spacing w:line="260"/>
+            </w:pPr>
+            <w:r>
+              <w:rPr>
+                <w:rFonts w:ascii="Plus Jakarta Sans" w:cs="Plus Jakarta Sans" w:eastAsia="Plus Jakarta Sans" w:hAnsi="Plus Jakarta Sans"/>
+                <w:color w:val="0A1B4D"/>
+                <w:sz w:val="18"/>
+                <w:szCs w:val="18"/>
+              </w:rPr>
+              <w:t xml:space="preserve">/terms page</w:t>
+            </w:r>
+          </w:p>
+        </w:tc>
+      </w:tr>
+      <w:tr>
+        <w:tc>
+          <w:tcPr>
+            <w:tcW w:type="dxa" w:w="2050"/>
+            <w:tcBorders>
+              <w:top w:val="single" w:color="E3EAF3" w:sz="4"/>
+              <w:left w:val="single" w:color="E3EAF3" w:sz="4"/>
+              <w:bottom w:val="single" w:color="E3EAF3" w:sz="4"/>
+              <w:right w:val="single" w:color="E3EAF3" w:sz="4"/>
+            </w:tcBorders>
+            <w:shd w:fill="FFFFFF" w:color="auto" w:val="clear"/>
+            <w:tcMar>
+              <w:top w:type="dxa" w:w="70"/>
+              <w:left w:type="dxa" w:w="110"/>
+              <w:bottom w:type="dxa" w:w="70"/>
+              <w:right w:type="dxa" w:w="110"/>
+            </w:tcMar>
+            <w:vAlign w:val="top"/>
+          </w:tcPr>
+          <w:p>
+            <w:pPr>
+              <w:spacing w:line="260"/>
+            </w:pPr>
+            <w:r>
+              <w:rPr>
+                <w:rFonts w:ascii="Plus Jakarta Sans" w:cs="Plus Jakarta Sans" w:eastAsia="Plus Jakarta Sans" w:hAnsi="Plus Jakarta Sans"/>
+                <w:b/>
+                <w:bCs/>
+                <w:color w:val="0A1B4D"/>
+                <w:sz w:val="18"/>
+                <w:szCs w:val="18"/>
+              </w:rPr>
+              <w:t xml:space="preserve">Fleet cover for an organisation</w:t>
+            </w:r>
+          </w:p>
+        </w:tc>
+        <w:tc>
+          <w:tcPr>
+            <w:tcW w:type="dxa" w:w="1650"/>
+            <w:tcBorders>
+              <w:top w:val="single" w:color="E3EAF3" w:sz="4"/>
+              <w:left w:val="single" w:color="E3EAF3" w:sz="4"/>
+              <w:bottom w:val="single" w:color="E3EAF3" w:sz="4"/>
+              <w:right w:val="single" w:color="E3EAF3" w:sz="4"/>
+            </w:tcBorders>
+            <w:shd w:fill="FFFFFF" w:color="auto" w:val="clear"/>
+            <w:tcMar>
+              <w:top w:type="dxa" w:w="70"/>
+              <w:left w:type="dxa" w:w="110"/>
+              <w:bottom w:type="dxa" w:w="70"/>
+              <w:right w:type="dxa" w:w="110"/>
+            </w:tcMar>
+            <w:vAlign w:val="top"/>
+          </w:tcPr>
+          <w:p>
+            <w:pPr>
+              <w:spacing w:line="260"/>
+            </w:pPr>
+            <w:r>
+              <w:rPr>
+                <w:rFonts w:ascii="Plus Jakarta Sans" w:cs="Plus Jakarta Sans" w:eastAsia="Plus Jakarta Sans" w:hAnsi="Plus Jakarta Sans"/>
+                <w:color w:val="0A1B4D"/>
+                <w:sz w:val="18"/>
+                <w:szCs w:val="18"/>
+              </w:rPr>
+              <w:t xml:space="preserve">—</w:t>
+            </w:r>
+          </w:p>
+        </w:tc>
+        <w:tc>
+          <w:tcPr>
+            <w:tcW w:type="dxa" w:w="2150"/>
+            <w:tcBorders>
+              <w:top w:val="single" w:color="E3EAF3" w:sz="4"/>
+              <w:left w:val="single" w:color="E3EAF3" w:sz="4"/>
+              <w:bottom w:val="single" w:color="E3EAF3" w:sz="4"/>
+              <w:right w:val="single" w:color="E3EAF3" w:sz="4"/>
+            </w:tcBorders>
+            <w:shd w:fill="FFFFFF" w:color="auto" w:val="clear"/>
+            <w:tcMar>
+              <w:top w:type="dxa" w:w="70"/>
+              <w:left w:type="dxa" w:w="110"/>
+              <w:bottom w:type="dxa" w:w="70"/>
+              <w:right w:type="dxa" w:w="110"/>
+            </w:tcMar>
+            <w:vAlign w:val="top"/>
+          </w:tcPr>
+          <w:p>
+            <w:pPr>
+              <w:spacing w:line="260"/>
+            </w:pPr>
+            <w:r>
+              <w:rPr>
+                <w:rFonts w:ascii="Plus Jakarta Sans" w:cs="Plus Jakarta Sans" w:eastAsia="Plus Jakarta Sans" w:hAnsi="Plus Jakarta Sans"/>
+                <w:color w:val="0A1B4D"/>
+                <w:sz w:val="18"/>
+                <w:szCs w:val="18"/>
+              </w:rPr>
+              <w:t xml:space="preserve">Contact texts a car: covered</w:t>
+            </w:r>
+          </w:p>
+        </w:tc>
+        <w:tc>
+          <w:tcPr>
+            <w:tcW w:type="dxa" w:w="1700"/>
+            <w:tcBorders>
+              <w:top w:val="single" w:color="E3EAF3" w:sz="4"/>
+              <w:left w:val="single" w:color="E3EAF3" w:sz="4"/>
+              <w:bottom w:val="single" w:color="E3EAF3" w:sz="4"/>
+              <w:right w:val="single" w:color="E3EAF3" w:sz="4"/>
+            </w:tcBorders>
+            <w:shd w:fill="FFFFFF" w:color="auto" w:val="clear"/>
+            <w:tcMar>
+              <w:top w:type="dxa" w:w="70"/>
+              <w:left w:type="dxa" w:w="110"/>
+              <w:bottom w:type="dxa" w:w="70"/>
+              <w:right w:type="dxa" w:w="110"/>
+            </w:tcMar>
+            <w:vAlign w:val="top"/>
+          </w:tcPr>
+          <w:p>
+            <w:pPr>
+              <w:spacing w:line="260"/>
+            </w:pPr>
+            <w:r>
+              <w:rPr>
+                <w:rFonts w:ascii="Plus Jakarta Sans" w:cs="Plus Jakarta Sans" w:eastAsia="Plus Jakarta Sans" w:hAnsi="Plus Jakarta Sans"/>
+                <w:color w:val="0A1B4D"/>
+                <w:sz w:val="18"/>
+                <w:szCs w:val="18"/>
+              </w:rPr>
+              <w:t xml:space="preserve">—</w:t>
+            </w:r>
+          </w:p>
+        </w:tc>
+        <w:tc>
+          <w:tcPr>
+            <w:tcW w:type="dxa" w:w="2088"/>
+            <w:tcBorders>
+              <w:top w:val="single" w:color="E3EAF3" w:sz="4"/>
+              <w:left w:val="single" w:color="E3EAF3" w:sz="4"/>
+              <w:bottom w:val="single" w:color="E3EAF3" w:sz="4"/>
+              <w:right w:val="single" w:color="E3EAF3" w:sz="4"/>
+            </w:tcBorders>
+            <w:shd w:fill="FFFFFF" w:color="auto" w:val="clear"/>
+            <w:tcMar>
+              <w:top w:type="dxa" w:w="70"/>
+              <w:left w:type="dxa" w:w="110"/>
+              <w:bottom w:type="dxa" w:w="70"/>
+              <w:right w:type="dxa" w:w="110"/>
+            </w:tcMar>
+            <w:vAlign w:val="top"/>
+          </w:tcPr>
+          <w:p>
+            <w:pPr>
+              <w:spacing w:line="260"/>
+            </w:pPr>
+            <w:r>
+              <w:rPr>
+                <w:rFonts w:ascii="Plus Jakarta Sans" w:cs="Plus Jakarta Sans" w:eastAsia="Plus Jakarta Sans" w:hAnsi="Plus Jakarta Sans"/>
+                <w:color w:val="0A1B4D"/>
+                <w:sz w:val="18"/>
+                <w:szCs w:val="18"/>
+              </w:rPr>
+              <w:t xml:space="preserve">/org: fleet, invoices</w:t>
+            </w:r>
+          </w:p>
+        </w:tc>
+      </w:tr>
+      <w:tr>
+        <w:tc>
+          <w:tcPr>
+            <w:tcW w:type="dxa" w:w="2050"/>
+            <w:tcBorders>
+              <w:top w:val="single" w:color="E3EAF3" w:sz="4"/>
+              <w:left w:val="single" w:color="E3EAF3" w:sz="4"/>
+              <w:bottom w:val="single" w:color="E3EAF3" w:sz="4"/>
+              <w:right w:val="single" w:color="E3EAF3" w:sz="4"/>
+            </w:tcBorders>
+            <w:shd w:fill="FFFFFF" w:color="auto" w:val="clear"/>
+            <w:tcMar>
+              <w:top w:type="dxa" w:w="70"/>
+              <w:left w:type="dxa" w:w="110"/>
+              <w:bottom w:type="dxa" w:w="70"/>
+              <w:right w:type="dxa" w:w="110"/>
+            </w:tcMar>
+            <w:vAlign w:val="top"/>
+          </w:tcPr>
+          <w:p>
+            <w:pPr>
+              <w:spacing w:line="260"/>
+            </w:pPr>
+            <w:r>
+              <w:rPr>
+                <w:rFonts w:ascii="Plus Jakarta Sans" w:cs="Plus Jakarta Sans" w:eastAsia="Plus Jakarta Sans" w:hAnsi="Plus Jakarta Sans"/>
+                <w:b/>
+                <w:bCs/>
+                <w:color w:val="0A1B4D"/>
+                <w:sz w:val="18"/>
+                <w:szCs w:val="18"/>
+              </w:rPr>
+              <w:t xml:space="preserve">Attendant shift &amp; checks</w:t>
+            </w:r>
+          </w:p>
+        </w:tc>
+        <w:tc>
+          <w:tcPr>
+            <w:tcW w:type="dxa" w:w="1650"/>
+            <w:tcBorders>
+              <w:top w:val="single" w:color="E3EAF3" w:sz="4"/>
+              <w:left w:val="single" w:color="E3EAF3" w:sz="4"/>
+              <w:bottom w:val="single" w:color="E3EAF3" w:sz="4"/>
+              <w:right w:val="single" w:color="E3EAF3" w:sz="4"/>
+            </w:tcBorders>
+            <w:shd w:fill="FFFFFF" w:color="auto" w:val="clear"/>
+            <w:tcMar>
+              <w:top w:type="dxa" w:w="70"/>
+              <w:left w:type="dxa" w:w="110"/>
+              <w:bottom w:type="dxa" w:w="70"/>
+              <w:right w:type="dxa" w:w="110"/>
+            </w:tcMar>
+            <w:vAlign w:val="top"/>
+          </w:tcPr>
+          <w:p>
+            <w:pPr>
+              <w:spacing w:line="260"/>
+            </w:pPr>
+            <w:r>
+              <w:rPr>
+                <w:rFonts w:ascii="Plus Jakarta Sans" w:cs="Plus Jakarta Sans" w:eastAsia="Plus Jakarta Sans" w:hAnsi="Plus Jakarta Sans"/>
+                <w:color w:val="0A1B4D"/>
+                <w:sz w:val="18"/>
+                <w:szCs w:val="18"/>
+              </w:rPr>
+              <w:t xml:space="preserve">Officer app</w:t>
+            </w:r>
+          </w:p>
+        </w:tc>
+        <w:tc>
+          <w:tcPr>
+            <w:tcW w:type="dxa" w:w="2150"/>
+            <w:tcBorders>
+              <w:top w:val="single" w:color="E3EAF3" w:sz="4"/>
+              <w:left w:val="single" w:color="E3EAF3" w:sz="4"/>
+              <w:bottom w:val="single" w:color="E3EAF3" w:sz="4"/>
+              <w:right w:val="single" w:color="E3EAF3" w:sz="4"/>
+            </w:tcBorders>
+            <w:shd w:fill="FFFFFF" w:color="auto" w:val="clear"/>
+            <w:tcMar>
+              <w:top w:type="dxa" w:w="70"/>
+              <w:left w:type="dxa" w:w="110"/>
+              <w:bottom w:type="dxa" w:w="70"/>
+              <w:right w:type="dxa" w:w="110"/>
+            </w:tcMar>
+            <w:vAlign w:val="top"/>
+          </w:tcPr>
+          <w:p>
+            <w:pPr>
+              <w:spacing w:line="260"/>
+            </w:pPr>
+            <w:r>
+              <w:rPr>
+                <w:rFonts w:ascii="Plus Jakarta Sans" w:cs="Plus Jakarta Sans" w:eastAsia="Plus Jakarta Sans" w:hAnsi="Plus Jakarta Sans"/>
+                <w:color w:val="0A1B4D"/>
+                <w:sz w:val="18"/>
+                <w:szCs w:val="18"/>
+              </w:rPr>
+              <w:t xml:space="preserve">START · plate · W plate · END</w:t>
+            </w:r>
+          </w:p>
+        </w:tc>
+        <w:tc>
+          <w:tcPr>
+            <w:tcW w:type="dxa" w:w="1700"/>
+            <w:tcBorders>
+              <w:top w:val="single" w:color="E3EAF3" w:sz="4"/>
+              <w:left w:val="single" w:color="E3EAF3" w:sz="4"/>
+              <w:bottom w:val="single" w:color="E3EAF3" w:sz="4"/>
+              <w:right w:val="single" w:color="E3EAF3" w:sz="4"/>
+            </w:tcBorders>
+            <w:shd w:fill="FFFFFF" w:color="auto" w:val="clear"/>
+            <w:tcMar>
+              <w:top w:type="dxa" w:w="70"/>
+              <w:left w:type="dxa" w:w="110"/>
+              <w:bottom w:type="dxa" w:w="70"/>
+              <w:right w:type="dxa" w:w="110"/>
+            </w:tcMar>
+            <w:vAlign w:val="top"/>
+          </w:tcPr>
+          <w:p>
+            <w:pPr>
+              <w:spacing w:line="260"/>
+            </w:pPr>
+            <w:r>
+              <w:rPr>
+                <w:rFonts w:ascii="Plus Jakarta Sans" w:cs="Plus Jakarta Sans" w:eastAsia="Plus Jakarta Sans" w:hAnsi="Plus Jakarta Sans"/>
+                <w:color w:val="0A1B4D"/>
+                <w:sz w:val="18"/>
+                <w:szCs w:val="18"/>
+              </w:rPr>
+              <w:t xml:space="preserve">Attendant menu 1–4</w:t>
+            </w:r>
+          </w:p>
+        </w:tc>
+        <w:tc>
+          <w:tcPr>
+            <w:tcW w:type="dxa" w:w="2088"/>
+            <w:tcBorders>
+              <w:top w:val="single" w:color="E3EAF3" w:sz="4"/>
+              <w:left w:val="single" w:color="E3EAF3" w:sz="4"/>
+              <w:bottom w:val="single" w:color="E3EAF3" w:sz="4"/>
+              <w:right w:val="single" w:color="E3EAF3" w:sz="4"/>
+            </w:tcBorders>
+            <w:shd w:fill="FFFFFF" w:color="auto" w:val="clear"/>
+            <w:tcMar>
+              <w:top w:type="dxa" w:w="70"/>
+              <w:left w:type="dxa" w:w="110"/>
+              <w:bottom w:type="dxa" w:w="70"/>
+              <w:right w:type="dxa" w:w="110"/>
+            </w:tcMar>
+            <w:vAlign w:val="top"/>
+          </w:tcPr>
+          <w:p>
+            <w:pPr>
+              <w:spacing w:line="260"/>
+            </w:pPr>
+            <w:r>
+              <w:rPr>
+                <w:rFonts w:ascii="Plus Jakarta Sans" w:cs="Plus Jakarta Sans" w:eastAsia="Plus Jakarta Sans" w:hAnsi="Plus Jakarta Sans"/>
+                <w:color w:val="0A1B4D"/>
+                <w:sz w:val="18"/>
+                <w:szCs w:val="18"/>
+              </w:rPr>
+              <w:t xml:space="preserve">Admin: attendants page</w:t>
+            </w:r>
+          </w:p>
+        </w:tc>
+      </w:tr>
+    </w:tbl>
+    <w:p>
+      <w:pPr>
+        <w:pStyle w:val="Heading2"/>
+        <w:spacing w:after="80" w:before="200"/>
+      </w:pPr>
+      <w:r>
+        <w:rPr>
+          <w:rFonts w:ascii="Plus Jakarta Sans" w:cs="Plus Jakarta Sans" w:eastAsia="Plus Jakarta Sans" w:hAnsi="Plus Jakarta Sans"/>
+          <w:b/>
+          <w:bCs/>
+          <w:color w:val="0B2E63"/>
+          <w:sz w:val="26"/>
+          <w:szCs w:val="26"/>
+        </w:rPr>
+        <w:t xml:space="preserve">SMS: pay, monthly, and a warning end to end</w:t>
+      </w:r>
+    </w:p>
+    <w:tbl>
+      <w:tblPr>
+        <w:tblW w:type="dxa" w:w="9638"/>
+        <w:tblBorders>
+          <w:top w:val="single" w:color="auto" w:sz="4"/>
+          <w:left w:val="single" w:color="auto" w:sz="4"/>
+          <w:bottom w:val="single" w:color="auto" w:sz="4"/>
+          <w:right w:val="single" w:color="auto" w:sz="4"/>
+          <w:insideH w:val="single" w:color="auto" w:sz="4"/>
+          <w:insideV w:val="single" w:color="auto" w:sz="4"/>
+        </w:tblBorders>
+      </w:tblPr>
+      <w:tblGrid>
+        <w:gridCol w:w="2409"/>
+        <w:gridCol w:w="2409"/>
+        <w:gridCol w:w="2409"/>
+        <w:gridCol w:w="2409"/>
+      </w:tblGrid>
+      <w:tr>
+        <w:tc>
+          <w:tcPr>
+            <w:tcW w:type="dxa" w:w="2409"/>
+            <w:tcBorders>
+              <w:top w:val="none" w:color="FFFFFF" w:sz="0"/>
+              <w:left w:val="none" w:color="FFFFFF" w:sz="0"/>
+              <w:bottom w:val="none" w:color="FFFFFF" w:sz="0"/>
+              <w:right w:val="none" w:color="FFFFFF" w:sz="0"/>
+            </w:tcBorders>
+            <w:tcMar>
+              <w:left w:type="dxa" w:w="60"/>
+              <w:right w:type="dxa" w:w="60"/>
+            </w:tcMar>
+          </w:tcPr>
+          <w:p>
+            <w:pPr>
+              <w:jc w:val="center"/>
+            </w:pPr>
+            <w:r>
+              <w:drawing>
+                <wp:inline distT="0" distB="0" distL="0" distR="0">
+                  <wp:extent cx="1238250" cy="2476500"/>
+                  <wp:effectExtent t="0" r="0" b="0" l="0"/>
+                  <wp:docPr id="16" name="" descr="" title=""/>
+                  <wp:cNvGraphicFramePr>
+                    <a:graphicFrameLocks xmlns:a="http://schemas.openxmlformats.org/drawingml/2006/main" noChangeAspect="1"/>
+                  </wp:cNvGraphicFramePr>
+                  <a:graphic xmlns:a="http://schemas.openxmlformats.org/drawingml/2006/main">
+                    <a:graphicData uri="http://schemas.openxmlformats.org/drawingml/2006/picture">
+                      <pic:pic xmlns:pic="http://schemas.openxmlformats.org/drawingml/2006/picture">
+                        <pic:nvPicPr>
+                          <pic:cNvPr id="0" name="" descr=""/>
+                          <pic:cNvPicPr>
+                            <a:picLocks noChangeAspect="1" noChangeArrowheads="1"/>
+                          </pic:cNvPicPr>
+                        </pic:nvPicPr>
+                        <pic:blipFill>
+                          <a:blip r:embed="rId24" cstate="none"/>
+                          <a:srcRect/>
+                          <a:stretch>
+                            <a:fillRect/>
+                          </a:stretch>
+                        </pic:blipFill>
+                        <pic:spPr bwMode="auto">
+                          <a:xfrm>
+                            <a:off x="0" y="0"/>
+                            <a:ext cx="1238250" cy="2476500"/>
+                          </a:xfrm>
+                          <a:prstGeom prst="rect">
+                            <a:avLst/>
+                          </a:prstGeom>
+                        </pic:spPr>
+                      </pic:pic>
+                    </a:graphicData>
+                  </a:graphic>
+                </wp:inline>
+              </w:drawing>
+            </w:r>
+          </w:p>
+          <w:p>
+            <w:pPr>
+              <w:spacing w:after="120"/>
+              <w:jc w:val="center"/>
+            </w:pPr>
+            <w:r>
+              <w:rPr>
+                <w:rFonts w:ascii="Plus Jakarta Sans" w:cs="Plus Jakarta Sans" w:eastAsia="Plus Jakarta Sans" w:hAnsi="Plus Jakarta Sans"/>
+                <w:b/>
+                <w:bCs/>
+                <w:color w:val="5C6A94"/>
+                <w:sz w:val="16"/>
+                <w:szCs w:val="16"/>
+              </w:rPr>
+              <w:t xml:space="preserve">Daily pass · first-time phone</w:t>
+            </w:r>
+          </w:p>
+        </w:tc>
+        <w:tc>
+          <w:tcPr>
+            <w:tcW w:type="dxa" w:w="2409"/>
+            <w:tcBorders>
+              <w:top w:val="none" w:color="FFFFFF" w:sz="0"/>
+              <w:left w:val="none" w:color="FFFFFF" w:sz="0"/>
+              <w:bottom w:val="none" w:color="FFFFFF" w:sz="0"/>
+              <w:right w:val="none" w:color="FFFFFF" w:sz="0"/>
+            </w:tcBorders>
+            <w:tcMar>
+              <w:left w:type="dxa" w:w="60"/>
+              <w:right w:type="dxa" w:w="60"/>
+            </w:tcMar>
+          </w:tcPr>
+          <w:p>
+            <w:pPr>
+              <w:jc w:val="center"/>
+            </w:pPr>
+            <w:r>
+              <w:drawing>
+                <wp:inline distT="0" distB="0" distL="0" distR="0">
+                  <wp:extent cx="1238250" cy="2476500"/>
+                  <wp:effectExtent t="0" r="0" b="0" l="0"/>
+                  <wp:docPr id="17" name="" descr="" title=""/>
+                  <wp:cNvGraphicFramePr>
+                    <a:graphicFrameLocks xmlns:a="http://schemas.openxmlformats.org/drawingml/2006/main" noChangeAspect="1"/>
+                  </wp:cNvGraphicFramePr>
+                  <a:graphic xmlns:a="http://schemas.openxmlformats.org/drawingml/2006/main">
+                    <a:graphicData uri="http://schemas.openxmlformats.org/drawingml/2006/picture">
+                      <pic:pic xmlns:pic="http://schemas.openxmlformats.org/drawingml/2006/picture">
+                        <pic:nvPicPr>
+                          <pic:cNvPr id="0" name="" descr=""/>
+                          <pic:cNvPicPr>
+                            <a:picLocks noChangeAspect="1" noChangeArrowheads="1"/>
+                          </pic:cNvPicPr>
+                        </pic:nvPicPr>
+                        <pic:blipFill>
+                          <a:blip r:embed="rId25" cstate="none"/>
+                          <a:srcRect/>
+                          <a:stretch>
+                            <a:fillRect/>
+                          </a:stretch>
+                        </pic:blipFill>
+                        <pic:spPr bwMode="auto">
+                          <a:xfrm>
+                            <a:off x="0" y="0"/>
+                            <a:ext cx="1238250" cy="2476500"/>
+                          </a:xfrm>
+                          <a:prstGeom prst="rect">
+                            <a:avLst/>
+                          </a:prstGeom>
+                        </pic:spPr>
+                      </pic:pic>
+                    </a:graphicData>
+                  </a:graphic>
+                </wp:inline>
+              </w:drawing>
+            </w:r>
+          </w:p>
+          <w:p>
+            <w:pPr>
+              <w:spacing w:after="120"/>
+              <w:jc w:val="center"/>
+            </w:pPr>
+            <w:r>
+              <w:rPr>
+                <w:rFonts w:ascii="Plus Jakarta Sans" w:cs="Plus Jakarta Sans" w:eastAsia="Plus Jakarta Sans" w:hAnsi="Plus Jakarta Sans"/>
+                <w:b/>
+                <w:bCs/>
+                <w:color w:val="5C6A94"/>
+                <w:sz w:val="16"/>
+                <w:szCs w:val="16"/>
+              </w:rPr>
+              <w:t xml:space="preserve">Monthly pass</w:t>
+            </w:r>
+          </w:p>
+        </w:tc>
+        <w:tc>
+          <w:tcPr>
+            <w:tcW w:type="dxa" w:w="2409"/>
+            <w:tcBorders>
+              <w:top w:val="none" w:color="FFFFFF" w:sz="0"/>
+              <w:left w:val="none" w:color="FFFFFF" w:sz="0"/>
+              <w:bottom w:val="none" w:color="FFFFFF" w:sz="0"/>
+              <w:right w:val="none" w:color="FFFFFF" w:sz="0"/>
+            </w:tcBorders>
+            <w:tcMar>
+              <w:left w:type="dxa" w:w="60"/>
+              <w:right w:type="dxa" w:w="60"/>
+            </w:tcMar>
+          </w:tcPr>
+          <w:p>
+            <w:pPr>
+              <w:jc w:val="center"/>
+            </w:pPr>
+            <w:r>
+              <w:drawing>
+                <wp:inline distT="0" distB="0" distL="0" distR="0">
+                  <wp:extent cx="1238250" cy="2476500"/>
+                  <wp:effectExtent t="0" r="0" b="0" l="0"/>
+                  <wp:docPr id="18" name="" descr="" title=""/>
+                  <wp:cNvGraphicFramePr>
+                    <a:graphicFrameLocks xmlns:a="http://schemas.openxmlformats.org/drawingml/2006/main" noChangeAspect="1"/>
+                  </wp:cNvGraphicFramePr>
+                  <a:graphic xmlns:a="http://schemas.openxmlformats.org/drawingml/2006/main">
+                    <a:graphicData uri="http://schemas.openxmlformats.org/drawingml/2006/picture">
+                      <pic:pic xmlns:pic="http://schemas.openxmlformats.org/drawingml/2006/picture">
+                        <pic:nvPicPr>
+                          <pic:cNvPr id="0" name="" descr=""/>
+                          <pic:cNvPicPr>
+                            <a:picLocks noChangeAspect="1" noChangeArrowheads="1"/>
+                          </pic:cNvPicPr>
+                        </pic:nvPicPr>
+                        <pic:blipFill>
+                          <a:blip r:embed="rId26" cstate="none"/>
+                          <a:srcRect/>
+                          <a:stretch>
+                            <a:fillRect/>
+                          </a:stretch>
+                        </pic:blipFill>
+                        <pic:spPr bwMode="auto">
+                          <a:xfrm>
+                            <a:off x="0" y="0"/>
+                            <a:ext cx="1238250" cy="2476500"/>
+                          </a:xfrm>
+                          <a:prstGeom prst="rect">
+                            <a:avLst/>
+                          </a:prstGeom>
+                        </pic:spPr>
+                      </pic:pic>
+                    </a:graphicData>
+                  </a:graphic>
+                </wp:inline>
+              </w:drawing>
+            </w:r>
+          </w:p>
+          <w:p>
+            <w:pPr>
+              <w:spacing w:after="120"/>
+              <w:jc w:val="center"/>
+            </w:pPr>
+            <w:r>
+              <w:rPr>
+                <w:rFonts w:ascii="Plus Jakarta Sans" w:cs="Plus Jakarta Sans" w:eastAsia="Plus Jakarta Sans" w:hAnsi="Plus Jakarta Sans"/>
+                <w:b/>
+                <w:bCs/>
+                <w:color w:val="5C6A94"/>
+                <w:sz w:val="16"/>
+                <w:szCs w:val="16"/>
+              </w:rPr>
+              <w:t xml:space="preserve">Attendant: START, check, warning</w:t>
+            </w:r>
+          </w:p>
+        </w:tc>
+        <w:tc>
+          <w:tcPr>
+            <w:tcW w:type="dxa" w:w="2409"/>
+            <w:tcBorders>
+              <w:top w:val="none" w:color="FFFFFF" w:sz="0"/>
+              <w:left w:val="none" w:color="FFFFFF" w:sz="0"/>
+              <w:bottom w:val="none" w:color="FFFFFF" w:sz="0"/>
+              <w:right w:val="none" w:color="FFFFFF" w:sz="0"/>
+            </w:tcBorders>
+            <w:tcMar>
+              <w:left w:type="dxa" w:w="60"/>
+              <w:right w:type="dxa" w:w="60"/>
+            </w:tcMar>
+          </w:tcPr>
+          <w:p>
+            <w:pPr>
+              <w:jc w:val="center"/>
+            </w:pPr>
+            <w:r>
+              <w:drawing>
+                <wp:inline distT="0" distB="0" distL="0" distR="0">
+                  <wp:extent cx="1238250" cy="2476500"/>
+                  <wp:effectExtent t="0" r="0" b="0" l="0"/>
+                  <wp:docPr id="19" name="" descr="" title=""/>
+                  <wp:cNvGraphicFramePr>
+                    <a:graphicFrameLocks xmlns:a="http://schemas.openxmlformats.org/drawingml/2006/main" noChangeAspect="1"/>
+                  </wp:cNvGraphicFramePr>
+                  <a:graphic xmlns:a="http://schemas.openxmlformats.org/drawingml/2006/main">
+                    <a:graphicData uri="http://schemas.openxmlformats.org/drawingml/2006/picture">
+                      <pic:pic xmlns:pic="http://schemas.openxmlformats.org/drawingml/2006/picture">
+                        <pic:nvPicPr>
+                          <pic:cNvPr id="0" name="" descr=""/>
+                          <pic:cNvPicPr>
+                            <a:picLocks noChangeAspect="1" noChangeArrowheads="1"/>
+                          </pic:cNvPicPr>
+                        </pic:nvPicPr>
+                        <pic:blipFill>
+                          <a:blip r:embed="rId27" cstate="none"/>
+                          <a:srcRect/>
+                          <a:stretch>
+                            <a:fillRect/>
+                          </a:stretch>
+                        </pic:blipFill>
+                        <pic:spPr bwMode="auto">
+                          <a:xfrm>
+                            <a:off x="0" y="0"/>
+                            <a:ext cx="1238250" cy="2476500"/>
+                          </a:xfrm>
+                          <a:prstGeom prst="rect">
+                            <a:avLst/>
+                          </a:prstGeom>
+                        </pic:spPr>
+                      </pic:pic>
+                    </a:graphicData>
+                  </a:graphic>
+                </wp:inline>
+              </w:drawing>
+            </w:r>
+          </w:p>
+          <w:p>
+            <w:pPr>
+              <w:spacing w:after="120"/>
+              <w:jc w:val="center"/>
+            </w:pPr>
+            <w:r>
+              <w:rPr>
+                <w:rFonts w:ascii="Plus Jakarta Sans" w:cs="Plus Jakarta Sans" w:eastAsia="Plus Jakarta Sans" w:hAnsi="Plus Jakarta Sans"/>
+                <w:b/>
+                <w:bCs/>
+                <w:color w:val="5C6A94"/>
+                <w:sz w:val="16"/>
+                <w:szCs w:val="16"/>
+              </w:rPr>
+              <w:t xml:space="preserve">Driver settles the warning</w:t>
+            </w:r>
+          </w:p>
+        </w:tc>
+      </w:tr>
+    </w:tbl>
+    <w:p>
+      <w:r>
+        <w:br w:type="page"/>
+      </w:r>
+    </w:p>
+    <w:p>
+      <w:pPr>
+        <w:spacing w:after="40" w:before="120"/>
+      </w:pPr>
+      <w:r>
+        <w:rPr>
+          <w:rFonts w:ascii="Plus Jakarta Sans" w:cs="Plus Jakarta Sans" w:eastAsia="Plus Jakarta Sans" w:hAnsi="Plus Jakarta Sans"/>
+          <w:b/>
+          <w:bCs/>
+          <w:color w:val="035BF0"/>
+          <w:spacing w:val="40"/>
+          <w:sz w:val="16"/>
+          <w:szCs w:val="16"/>
+        </w:rPr>
+        <w:t xml:space="preserve">11 — CUSTOMER JOURNEYS · USSD AND WEB</w:t>
+      </w:r>
+    </w:p>
+    <w:p>
+      <w:pPr>
+        <w:pStyle w:val="Heading1"/>
+        <w:spacing w:after="120"/>
+      </w:pPr>
+      <w:r>
+        <w:rPr>
+          <w:rFonts w:ascii="Plus Jakarta Sans" w:cs="Plus Jakarta Sans" w:eastAsia="Plus Jakarta Sans" w:hAnsi="Plus Jakarta Sans"/>
+          <w:b/>
+          <w:bCs/>
+          <w:color w:val="0A1B4D"/>
+          <w:sz w:val="40"/>
+          <w:szCs w:val="40"/>
+        </w:rPr>
+        <w:t xml:space="preserve">No smartphone needed</w:t>
+      </w:r>
+    </w:p>
+    <w:p>
+      <w:pPr>
+        <w:spacing w:after="100" w:line="280"/>
+      </w:pPr>
+      <w:r>
+        <w:rPr>
+          <w:rFonts w:ascii="Plus Jakarta Sans" w:cs="Plus Jakarta Sans" w:eastAsia="Plus Jakarta Sans" w:hAnsi="Plus Jakarta Sans"/>
+          <w:color w:val="5C6A94"/>
+          <w:sz w:val="20"/>
+          <w:szCs w:val="20"/>
+        </w:rPr>
+        <w:t xml:space="preserve">USSD works on any phone without internet: each screen is one request to </w:t>
+      </w:r>
+      <w:r>
+        <w:rPr>
+          <w:rFonts w:ascii="Consolas" w:cs="Consolas" w:eastAsia="Consolas" w:hAnsi="Consolas"/>
+          <w:color w:val="0B2E63"/>
+          <w:sz w:val="18"/>
+          <w:szCs w:val="18"/>
+          <w:shd w:fill="DFF1FC" w:color="auto" w:val="clear"/>
+        </w:rPr>
+        <w:t xml:space="preserve">POST /api/ussd</w:t>
+      </w:r>
+      <w:r>
+        <w:rPr>
+          <w:rFonts w:ascii="Plus Jakarta Sans" w:cs="Plus Jakarta Sans" w:eastAsia="Plus Jakarta Sans" w:hAnsi="Plus Jakarta Sans"/>
+          <w:color w:val="5C6A94"/>
+          <w:sz w:val="20"/>
+          <w:szCs w:val="20"/>
+        </w:rPr>
+        <w:t xml:space="preserve"> (CON = show and wait, END = close). A daily pass in four screens.</w:t>
+      </w:r>
+    </w:p>
+    <w:tbl>
+      <w:tblPr>
+        <w:tblW w:type="dxa" w:w="9638"/>
+        <w:tblBorders>
+          <w:top w:val="single" w:color="auto" w:sz="4"/>
+          <w:left w:val="single" w:color="auto" w:sz="4"/>
+          <w:bottom w:val="single" w:color="auto" w:sz="4"/>
+          <w:right w:val="single" w:color="auto" w:sz="4"/>
+          <w:insideH w:val="single" w:color="auto" w:sz="4"/>
+          <w:insideV w:val="single" w:color="auto" w:sz="4"/>
+        </w:tblBorders>
+      </w:tblPr>
+      <w:tblGrid>
+        <w:gridCol w:w="2409"/>
+        <w:gridCol w:w="2409"/>
+        <w:gridCol w:w="2409"/>
+        <w:gridCol w:w="2409"/>
+      </w:tblGrid>
+      <w:tr>
+        <w:tc>
+          <w:tcPr>
+            <w:tcW w:type="dxa" w:w="2409"/>
+            <w:tcBorders>
+              <w:top w:val="none" w:color="FFFFFF" w:sz="0"/>
+              <w:left w:val="none" w:color="FFFFFF" w:sz="0"/>
+              <w:bottom w:val="none" w:color="FFFFFF" w:sz="0"/>
+              <w:right w:val="none" w:color="FFFFFF" w:sz="0"/>
+            </w:tcBorders>
+            <w:tcMar>
+              <w:left w:type="dxa" w:w="60"/>
+              <w:right w:type="dxa" w:w="60"/>
+            </w:tcMar>
+          </w:tcPr>
+          <w:p>
+            <w:pPr>
+              <w:jc w:val="center"/>
+            </w:pPr>
+            <w:r>
+              <w:drawing>
+                <wp:inline distT="0" distB="0" distL="0" distR="0">
+                  <wp:extent cx="1238250" cy="2476500"/>
+                  <wp:effectExtent t="0" r="0" b="0" l="0"/>
+                  <wp:docPr id="20" name="" descr="" title=""/>
+                  <wp:cNvGraphicFramePr>
+                    <a:graphicFrameLocks xmlns:a="http://schemas.openxmlformats.org/drawingml/2006/main" noChangeAspect="1"/>
+                  </wp:cNvGraphicFramePr>
+                  <a:graphic xmlns:a="http://schemas.openxmlformats.org/drawingml/2006/main">
+                    <a:graphicData uri="http://schemas.openxmlformats.org/drawingml/2006/picture">
+                      <pic:pic xmlns:pic="http://schemas.openxmlformats.org/drawingml/2006/picture">
+                        <pic:nvPicPr>
+                          <pic:cNvPr id="0" name="" descr=""/>
+                          <pic:cNvPicPr>
+                            <a:picLocks noChangeAspect="1" noChangeArrowheads="1"/>
+                          </pic:cNvPicPr>
+                        </pic:nvPicPr>
+                        <pic:blipFill>
+                          <a:blip r:embed="rId28" cstate="none"/>
+                          <a:srcRect/>
+                          <a:stretch>
+                            <a:fillRect/>
+                          </a:stretch>
+                        </pic:blipFill>
+                        <pic:spPr bwMode="auto">
+                          <a:xfrm>
+                            <a:off x="0" y="0"/>
+                            <a:ext cx="1238250" cy="2476500"/>
+                          </a:xfrm>
+                          <a:prstGeom prst="rect">
+                            <a:avLst/>
+                          </a:prstGeom>
+                        </pic:spPr>
+                      </pic:pic>
+                    </a:graphicData>
+                  </a:graphic>
+                </wp:inline>
+              </w:drawing>
+            </w:r>
+          </w:p>
+          <w:p>
+            <w:pPr>
+              <w:spacing w:after="120"/>
+              <w:jc w:val="center"/>
+            </w:pPr>
+            <w:r>
+              <w:rPr>
+                <w:rFonts w:ascii="Plus Jakarta Sans" w:cs="Plus Jakarta Sans" w:eastAsia="Plus Jakarta Sans" w:hAnsi="Plus Jakarta Sans"/>
+                <w:b/>
+                <w:bCs/>
+                <w:color w:val="5C6A94"/>
+                <w:sz w:val="16"/>
+                <w:szCs w:val="16"/>
+              </w:rPr>
+              <w:t xml:space="preserve">1 · Dial *7275#: menu</w:t>
+            </w:r>
+          </w:p>
+        </w:tc>
+        <w:tc>
+          <w:tcPr>
+            <w:tcW w:type="dxa" w:w="2409"/>
+            <w:tcBorders>
+              <w:top w:val="none" w:color="FFFFFF" w:sz="0"/>
+              <w:left w:val="none" w:color="FFFFFF" w:sz="0"/>
+              <w:bottom w:val="none" w:color="FFFFFF" w:sz="0"/>
+              <w:right w:val="none" w:color="FFFFFF" w:sz="0"/>
+            </w:tcBorders>
+            <w:tcMar>
+              <w:left w:type="dxa" w:w="60"/>
+              <w:right w:type="dxa" w:w="60"/>
+            </w:tcMar>
+          </w:tcPr>
+          <w:p>
+            <w:pPr>
+              <w:jc w:val="center"/>
+            </w:pPr>
+            <w:r>
+              <w:drawing>
+                <wp:inline distT="0" distB="0" distL="0" distR="0">
+                  <wp:extent cx="1238250" cy="2476500"/>
+                  <wp:effectExtent t="0" r="0" b="0" l="0"/>
+                  <wp:docPr id="21" name="" descr="" title=""/>
+                  <wp:cNvGraphicFramePr>
+                    <a:graphicFrameLocks xmlns:a="http://schemas.openxmlformats.org/drawingml/2006/main" noChangeAspect="1"/>
+                  </wp:cNvGraphicFramePr>
+                  <a:graphic xmlns:a="http://schemas.openxmlformats.org/drawingml/2006/main">
+                    <a:graphicData uri="http://schemas.openxmlformats.org/drawingml/2006/picture">
+                      <pic:pic xmlns:pic="http://schemas.openxmlformats.org/drawingml/2006/picture">
+                        <pic:nvPicPr>
+                          <pic:cNvPr id="0" name="" descr=""/>
+                          <pic:cNvPicPr>
+                            <a:picLocks noChangeAspect="1" noChangeArrowheads="1"/>
+                          </pic:cNvPicPr>
+                        </pic:nvPicPr>
+                        <pic:blipFill>
+                          <a:blip r:embed="rId29" cstate="none"/>
+                          <a:srcRect/>
+                          <a:stretch>
+                            <a:fillRect/>
+                          </a:stretch>
+                        </pic:blipFill>
+                        <pic:spPr bwMode="auto">
+                          <a:xfrm>
+                            <a:off x="0" y="0"/>
+                            <a:ext cx="1238250" cy="2476500"/>
+                          </a:xfrm>
+                          <a:prstGeom prst="rect">
+                            <a:avLst/>
+                          </a:prstGeom>
+                        </pic:spPr>
+                      </pic:pic>
+                    </a:graphicData>
+                  </a:graphic>
+                </wp:inline>
+              </w:drawing>
+            </w:r>
+          </w:p>
+          <w:p>
+            <w:pPr>
+              <w:spacing w:after="120"/>
+              <w:jc w:val="center"/>
+            </w:pPr>
+            <w:r>
+              <w:rPr>
+                <w:rFonts w:ascii="Plus Jakarta Sans" w:cs="Plus Jakarta Sans" w:eastAsia="Plus Jakarta Sans" w:hAnsi="Plus Jakarta Sans"/>
+                <w:b/>
+                <w:bCs/>
+                <w:color w:val="5C6A94"/>
+                <w:sz w:val="16"/>
+                <w:szCs w:val="16"/>
+              </w:rPr>
+              <w:t xml:space="preserve">2 · Daily pass: plate</w:t>
+            </w:r>
+          </w:p>
+        </w:tc>
+        <w:tc>
+          <w:tcPr>
+            <w:tcW w:type="dxa" w:w="2409"/>
+            <w:tcBorders>
+              <w:top w:val="none" w:color="FFFFFF" w:sz="0"/>
+              <w:left w:val="none" w:color="FFFFFF" w:sz="0"/>
+              <w:bottom w:val="none" w:color="FFFFFF" w:sz="0"/>
+              <w:right w:val="none" w:color="FFFFFF" w:sz="0"/>
+            </w:tcBorders>
+            <w:tcMar>
+              <w:left w:type="dxa" w:w="60"/>
+              <w:right w:type="dxa" w:w="60"/>
+            </w:tcMar>
+          </w:tcPr>
+          <w:p>
+            <w:pPr>
+              <w:jc w:val="center"/>
+            </w:pPr>
+            <w:r>
+              <w:drawing>
+                <wp:inline distT="0" distB="0" distL="0" distR="0">
+                  <wp:extent cx="1238250" cy="2476500"/>
+                  <wp:effectExtent t="0" r="0" b="0" l="0"/>
+                  <wp:docPr id="22" name="" descr="" title=""/>
+                  <wp:cNvGraphicFramePr>
+                    <a:graphicFrameLocks xmlns:a="http://schemas.openxmlformats.org/drawingml/2006/main" noChangeAspect="1"/>
+                  </wp:cNvGraphicFramePr>
+                  <a:graphic xmlns:a="http://schemas.openxmlformats.org/drawingml/2006/main">
+                    <a:graphicData uri="http://schemas.openxmlformats.org/drawingml/2006/picture">
+                      <pic:pic xmlns:pic="http://schemas.openxmlformats.org/drawingml/2006/picture">
+                        <pic:nvPicPr>
+                          <pic:cNvPr id="0" name="" descr=""/>
+                          <pic:cNvPicPr>
+                            <a:picLocks noChangeAspect="1" noChangeArrowheads="1"/>
+                          </pic:cNvPicPr>
+                        </pic:nvPicPr>
+                        <pic:blipFill>
+                          <a:blip r:embed="rId30" cstate="none"/>
+                          <a:srcRect/>
+                          <a:stretch>
+                            <a:fillRect/>
+                          </a:stretch>
+                        </pic:blipFill>
+                        <pic:spPr bwMode="auto">
+                          <a:xfrm>
+                            <a:off x="0" y="0"/>
+                            <a:ext cx="1238250" cy="2476500"/>
+                          </a:xfrm>
+                          <a:prstGeom prst="rect">
+                            <a:avLst/>
+                          </a:prstGeom>
+                        </pic:spPr>
+                      </pic:pic>
+                    </a:graphicData>
+                  </a:graphic>
+                </wp:inline>
+              </w:drawing>
+            </w:r>
+          </w:p>
+          <w:p>
+            <w:pPr>
+              <w:spacing w:after="120"/>
+              <w:jc w:val="center"/>
+            </w:pPr>
+            <w:r>
+              <w:rPr>
+                <w:rFonts w:ascii="Plus Jakarta Sans" w:cs="Plus Jakarta Sans" w:eastAsia="Plus Jakarta Sans" w:hAnsi="Plus Jakarta Sans"/>
+                <w:b/>
+                <w:bCs/>
+                <w:color w:val="5C6A94"/>
+                <w:sz w:val="16"/>
+                <w:szCs w:val="16"/>
+              </w:rPr>
+              <w:t xml:space="preserve">3 · Price &amp; provider</w:t>
+            </w:r>
+          </w:p>
+        </w:tc>
+        <w:tc>
+          <w:tcPr>
+            <w:tcW w:type="dxa" w:w="2409"/>
+            <w:tcBorders>
+              <w:top w:val="none" w:color="FFFFFF" w:sz="0"/>
+              <w:left w:val="none" w:color="FFFFFF" w:sz="0"/>
+              <w:bottom w:val="none" w:color="FFFFFF" w:sz="0"/>
+              <w:right w:val="none" w:color="FFFFFF" w:sz="0"/>
+            </w:tcBorders>
+            <w:tcMar>
+              <w:left w:type="dxa" w:w="60"/>
+              <w:right w:type="dxa" w:w="60"/>
+            </w:tcMar>
+          </w:tcPr>
+          <w:p>
+            <w:pPr>
+              <w:jc w:val="center"/>
+            </w:pPr>
+            <w:r>
+              <w:drawing>
+                <wp:inline distT="0" distB="0" distL="0" distR="0">
+                  <wp:extent cx="1238250" cy="2476500"/>
+                  <wp:effectExtent t="0" r="0" b="0" l="0"/>
+                  <wp:docPr id="23" name="" descr="" title=""/>
+                  <wp:cNvGraphicFramePr>
+                    <a:graphicFrameLocks xmlns:a="http://schemas.openxmlformats.org/drawingml/2006/main" noChangeAspect="1"/>
+                  </wp:cNvGraphicFramePr>
+                  <a:graphic xmlns:a="http://schemas.openxmlformats.org/drawingml/2006/main">
+                    <a:graphicData uri="http://schemas.openxmlformats.org/drawingml/2006/picture">
+                      <pic:pic xmlns:pic="http://schemas.openxmlformats.org/drawingml/2006/picture">
+                        <pic:nvPicPr>
+                          <pic:cNvPr id="0" name="" descr=""/>
+                          <pic:cNvPicPr>
+                            <a:picLocks noChangeAspect="1" noChangeArrowheads="1"/>
+                          </pic:cNvPicPr>
+                        </pic:nvPicPr>
+                        <pic:blipFill>
+                          <a:blip r:embed="rId31" cstate="none"/>
+                          <a:srcRect/>
+                          <a:stretch>
+                            <a:fillRect/>
+                          </a:stretch>
+                        </pic:blipFill>
+                        <pic:spPr bwMode="auto">
+                          <a:xfrm>
+                            <a:off x="0" y="0"/>
+                            <a:ext cx="1238250" cy="2476500"/>
+                          </a:xfrm>
+                          <a:prstGeom prst="rect">
+                            <a:avLst/>
+                          </a:prstGeom>
+                        </pic:spPr>
+                      </pic:pic>
+                    </a:graphicData>
+                  </a:graphic>
+                </wp:inline>
+              </w:drawing>
+            </w:r>
+          </w:p>
+          <w:p>
+            <w:pPr>
+              <w:spacing w:after="120"/>
+              <w:jc w:val="center"/>
+            </w:pPr>
+            <w:r>
+              <w:rPr>
+                <w:rFonts w:ascii="Plus Jakarta Sans" w:cs="Plus Jakarta Sans" w:eastAsia="Plus Jakarta Sans" w:hAnsi="Plus Jakarta Sans"/>
+                <w:b/>
+                <w:bCs/>
+                <w:color w:val="5C6A94"/>
+                <w:sz w:val="16"/>
+                <w:szCs w:val="16"/>
+              </w:rPr>
+              <w:t xml:space="preserve">4 · Paid, receipt by SMS</w:t>
+            </w:r>
+          </w:p>
+        </w:tc>
+      </w:tr>
+    </w:tbl>
+    <w:tbl>
+      <w:tblPr>
+        <w:tblW w:type="dxa" w:w="9638"/>
+        <w:tblBorders>
+          <w:top w:val="single" w:color="auto" w:sz="4"/>
+          <w:left w:val="single" w:color="auto" w:sz="4"/>
+          <w:bottom w:val="single" w:color="auto" w:sz="4"/>
+          <w:right w:val="single" w:color="auto" w:sz="4"/>
+          <w:insideH w:val="single" w:color="auto" w:sz="4"/>
+          <w:insideV w:val="single" w:color="auto" w:sz="4"/>
+        </w:tblBorders>
+      </w:tblPr>
+      <w:tblGrid>
+        <w:gridCol w:w="9638"/>
+      </w:tblGrid>
+      <w:tr>
+        <w:tc>
+          <w:tcPr>
+            <w:tcW w:type="dxa" w:w="9638"/>
+            <w:tcBorders>
+              <w:top w:val="none" w:color="FFFFFF" w:sz="0"/>
+              <w:left w:val="none" w:color="FFFFFF" w:sz="0"/>
+              <w:bottom w:val="none" w:color="FFFFFF" w:sz="0"/>
+              <w:right w:val="none" w:color="FFFFFF" w:sz="0"/>
+            </w:tcBorders>
+            <w:tcMar>
+              <w:left w:type="dxa" w:w="60"/>
+              <w:right w:type="dxa" w:w="60"/>
+            </w:tcMar>
+          </w:tcPr>
+          <w:p>
+            <w:pPr>
+              <w:jc w:val="center"/>
+            </w:pPr>
+            <w:r>
+              <w:drawing>
+                <wp:inline distT="0" distB="0" distL="0" distR="0">
+                  <wp:extent cx="1238250" cy="2476500"/>
+                  <wp:effectExtent t="0" r="0" b="0" l="0"/>
+                  <wp:docPr id="24" name="" descr="" title=""/>
+                  <wp:cNvGraphicFramePr>
+                    <a:graphicFrameLocks xmlns:a="http://schemas.openxmlformats.org/drawingml/2006/main" noChangeAspect="1"/>
+                  </wp:cNvGraphicFramePr>
+                  <a:graphic xmlns:a="http://schemas.openxmlformats.org/drawingml/2006/main">
+                    <a:graphicData uri="http://schemas.openxmlformats.org/drawingml/2006/picture">
+                      <pic:pic xmlns:pic="http://schemas.openxmlformats.org/drawingml/2006/picture">
+                        <pic:nvPicPr>
+                          <pic:cNvPr id="0" name="" descr=""/>
+                          <pic:cNvPicPr>
+                            <a:picLocks noChangeAspect="1" noChangeArrowheads="1"/>
+                          </pic:cNvPicPr>
+                        </pic:nvPicPr>
+                        <pic:blipFill>
+                          <a:blip r:embed="rId32" cstate="none"/>
+                          <a:srcRect/>
+                          <a:stretch>
+                            <a:fillRect/>
+                          </a:stretch>
+                        </pic:blipFill>
+                        <pic:spPr bwMode="auto">
+                          <a:xfrm>
+                            <a:off x="0" y="0"/>
+                            <a:ext cx="1238250" cy="2476500"/>
+                          </a:xfrm>
+                          <a:prstGeom prst="rect">
+                            <a:avLst/>
+                          </a:prstGeom>
+                        </pic:spPr>
+                      </pic:pic>
+                    </a:graphicData>
+                  </a:graphic>
+                </wp:inline>
+              </w:drawing>
+            </w:r>
+          </w:p>
+          <w:p>
+            <w:pPr>
+              <w:spacing w:after="120"/>
+              <w:jc w:val="center"/>
+            </w:pPr>
+            <w:r>
+              <w:rPr>
+                <w:rFonts w:ascii="Plus Jakarta Sans" w:cs="Plus Jakarta Sans" w:eastAsia="Plus Jakarta Sans" w:hAnsi="Plus Jakarta Sans"/>
+                <w:b/>
+                <w:bCs/>
+                <w:color w:val="5C6A94"/>
+                <w:sz w:val="16"/>
+                <w:szCs w:val="16"/>
+              </w:rPr>
+              <w:t xml:space="preserve">Attendant menu (registered number)</w:t>
+            </w:r>
+          </w:p>
+        </w:tc>
+      </w:tr>
+    </w:tbl>
+    <w:p>
+      <w:pPr>
+        <w:jc w:val="center"/>
+      </w:pPr>
+      <w:r>
+        <w:drawing>
+          <wp:inline distT="0" distB="0" distL="0" distR="0">
+            <wp:extent cx="5334000" cy="3333750"/>
+            <wp:effectExtent t="0" r="0" b="0" l="0"/>
+            <wp:docPr id="25" name="" descr="" title=""/>
+            <wp:cNvGraphicFramePr>
+              <a:graphicFrameLocks xmlns:a="http://schemas.openxmlformats.org/drawingml/2006/main" noChangeAspect="1"/>
+            </wp:cNvGraphicFramePr>
+            <a:graphic xmlns:a="http://schemas.openxmlformats.org/drawingml/2006/main">
+              <a:graphicData uri="http://schemas.openxmlformats.org/drawingml/2006/picture">
+                <pic:pic xmlns:pic="http://schemas.openxmlformats.org/drawingml/2006/picture">
+                  <pic:nvPicPr>
+                    <pic:cNvPr id="0" name="" descr=""/>
+                    <pic:cNvPicPr>
+                      <a:picLocks noChangeAspect="1" noChangeArrowheads="1"/>
+                    </pic:cNvPicPr>
+                  </pic:nvPicPr>
+                  <pic:blipFill>
+                    <a:blip r:embed="rId33" cstate="none"/>
+                    <a:srcRect/>
+                    <a:stretch>
+                      <a:fillRect/>
+                    </a:stretch>
+                  </pic:blipFill>
+                  <pic:spPr bwMode="auto">
+                    <a:xfrm>
+                      <a:off x="0" y="0"/>
+                      <a:ext cx="5334000" cy="3333750"/>
+                    </a:xfrm>
+                    <a:prstGeom prst="rect">
+                      <a:avLst/>
+                    </a:prstGeom>
+                  </pic:spPr>
+                </pic:pic>
+              </a:graphicData>
+            </a:graphic>
+          </wp:inline>
+        </w:drawing>
+      </w:r>
+    </w:p>
+    <w:p>
+      <w:pPr>
+        <w:spacing w:after="160" w:before="40"/>
+      </w:pPr>
+      <w:r>
+        <w:rPr>
+          <w:rFonts w:ascii="Plus Jakarta Sans" w:cs="Plus Jakarta Sans" w:eastAsia="Plus Jakarta Sans" w:hAnsi="Plus Jakarta Sans"/>
+          <w:b/>
+          <w:bCs/>
+          <w:color w:val="0A1B4D"/>
+          <w:sz w:val="17"/>
+          <w:szCs w:val="17"/>
+        </w:rPr>
+        <w:t xml:space="preserve">Organisation portal</w:t>
+      </w:r>
+      <w:r>
+        <w:rPr>
+          <w:rFonts w:ascii="Plus Jakarta Sans" w:cs="Plus Jakarta Sans" w:eastAsia="Plus Jakarta Sans" w:hAnsi="Plus Jakarta Sans"/>
+          <w:color w:val="5C6A94"/>
+          <w:sz w:val="17"/>
+          <w:szCs w:val="17"/>
+        </w:rPr>
+        <w:t xml:space="preserve">  /org: Demo Bank's fleet, cover and invoices (sign-in by SMS code)</w:t>
+      </w:r>
+    </w:p>
     <w:sectPr>
       <w:headerReference w:type="default" r:id="rId6"/>
       <w:footerReference w:type="default" r:id="rId7"/>
@@ -10591,7 +13098,7 @@
         <wp:inline distT="0" distB="0" distL="0" distR="0">
           <wp:extent cx="781050" cy="209550"/>
           <wp:effectExtent t="0" r="0" b="0" l="0"/>
-          <wp:docPr id="16" name="" descr="" title=""/>
+          <wp:docPr id="26" name="" descr="" title=""/>
           <wp:cNvGraphicFramePr>
             <a:graphicFrameLocks xmlns:a="http://schemas.openxmlformats.org/drawingml/2006/main" noChangeAspect="1"/>
           </wp:cNvGraphicFramePr>

</xml_diff>

<commit_message>
Requirements doc: SMS journeys with the daily or monthly choice
Co-Authored-By: Claude Opus 5.5 <noreply@anthropic.com>
Claude-Session: https://claude.ai/code/session_015837ouLbwrQdJqFUX8HYPx
</commit_message>
<xml_diff>
--- a/docs/SUNU-Park-Functional-Requirements.docx
+++ b/docs/SUNU-Park-Functional-Requirements.docx
@@ -256,7 +256,7 @@
       <w:pPr>
         <w:spacing w:after="60"/>
       </w:pPr>
-      <w:hyperlink w:history="1" r:id="rIdfw-ajuuvn16lc7vez860o">
+      <w:hyperlink w:history="1" r:id="rIdbdey7ttrh-kuwvg-i18up">
         <w:r>
           <w:rPr>
             <w:rFonts w:ascii="Plus Jakarta Sans" w:cs="Plus Jakarta Sans" w:eastAsia="Plus Jakarta Sans" w:hAnsi="Plus Jakarta Sans"/>
@@ -277,7 +277,7 @@
         </w:rPr>
         <w:t xml:space="preserve">  ·  </w:t>
       </w:r>
-      <w:hyperlink w:history="1" r:id="rIdob7pw3xpb02evwq1isacu">
+      <w:hyperlink w:history="1" r:id="rIddm88agrqtsxxprssdswwl">
         <w:r>
           <w:rPr>
             <w:rFonts w:ascii="Plus Jakarta Sans" w:cs="Plus Jakarta Sans" w:eastAsia="Plus Jakarta Sans" w:hAnsi="Plus Jakarta Sans"/>
@@ -298,7 +298,7 @@
         </w:rPr>
         <w:t xml:space="preserve">  ·  </w:t>
       </w:r>
-      <w:hyperlink w:history="1" r:id="rIdjetxjsb5ug4bq-mne_4wf">
+      <w:hyperlink w:history="1" r:id="rId8cp56bkt4b1caa4rhqrnq">
         <w:r>
           <w:rPr>
             <w:rFonts w:ascii="Plus Jakarta Sans" w:cs="Plus Jakarta Sans" w:eastAsia="Plus Jakarta Sans" w:hAnsi="Plus Jakarta Sans"/>
@@ -315,7 +315,7 @@
       <w:pPr>
         <w:spacing w:after="160"/>
       </w:pPr>
-      <w:hyperlink w:history="1" r:id="rIdyhvypbbxc7hvg2qgnindn">
+      <w:hyperlink w:history="1" r:id="rIdgh2yknsvr16vkaoxtptgr">
         <w:r>
           <w:rPr>
             <w:rFonts w:ascii="Plus Jakarta Sans" w:cs="Plus Jakarta Sans" w:eastAsia="Plus Jakarta Sans" w:hAnsi="Plus Jakarta Sans"/>
@@ -336,7 +336,7 @@
         </w:rPr>
         <w:t xml:space="preserve">  ·  </w:t>
       </w:r>
-      <w:hyperlink w:history="1" r:id="rIdll661pcafqnjdlaoncuqb">
+      <w:hyperlink w:history="1" r:id="rIdadju6usd-myssgvqrtz4b">
         <w:r>
           <w:rPr>
             <w:rFonts w:ascii="Plus Jakarta Sans" w:cs="Plus Jakarta Sans" w:eastAsia="Plus Jakarta Sans" w:hAnsi="Plus Jakarta Sans"/>
@@ -357,7 +357,7 @@
         </w:rPr>
         <w:t xml:space="preserve">  ·  </w:t>
       </w:r>
-      <w:hyperlink w:history="1" r:id="rIdby70pbhiksa6lifhriuep">
+      <w:hyperlink w:history="1" r:id="rIdg8o1aw-a54t_0le7i7dqp">
         <w:r>
           <w:rPr>
             <w:rFonts w:ascii="Plus Jakarta Sans" w:cs="Plus Jakarta Sans" w:eastAsia="Plus Jakarta Sans" w:hAnsi="Plus Jakarta Sans"/>
@@ -391,7 +391,7 @@
       <w:pPr>
         <w:spacing w:after="60"/>
       </w:pPr>
-      <w:hyperlink w:history="1" r:id="rId5scrj0-r9sg1iuqtcoadq">
+      <w:hyperlink w:history="1" r:id="rIdh7-ubqay4iezdwszl7wkq">
         <w:r>
           <w:rPr>
             <w:rFonts w:ascii="Plus Jakarta Sans" w:cs="Plus Jakarta Sans" w:eastAsia="Plus Jakarta Sans" w:hAnsi="Plus Jakarta Sans"/>
@@ -412,7 +412,7 @@
         </w:rPr>
         <w:t xml:space="preserve">  ·  </w:t>
       </w:r>
-      <w:hyperlink w:history="1" r:id="rIds-dskz7nphpbyqztmreoh">
+      <w:hyperlink w:history="1" r:id="rId1lige2planxyqoymiedsx">
         <w:r>
           <w:rPr>
             <w:rFonts w:ascii="Plus Jakarta Sans" w:cs="Plus Jakarta Sans" w:eastAsia="Plus Jakarta Sans" w:hAnsi="Plus Jakarta Sans"/>
@@ -429,7 +429,7 @@
       <w:pPr>
         <w:spacing w:after="60"/>
       </w:pPr>
-      <w:hyperlink w:history="1" r:id="rId1zjs-wuoowqqopidn-ysn">
+      <w:hyperlink w:history="1" r:id="rId66nogzjalvw7xhjadd8v-">
         <w:r>
           <w:rPr>
             <w:rFonts w:ascii="Plus Jakarta Sans" w:cs="Plus Jakarta Sans" w:eastAsia="Plus Jakarta Sans" w:hAnsi="Plus Jakarta Sans"/>
@@ -450,7 +450,7 @@
         </w:rPr>
         <w:t xml:space="preserve">  ·  </w:t>
       </w:r>
-      <w:hyperlink w:history="1" r:id="rIdbkgg0jf7ruixfupxf1x0g">
+      <w:hyperlink w:history="1" r:id="rIdiakxhnqhghkfwhhy_kz7b">
         <w:r>
           <w:rPr>
             <w:rFonts w:ascii="Plus Jakarta Sans" w:cs="Plus Jakarta Sans" w:eastAsia="Plus Jakarta Sans" w:hAnsi="Plus Jakarta Sans"/>
@@ -3680,7 +3680,45 @@
                 <w:sz w:val="19"/>
                 <w:szCs w:val="19"/>
               </w:rPr>
-              <w:t xml:space="preserve"> → offer → reply </w:t>
+              <w:t xml:space="preserve"> → reply </w:t>
+            </w:r>
+            <w:r>
+              <w:rPr>
+                <w:rFonts w:ascii="Consolas" w:cs="Consolas" w:eastAsia="Consolas" w:hAnsi="Consolas"/>
+                <w:color w:val="0B2E63"/>
+                <w:sz w:val="17"/>
+                <w:szCs w:val="17"/>
+                <w:shd w:fill="DFF1FC" w:color="auto" w:val="clear"/>
+              </w:rPr>
+              <w:t xml:space="preserve">1</w:t>
+            </w:r>
+            <w:r>
+              <w:rPr>
+                <w:rFonts w:ascii="Plus Jakarta Sans" w:cs="Plus Jakarta Sans" w:eastAsia="Plus Jakarta Sans" w:hAnsi="Plus Jakarta Sans"/>
+                <w:color w:val="0A1B4D"/>
+                <w:sz w:val="19"/>
+                <w:szCs w:val="19"/>
+              </w:rPr>
+              <w:t xml:space="preserve"> daily pass or </w:t>
+            </w:r>
+            <w:r>
+              <w:rPr>
+                <w:rFonts w:ascii="Consolas" w:cs="Consolas" w:eastAsia="Consolas" w:hAnsi="Consolas"/>
+                <w:color w:val="0B2E63"/>
+                <w:sz w:val="17"/>
+                <w:szCs w:val="17"/>
+                <w:shd w:fill="DFF1FC" w:color="auto" w:val="clear"/>
+              </w:rPr>
+              <w:t xml:space="preserve">2</w:t>
+            </w:r>
+            <w:r>
+              <w:rPr>
+                <w:rFonts w:ascii="Plus Jakarta Sans" w:cs="Plus Jakarta Sans" w:eastAsia="Plus Jakarta Sans" w:hAnsi="Plus Jakarta Sans"/>
+                <w:color w:val="0A1B4D"/>
+                <w:sz w:val="19"/>
+                <w:szCs w:val="19"/>
+              </w:rPr>
+              <w:t xml:space="preserve"> monthly pass → reply </w:t>
             </w:r>
             <w:r>
               <w:rPr>
@@ -3747,7 +3785,7 @@
                 <w:sz w:val="19"/>
                 <w:szCs w:val="19"/>
               </w:rPr>
-              <w:t xml:space="preserve"> monthly pass · </w:t>
+              <w:t xml:space="preserve"> goes straight to the monthly pass · </w:t>
             </w:r>
             <w:r>
               <w:rPr>
@@ -9342,7 +9380,7 @@
         </w:rPr>
         <w:t xml:space="preserve">Code &amp; docs: </w:t>
       </w:r>
-      <w:hyperlink w:history="1" r:id="rIdwb5tjc3rnusudcedybe1x">
+      <w:hyperlink w:history="1" r:id="rIdpzucal5yz5vs1dtixuyxb">
         <w:r>
           <w:rPr>
             <w:rFonts w:ascii="Plus Jakarta Sans" w:cs="Plus Jakarta Sans" w:eastAsia="Plus Jakarta Sans" w:hAnsi="Plus Jakarta Sans"/>
@@ -10781,7 +10819,7 @@
                 <w:sz w:val="18"/>
                 <w:szCs w:val="18"/>
               </w:rPr>
-              <w:t xml:space="preserve">Text the plate → reply 1–4</w:t>
+              <w:t xml:space="preserve">Text the plate → 1 Daily → provider 1–4</w:t>
             </w:r>
           </w:p>
         </w:tc>
@@ -10950,7 +10988,7 @@
                 <w:sz w:val="18"/>
                 <w:szCs w:val="18"/>
               </w:rPr>
-              <w:t xml:space="preserve">M BJL1234 → reply 1–4</w:t>
+              <w:t xml:space="preserve">Text the plate → 2 Monthly → provider 1–4 (or M BJL1234)</w:t>
             </w:r>
           </w:p>
         </w:tc>
@@ -11119,7 +11157,7 @@
                 <w:sz w:val="18"/>
                 <w:szCs w:val="18"/>
               </w:rPr>
-              <w:t xml:space="preserve">Text the plate → reply 1–4</w:t>
+              <w:t xml:space="preserve">Text the plate → warning first → provider 1–4</w:t>
             </w:r>
           </w:p>
         </w:tc>
@@ -12145,7 +12183,7 @@
                 <w:sz w:val="16"/>
                 <w:szCs w:val="16"/>
               </w:rPr>
-              <w:t xml:space="preserve">Daily pass · first-time phone</w:t>
+              <w:t xml:space="preserve">Plate → 1 Daily → 1 Wave</w:t>
             </w:r>
           </w:p>
         </w:tc>
@@ -12222,7 +12260,7 @@
                 <w:sz w:val="16"/>
                 <w:szCs w:val="16"/>
               </w:rPr>
-              <w:t xml:space="preserve">Monthly pass</w:t>
+              <w:t xml:space="preserve">Plate → 2 Monthly → 2 Afrimoney</w:t>
             </w:r>
           </w:p>
         </w:tc>

</xml_diff>

<commit_message>
Requirements doc: release 1.2.59, 6 October 2026
Co-Authored-By: Claude Opus 5.5 <noreply@anthropic.com>
Claude-Session: https://claude.ai/code/session_015837ouLbwrQdJqFUX8HYPx
</commit_message>
<xml_diff>
--- a/docs/SUNU-Park-Functional-Requirements.docx
+++ b/docs/SUNU-Park-Functional-Requirements.docx
@@ -223,7 +223,7 @@
           <w:sz w:val="18"/>
           <w:szCs w:val="18"/>
         </w:rPr>
-        <w:t xml:space="preserve">Prototype release v1.2.50</w:t>
+        <w:t xml:space="preserve">Prototype release v1.2.59</w:t>
       </w:r>
       <w:r>
         <w:rPr>
@@ -232,7 +232,7 @@
           <w:sz w:val="18"/>
           <w:szCs w:val="18"/>
         </w:rPr>
-        <w:t xml:space="preserve">  ·  4 October 2026  ·  Built by INNOVII for Banjul City Council  ·  Demo server</w:t>
+        <w:t xml:space="preserve">  ·  6 October 2026  ·  Built by INNOVII for Banjul City Council  ·  Demo server</w:t>
       </w:r>
     </w:p>
     <w:p>
@@ -256,7 +256,7 @@
       <w:pPr>
         <w:spacing w:after="60"/>
       </w:pPr>
-      <w:hyperlink w:history="1" r:id="rIdbdey7ttrh-kuwvg-i18up">
+      <w:hyperlink w:history="1" r:id="rId5iqndhqxjvnrvln7govp-">
         <w:r>
           <w:rPr>
             <w:rFonts w:ascii="Plus Jakarta Sans" w:cs="Plus Jakarta Sans" w:eastAsia="Plus Jakarta Sans" w:hAnsi="Plus Jakarta Sans"/>
@@ -277,7 +277,7 @@
         </w:rPr>
         <w:t xml:space="preserve">  ·  </w:t>
       </w:r>
-      <w:hyperlink w:history="1" r:id="rIddm88agrqtsxxprssdswwl">
+      <w:hyperlink w:history="1" r:id="rIdbpcrjvgm3ac_2a5do7p_a">
         <w:r>
           <w:rPr>
             <w:rFonts w:ascii="Plus Jakarta Sans" w:cs="Plus Jakarta Sans" w:eastAsia="Plus Jakarta Sans" w:hAnsi="Plus Jakarta Sans"/>
@@ -298,7 +298,7 @@
         </w:rPr>
         <w:t xml:space="preserve">  ·  </w:t>
       </w:r>
-      <w:hyperlink w:history="1" r:id="rId8cp56bkt4b1caa4rhqrnq">
+      <w:hyperlink w:history="1" r:id="rIdnc06ddaazr7qbvr2qvfiy">
         <w:r>
           <w:rPr>
             <w:rFonts w:ascii="Plus Jakarta Sans" w:cs="Plus Jakarta Sans" w:eastAsia="Plus Jakarta Sans" w:hAnsi="Plus Jakarta Sans"/>
@@ -315,7 +315,7 @@
       <w:pPr>
         <w:spacing w:after="160"/>
       </w:pPr>
-      <w:hyperlink w:history="1" r:id="rIdgh2yknsvr16vkaoxtptgr">
+      <w:hyperlink w:history="1" r:id="rIdfnosgah6xpz-vxjwr1mir">
         <w:r>
           <w:rPr>
             <w:rFonts w:ascii="Plus Jakarta Sans" w:cs="Plus Jakarta Sans" w:eastAsia="Plus Jakarta Sans" w:hAnsi="Plus Jakarta Sans"/>
@@ -336,7 +336,7 @@
         </w:rPr>
         <w:t xml:space="preserve">  ·  </w:t>
       </w:r>
-      <w:hyperlink w:history="1" r:id="rIdadju6usd-myssgvqrtz4b">
+      <w:hyperlink w:history="1" r:id="rIdbu9kmzgbbrprj0xeumiej">
         <w:r>
           <w:rPr>
             <w:rFonts w:ascii="Plus Jakarta Sans" w:cs="Plus Jakarta Sans" w:eastAsia="Plus Jakarta Sans" w:hAnsi="Plus Jakarta Sans"/>
@@ -357,7 +357,7 @@
         </w:rPr>
         <w:t xml:space="preserve">  ·  </w:t>
       </w:r>
-      <w:hyperlink w:history="1" r:id="rIdg8o1aw-a54t_0le7i7dqp">
+      <w:hyperlink w:history="1" r:id="rIdxau-xpwzzszwhape8_oor">
         <w:r>
           <w:rPr>
             <w:rFonts w:ascii="Plus Jakarta Sans" w:cs="Plus Jakarta Sans" w:eastAsia="Plus Jakarta Sans" w:hAnsi="Plus Jakarta Sans"/>
@@ -391,7 +391,7 @@
       <w:pPr>
         <w:spacing w:after="60"/>
       </w:pPr>
-      <w:hyperlink w:history="1" r:id="rIdh7-ubqay4iezdwszl7wkq">
+      <w:hyperlink w:history="1" r:id="rIdodeno6we9zsjfyxdflzli">
         <w:r>
           <w:rPr>
             <w:rFonts w:ascii="Plus Jakarta Sans" w:cs="Plus Jakarta Sans" w:eastAsia="Plus Jakarta Sans" w:hAnsi="Plus Jakarta Sans"/>
@@ -412,7 +412,7 @@
         </w:rPr>
         <w:t xml:space="preserve">  ·  </w:t>
       </w:r>
-      <w:hyperlink w:history="1" r:id="rId1lige2planxyqoymiedsx">
+      <w:hyperlink w:history="1" r:id="rIdq7kjacmfbrzvvnjawvrwz">
         <w:r>
           <w:rPr>
             <w:rFonts w:ascii="Plus Jakarta Sans" w:cs="Plus Jakarta Sans" w:eastAsia="Plus Jakarta Sans" w:hAnsi="Plus Jakarta Sans"/>
@@ -429,7 +429,7 @@
       <w:pPr>
         <w:spacing w:after="60"/>
       </w:pPr>
-      <w:hyperlink w:history="1" r:id="rId66nogzjalvw7xhjadd8v-">
+      <w:hyperlink w:history="1" r:id="rIdekzgeeqtvw6h6spqnmmda">
         <w:r>
           <w:rPr>
             <w:rFonts w:ascii="Plus Jakarta Sans" w:cs="Plus Jakarta Sans" w:eastAsia="Plus Jakarta Sans" w:hAnsi="Plus Jakarta Sans"/>
@@ -450,7 +450,7 @@
         </w:rPr>
         <w:t xml:space="preserve">  ·  </w:t>
       </w:r>
-      <w:hyperlink w:history="1" r:id="rIdiakxhnqhghkfwhhy_kz7b">
+      <w:hyperlink w:history="1" r:id="rId3k-kxbmndawzsssv9juqx">
         <w:r>
           <w:rPr>
             <w:rFonts w:ascii="Plus Jakarta Sans" w:cs="Plus Jakarta Sans" w:eastAsia="Plus Jakarta Sans" w:hAnsi="Plus Jakarta Sans"/>
@@ -9380,7 +9380,7 @@
         </w:rPr>
         <w:t xml:space="preserve">Code &amp; docs: </w:t>
       </w:r>
-      <w:hyperlink w:history="1" r:id="rIdpzucal5yz5vs1dtixuyxb">
+      <w:hyperlink w:history="1" r:id="rIdy0eb6ecf2ezvthqxq2slj">
         <w:r>
           <w:rPr>
             <w:rFonts w:ascii="Plus Jakarta Sans" w:cs="Plus Jakarta Sans" w:eastAsia="Plus Jakarta Sans" w:hAnsi="Plus Jakarta Sans"/>
@@ -13129,7 +13129,7 @@
         <w:sz w:val="15"/>
         <w:szCs w:val="15"/>
       </w:rPr>
-      <w:t xml:space="preserve">SUNU Park · Functional requirements · v1.2.50	</w:t>
+      <w:t xml:space="preserve">SUNU Park · Functional requirements · v1.2.59	</w:t>
     </w:r>
     <w:r>
       <w:drawing>

</xml_diff>